<commit_message>
Broaden pitch to US + European mandate; add Knut Nyman role
Transatlantic scope (Europe 50-60% incl. Nordics, US 40-50%), two-regime
engagement playbook, refreshed US/EU pipeline, and a founding Principal
role for Knut Nyman covering US situations and campaign strategy.

https://claude.ai/code/session_014wJkiGJDWLqynffcMLAwBq
</commit_message>
<xml_diff>
--- a/nordic-capital-activism-pitch/Nordic_Capital_Engaged_Equities_Pitch.docx
+++ b/nordic-capital-activism-pitch/Nordic_Capital_Engaged_Equities_Pitch.docx
@@ -47,7 +47,7 @@
           <w:color w:val="595959"/>
           <w:sz w:val="28"/>
         </w:rPr>
-        <w:t>A Constructive Activism Strategy for the Nordic Public Markets</w:t>
+        <w:t>A Constructive Activism Strategy for US and European Public Markets</w:t>
       </w:r>
     </w:p>
     <w:p/>
@@ -131,22 +131,7 @@
           <w:b w:val="0"/>
           <w:i w:val="0"/>
         </w:rPr>
-        <w:t>We propose that Nordic Capital launch a dedicated public-markets strategy — “Nordic Capital Engaged Equities” — a USD 1.5 billion (hard cap USD 2.0 billion) vehicle pursuing constructive activism in listed Nordic mid-caps. The strategy applies the firm's private equity value-creation playbook — operational improvement, portfolio simplification, disciplined capital allocation and strategic M&amp;A — to a concentrated book of 6–8 public companies where Nordic Capital takes 4–10% ownership stakes, secures nomination-committee and board influence, and drives a 2–4 year value plan.</w:t>
-      </w:r>
-    </w:p>
-    <w:p>
-      <w:pPr>
-        <w:pStyle w:val="ListBullet"/>
-        <w:spacing w:after="80"/>
-      </w:pPr>
-      <w:r>
-        <w:rPr>
-          <w:b/>
-        </w:rPr>
-        <w:t xml:space="preserve">The market gap is real. </w:t>
-      </w:r>
-      <w:r>
-        <w:t>Cevian Capital has demonstrated for two decades that board-seat-driven engagement in Nordic and European equities generates durable alpha, yet dedicated Nordic activist capital remains scarce relative to the opportunity. The 2026 launch of Active Value Partners by former Cevian partners confirms growing institutional appetite for the space — and the window to establish the category-defining domestic franchise is open now.</w:t>
+        <w:t>We propose that Nordic Capital launch a dedicated public-markets strategy — “Nordic Capital Engaged Equities” — a USD 1.5 billion (hard cap USD 2.0 billion) vehicle pursuing constructive activism in listed US and European mid-caps. The strategy applies the firm's private equity value-creation playbook — operational improvement, portfolio simplification, disciplined capital allocation and strategic M&amp;A — to a concentrated book of 6–8 public companies in the firm's core sectors, where Nordic Capital takes 2–10% ownership stakes, secures board-level influence, and drives a 2–4 year value plan. Europe (including the Nordic home market) is expected to carry 50–60% of the book and the United States 40–50%, with allocation following sector opportunity rather than geographic quota.</w:t>
       </w:r>
     </w:p>
     <w:p>
@@ -161,7 +146,7 @@
         <w:t xml:space="preserve">Activism is at record levels and increasingly M&amp;A-driven. </w:t>
       </w:r>
       <w:r>
-        <w:t>2025 was a record year for global shareholder campaigns, and an unusually high share of recent campaigns carry M&amp;A demands — terrain where a private equity sponsor has structural advantages no hedge-fund activist can match.</w:t>
+        <w:t>2025 was a record year for global shareholder campaigns, and an unusually high share of recent campaigns carry M&amp;A demands — terrain where a private equity sponsor has structural advantages no hedge-fund activist can match. The US remains the deepest activism market; Europe is the fastest-growing and least crowded.</w:t>
       </w:r>
     </w:p>
     <w:p>
@@ -173,10 +158,25 @@
         <w:rPr>
           <w:b/>
         </w:rPr>
-        <w:t xml:space="preserve">Nordic governance is structurally activist-friendly. </w:t>
+        <w:t xml:space="preserve">Two regimes, one playbook. </w:t>
       </w:r>
       <w:r>
-        <w:t>Shareholder-elected nomination committees, low EGM thresholds (10% in Sweden), exceptional ownership transparency and a consensus-driven board culture mean a 5% holder can achieve influence that requires 15%+ and a proxy fight elsewhere.</w:t>
+        <w:t>In Europe — and above all in the Nordic home market — shareholder-elected nomination committees, low EGM thresholds and ownership transparency let a 4–8% holder win board influence quietly. In the US, the universal proxy card has structurally lowered the cost of board challenges, making credible, well-resourced engagement effective at 2–6% stakes. The same value plans work in both; only the influence mechanics differ.</w:t>
+      </w:r>
+    </w:p>
+    <w:p>
+      <w:pPr>
+        <w:pStyle w:val="ListBullet"/>
+        <w:spacing w:after="80"/>
+      </w:pPr>
+      <w:r>
+        <w:rPr>
+          <w:b/>
+        </w:rPr>
+        <w:t xml:space="preserve">The sector lens travels; the competition doesn't. </w:t>
+      </w:r>
+      <w:r>
+        <w:t>Nordic Capital's underwriting edge in healthcare &amp; medtech, technology &amp; payments, financial services and industrials applies identically to a Philadelphia medtech and a Stockholm one. Operationally credible, sponsor-backed engagement capital is scarce on both sides of the Atlantic — Cevian dominates constructive activism in Europe but has no US book, while US activists lack operating benches and European legitimacy.</w:t>
       </w:r>
     </w:p>
     <w:p>
@@ -191,7 +191,7 @@
         <w:t xml:space="preserve">Nordic Capital is uniquely positioned. </w:t>
       </w:r>
       <w:r>
-        <w:t>Three decades of operating credibility, deep sector franchises in healthcare, technology &amp; payments, financial services and industrials, and an unrivalled network of Nordic chairs, CEOs and operating advisors. Critically, Nordic Capital will be received as a constructive domestic owner — not a foreign raider — which materially lowers the cost and friction of every campaign.</w:t>
+        <w:t>Three decades of operating credibility, &gt;EUR 31bn AUM, a New York presence and a growing North American investment record in healthcare and technology, and an unrivalled bench of chairs, CEOs and operating advisors to propose as directors — the single hardest resource for any activist to assemble.</w:t>
       </w:r>
     </w:p>
     <w:p>
@@ -215,7 +215,7 @@
           <w:b w:val="0"/>
           <w:i w:val="0"/>
         </w:rPr>
-        <w:t>We recommend a phased launch: internal approval and conflicts framework in H2 2026, a founding team of 10–12 led by a partner-level Head of Engaged Equities, a EUR 150–200m GP/employee seed commitment, first close of ~USD 750m in mid-2027 and stake-building timed to the Q3 ownership snapshots that determine 2028 AGM nomination committees. Target net returns of 15%+ over a cycle, with management economics accretive to the platform from year two.</w:t>
+        <w:t>We recommend a phased launch: internal approval and conflicts framework in H2 2026, a founding team of 11–13 led by a partner-level Head of Engaged Equities — with US situations and campaign strategy led by Knut Nyman, joining from Elliott Investment Management — a EUR 150–200m GP/employee seed commitment, first close of ~USD 750m in mid-2027, and initial deployment timed to the 2028 board cycles in both regions. Target net returns of 15%+ over a cycle, with management economics accretive to the platform from year two.</w:t>
       </w:r>
     </w:p>
     <w:p>
@@ -245,7 +245,7 @@
           <w:b w:val="0"/>
           <w:i w:val="0"/>
         </w:rPr>
-        <w:t>European equities continue to trade at a persistent discount to US peers, and Nordic mid-caps — under-covered after a decade of sell-side consolidation and MiFID II research unbundling — trade at a further discount to European large-caps despite superior governance and profitability. A meaningful cohort of quality Nordic franchises trades at 30–50% discounts to intrinsic value on sum-of-the-parts or normalised-margin bases. Public-market multiples for Nordic mid-caps sit well below the entry multiples Nordic Capital's buyout funds routinely pay in competitive private processes — in effect, the public market is offering the firm's core hunting ground at a discount, without an auction.</w:t>
+        <w:t>On both sides of the Atlantic, a large cohort of quality mid-cap franchises in Nordic Capital's core sectors trades at 30–50% discounts to intrinsic value on sum-of-the-parts or normalised-margin bases. In Europe, the discount is structural: persistent under-valuation versus US peers, compounded in mid-caps by a decade of sell-side consolidation and MiFID II research unbundling. In the US, the post-2021 de-rating of medtech, payments and software left a generation of fallen-angel quality compounders at private-market discounts even as indices set records — and the activism toolkit there has never been stronger. In both regions, public-market multiples for these companies sit below the entry multiples Nordic Capital's buyout funds routinely pay in competitive private processes — the public market is offering the firm's core hunting ground at a discount, without an auction.</w:t>
       </w:r>
     </w:p>
     <w:p>
@@ -280,7 +280,7 @@
         <w:spacing w:after="80"/>
       </w:pPr>
       <w:r>
-        <w:t>Universal owners (index funds, Nordic institutions, AP funds) increasingly support well-argued engagement agendas, lowering the vote-getting cost of campaigns.</w:t>
+        <w:t>Universal owners (index funds, pension institutions) increasingly support well-argued engagement agendas on both continents, lowering the vote-getting cost of campaigns.</w:t>
       </w:r>
     </w:p>
     <w:p>
@@ -289,7 +289,7 @@
         <w:spacing w:after="80"/>
       </w:pPr>
       <w:r>
-        <w:t>Dedicated Nordic engagement capital remains thin: Cevian (pan-European, increasingly large-cap), a handful of small Nordic engagement funds, and episodic visits from US activists with limited local standing. The mid-cap segment (EUR 1–10bn) is structurally underserved.</w:t>
+        <w:t>Competition is mis-shaped, not absent: US activism is crowded at the mega-cap end but thin in operationally complex mid-caps; in Europe, Cevian (constructive, large-cap drift) and episodic US visitors leave the EUR 2–10bn segment structurally underserved. Operationally credible, sponsor-backed engagement capital is scarce everywhere.</w:t>
       </w:r>
     </w:p>
     <w:p>
@@ -297,7 +297,7 @@
         <w:pStyle w:val="Heading2"/>
       </w:pPr>
       <w:r>
-        <w:t>2.3 Why the Nordics are the best activism jurisdiction in the world</w:t>
+        <w:t>2.3 Two engagement regimes, one playbook</w:t>
       </w:r>
     </w:p>
     <w:p>
@@ -306,7 +306,7 @@
           <w:b w:val="0"/>
           <w:i w:val="0"/>
         </w:rPr>
-        <w:t>The Nordic governance model was effectively designed for engaged ownership:</w:t>
+        <w:t>The strategy runs the same underwriting and the same value plans in both regions; only the influence mechanics differ:</w:t>
       </w:r>
     </w:p>
     <w:tbl>
@@ -324,7 +324,7 @@
       <w:tr>
         <w:tc>
           <w:tcPr>
-            <w:tcW w:type="dxa" w:w="2160"/>
+            <w:tcW w:type="dxa" w:w="1872"/>
             <w:shd w:fill="0B2545"/>
           </w:tcPr>
           <w:p>
@@ -335,7 +335,24 @@
                 <w:color w:val="FFFFFF"/>
                 <w:sz w:val="19"/>
               </w:rPr>
-              <w:t>Feature</w:t>
+              <w:t>Dimension</w:t>
+            </w:r>
+          </w:p>
+        </w:tc>
+        <w:tc>
+          <w:tcPr>
+            <w:tcW w:type="dxa" w:w="4032"/>
+            <w:shd w:fill="0B2545"/>
+          </w:tcPr>
+          <w:p>
+            <w:r/>
+            <w:r>
+              <w:rPr>
+                <w:b/>
+                <w:color w:val="FFFFFF"/>
+                <w:sz w:val="19"/>
+              </w:rPr>
+              <w:t>Europe / Nordics (home field)</w:t>
             </w:r>
           </w:p>
         </w:tc>
@@ -352,24 +369,7 @@
                 <w:color w:val="FFFFFF"/>
                 <w:sz w:val="19"/>
               </w:rPr>
-              <w:t>Mechanism</w:t>
-            </w:r>
-          </w:p>
-        </w:tc>
-        <w:tc>
-          <w:tcPr>
-            <w:tcW w:type="dxa" w:w="3744"/>
-            <w:shd w:fill="0B2545"/>
-          </w:tcPr>
-          <w:p>
-            <w:r/>
-            <w:r>
-              <w:rPr>
-                <w:b/>
-                <w:color w:val="FFFFFF"/>
-                <w:sz w:val="19"/>
-              </w:rPr>
-              <w:t>Implication for the strategy</w:t>
+              <w:t>United States</w:t>
             </w:r>
           </w:p>
         </w:tc>
@@ -377,7 +377,7 @@
       <w:tr>
         <w:tc>
           <w:tcPr>
-            <w:tcW w:type="dxa" w:w="2160"/>
+            <w:tcW w:type="dxa" w:w="1872"/>
           </w:tcPr>
           <w:p>
             <w:r/>
@@ -385,7 +385,21 @@
               <w:rPr>
                 <w:sz w:val="19"/>
               </w:rPr>
-              <w:t>Nomination committees</w:t>
+              <w:t>Path to the board</w:t>
+            </w:r>
+          </w:p>
+        </w:tc>
+        <w:tc>
+          <w:tcPr>
+            <w:tcW w:type="dxa" w:w="4032"/>
+          </w:tcPr>
+          <w:p>
+            <w:r/>
+            <w:r>
+              <w:rPr>
+                <w:sz w:val="19"/>
+              </w:rPr>
+              <w:t>Shareholder-elected nomination committees (Nordics: top 3–4 holders as of Aug/Sep records) and constructive sphere engagement; a 4–8% stake routinely wins direct influence without a proxy fight.</w:t>
             </w:r>
           </w:p>
         </w:tc>
@@ -399,21 +413,7 @@
               <w:rPr>
                 <w:sz w:val="19"/>
               </w:rPr>
-              <w:t>Board nominations are controlled by committees composed of the largest shareholders (typically top 3–4 as of Aug/Sep ownership records), not by the board itself.</w:t>
-            </w:r>
-          </w:p>
-        </w:tc>
-        <w:tc>
-          <w:tcPr>
-            <w:tcW w:type="dxa" w:w="3744"/>
-          </w:tcPr>
-          <w:p>
-            <w:r/>
-            <w:r>
-              <w:rPr>
-                <w:sz w:val="19"/>
-              </w:rPr>
-              <w:t>A 4–8% stake in a mid-cap routinely earns a nomination-committee seat — direct influence over board composition without a proxy fight.</w:t>
+              <w:t>Universal proxy card (2022) structurally lowered the cost of board challenges; most campaigns now settle for seats. Credible slates + 2–6% stakes suffice.</w:t>
             </w:r>
           </w:p>
         </w:tc>
@@ -421,7 +421,7 @@
       <w:tr>
         <w:tc>
           <w:tcPr>
-            <w:tcW w:type="dxa" w:w="2160"/>
+            <w:tcW w:type="dxa" w:w="1872"/>
             <w:shd w:fill="F2F4F8"/>
           </w:tcPr>
           <w:p>
@@ -430,7 +430,22 @@
               <w:rPr>
                 <w:sz w:val="19"/>
               </w:rPr>
-              <w:t>Low EGM threshold</w:t>
+              <w:t>Escalation tools</w:t>
+            </w:r>
+          </w:p>
+        </w:tc>
+        <w:tc>
+          <w:tcPr>
+            <w:tcW w:type="dxa" w:w="4032"/>
+            <w:shd w:fill="F2F4F8"/>
+          </w:tcPr>
+          <w:p>
+            <w:r/>
+            <w:r>
+              <w:rPr>
+                <w:sz w:val="19"/>
+              </w:rPr>
+              <w:t>Low EGM thresholds (10% in Sweden); ownership transparency (public registers) enables precise coalition mapping.</w:t>
             </w:r>
           </w:p>
         </w:tc>
@@ -445,14 +460,15 @@
               <w:rPr>
                 <w:sz w:val="19"/>
               </w:rPr>
-              <w:t>10% of shares can requisition an extraordinary general meeting in Sweden (similar thresholds across the region).</w:t>
+              <w:t>13D platform, precision proxy contests, settlement negotiation; deep advisor ecosystem (solicitors, banks, law firms).</w:t>
             </w:r>
           </w:p>
         </w:tc>
+      </w:tr>
+      <w:tr>
         <w:tc>
           <w:tcPr>
-            <w:tcW w:type="dxa" w:w="3744"/>
-            <w:shd w:fill="F2F4F8"/>
+            <w:tcW w:type="dxa" w:w="1872"/>
           </w:tcPr>
           <w:p>
             <w:r/>
@@ -460,15 +476,13 @@
               <w:rPr>
                 <w:sz w:val="19"/>
               </w:rPr>
-              <w:t>Credible escalation path that rarely needs to be used.</w:t>
+              <w:t>Culture &amp; cost</w:t>
             </w:r>
           </w:p>
         </w:tc>
-      </w:tr>
-      <w:tr>
         <w:tc>
           <w:tcPr>
-            <w:tcW w:type="dxa" w:w="2160"/>
+            <w:tcW w:type="dxa" w:w="4032"/>
           </w:tcPr>
           <w:p>
             <w:r/>
@@ -476,7 +490,7 @@
               <w:rPr>
                 <w:sz w:val="19"/>
               </w:rPr>
-              <w:t>Ownership transparency</w:t>
+              <w:t>Consensus boards; private argumentation usually sufficient; low campaign cost; brand-compatible conduct.</w:t>
             </w:r>
           </w:p>
         </w:tc>
@@ -490,21 +504,7 @@
               <w:rPr>
                 <w:sz w:val="19"/>
               </w:rPr>
-              <w:t>Public shareholder registers (e.g., Euroclear Sweden) updated frequently.</w:t>
-            </w:r>
-          </w:p>
-        </w:tc>
-        <w:tc>
-          <w:tcPr>
-            <w:tcW w:type="dxa" w:w="3744"/>
-          </w:tcPr>
-          <w:p>
-            <w:r/>
-            <w:r>
-              <w:rPr>
-                <w:sz w:val="19"/>
-              </w:rPr>
-              <w:t>Precise coalition mapping; no guessing who holds the register.</w:t>
+              <w:t>Faster, more transactional; settlements common within 6–12 months; higher campaign cost, higher liquidity.</w:t>
             </w:r>
           </w:p>
         </w:tc>
@@ -512,7 +512,7 @@
       <w:tr>
         <w:tc>
           <w:tcPr>
-            <w:tcW w:type="dxa" w:w="2160"/>
+            <w:tcW w:type="dxa" w:w="1872"/>
             <w:shd w:fill="F2F4F8"/>
           </w:tcPr>
           <w:p>
@@ -521,7 +521,22 @@
               <w:rPr>
                 <w:sz w:val="19"/>
               </w:rPr>
-              <w:t>Consensus culture</w:t>
+              <w:t>Our edge</w:t>
+            </w:r>
+          </w:p>
+        </w:tc>
+        <w:tc>
+          <w:tcPr>
+            <w:tcW w:type="dxa" w:w="4032"/>
+            <w:shd w:fill="F2F4F8"/>
+          </w:tcPr>
+          <w:p>
+            <w:r/>
+            <w:r>
+              <w:rPr>
+                <w:sz w:val="19"/>
+              </w:rPr>
+              <w:t>Domestic legitimacy of a 30-year Stockholm-rooted owner; the region's best director bench; Cevian-validated model with no second practitioner.</w:t>
             </w:r>
           </w:p>
         </w:tc>
@@ -536,66 +551,7 @@
               <w:rPr>
                 <w:sz w:val="19"/>
               </w:rPr>
-              <w:t>Boards and ownership spheres respond to well-researched private argumentation; public hostility is rare and usually unnecessary.</w:t>
-            </w:r>
-          </w:p>
-        </w:tc>
-        <w:tc>
-          <w:tcPr>
-            <w:tcW w:type="dxa" w:w="3744"/>
-            <w:shd w:fill="F2F4F8"/>
-          </w:tcPr>
-          <w:p>
-            <w:r/>
-            <w:r>
-              <w:rPr>
-                <w:sz w:val="19"/>
-              </w:rPr>
-              <w:t>Lower campaign cost, faster outcomes, brand-compatible conduct.</w:t>
-            </w:r>
-          </w:p>
-        </w:tc>
-      </w:tr>
-      <w:tr>
-        <w:tc>
-          <w:tcPr>
-            <w:tcW w:type="dxa" w:w="2160"/>
-          </w:tcPr>
-          <w:p>
-            <w:r/>
-            <w:r>
-              <w:rPr>
-                <w:sz w:val="19"/>
-              </w:rPr>
-              <w:t>Dual-class shares &amp; spheres</w:t>
-            </w:r>
-          </w:p>
-        </w:tc>
-        <w:tc>
-          <w:tcPr>
-            <w:tcW w:type="dxa" w:w="3888"/>
-          </w:tcPr>
-          <w:p>
-            <w:r/>
-            <w:r>
-              <w:rPr>
-                <w:sz w:val="19"/>
-              </w:rPr>
-              <w:t>Founding families, foundations and investment companies (Wallenberg/Investor, Industrivärden, Lundberg, Maersk family, Danish foundations) anchor many issuers.</w:t>
-            </w:r>
-          </w:p>
-        </w:tc>
-        <w:tc>
-          <w:tcPr>
-            <w:tcW w:type="dxa" w:w="3744"/>
-          </w:tcPr>
-          <w:p>
-            <w:r/>
-            <w:r>
-              <w:rPr>
-                <w:sz w:val="19"/>
-              </w:rPr>
-              <w:t>Screens out uninvestable names early; conversely, sphere-free mid-caps are exceptionally open to engagement.</w:t>
+              <w:t>Sector operating credibility US activists lack; PE-grade separation expertise for the M&amp;A-heavy campaign mix; team hired from the US activist front line.</w:t>
             </w:r>
           </w:p>
         </w:tc>
@@ -608,7 +564,7 @@
           <w:b w:val="0"/>
           <w:i w:val="0"/>
         </w:rPr>
-        <w:t>Cevian's two-decade record — board seats across the region, low-to-mid-teens net returns over cycles, and outcomes such as the value created around Danske Bank, ABB, Ericsson and numerous Nordic industrials — is the proof of concept. The constructive, board-led model works in this region better than anywhere else. What the region lacks is a second institutional-scale practitioner. Nordic Capital can be that firm, with advantages Cevian never had: a buyout balance sheet behind the engagement, and operating resources measured in hundreds of professionals.</w:t>
+        <w:t>Proof of concept exists in both regimes: Cevian's two-decade, board-seat-driven record in Europe (low-to-mid-teens net over cycles), and the post-universal-proxy wave of US settlements showing that well-resourced engagement now converts to board influence at historically small stakes. What does not yet exist is a practitioner combining PE operating depth with a transatlantic mandate. Nordic Capital can be that firm, with advantages neither Cevian nor the US funds have: a buyout balance sheet behind the engagement, and operating resources measured in hundreds of professionals.</w:t>
       </w:r>
     </w:p>
     <w:p>
@@ -663,10 +619,10 @@
         <w:rPr>
           <w:b/>
         </w:rPr>
-        <w:t xml:space="preserve">Domestic legitimacy. </w:t>
+        <w:t xml:space="preserve">Legitimacy in Europe, credibility in the US. </w:t>
       </w:r>
       <w:r>
-        <w:t>Nordic institutions, family spheres and governments engage very differently with a Stockholm-rooted owner of 30 years than with a New York or London activist. Lower friction means cheaper, faster, quieter wins — and access to situations foreign activists cannot touch.</w:t>
+        <w:t>European institutions, family spheres and governments engage very differently with a Stockholm-rooted owner of 30 years than with a hedge-fund activist — lower friction means cheaper, faster, quieter wins. In the US, the firm's New York presence, North American healthcare and technology investments, and a campaign team hired from the US activist front line give it standing that European engagement funds have never built.</w:t>
       </w:r>
     </w:p>
     <w:p>
@@ -678,10 +634,10 @@
         <w:rPr>
           <w:b/>
         </w:rPr>
-        <w:t xml:space="preserve">Sector depth = underwriting edge. </w:t>
+        <w:t xml:space="preserve">Sector depth = underwriting edge, in both regions. </w:t>
       </w:r>
       <w:r>
-        <w:t>The firm's diligence pattern-recognition in medtech, software, payments and specialty financials applies directly to the listed mid-cap universe, much of which comprises businesses Nordic Capital has studied, bid on, or competed against.</w:t>
+        <w:t>The firm's diligence pattern-recognition in medtech, software, payments and specialty financials applies identically to listed mid-caps in Boston, Amsterdam and Stockholm — much of the universe comprises businesses Nordic Capital has studied, bid on, or competed against.</w:t>
       </w:r>
     </w:p>
     <w:p>
@@ -736,7 +692,7 @@
           <w:b w:val="0"/>
           <w:i w:val="0"/>
         </w:rPr>
-        <w:t>Acquire 4–10% positions in 6–8 listed Nordic companies with EUR 1–10bn market capitalisation, where a clearly identifiable gap exists between market price and intrinsic value, and where that gap can be closed within 2–4 years through actions the company itself can take: operational improvement, portfolio separation or divestiture, capital-allocation reform, or strategic transactions. Influence is exercised through the Nordic governance machinery — nomination-committee participation, board representation, and private engagement with management, boards and anchor owners — with public pressure reserved as an escalation, not a default.</w:t>
+        <w:t>Acquire 2–10% positions in 6–8 listed US and European companies with USD 2–15bn market capitalisation, in Nordic Capital's core sectors, where a clearly identifiable gap exists between market price and intrinsic value, and where that gap can be closed within 2–4 years through actions the company itself can take: operational improvement, portfolio separation or divestiture, capital-allocation reform, or strategic transactions. Influence is exercised through each market's governance machinery — nomination committees, board representation and sphere engagement in Europe; universal-proxy-backed private engagement and negotiated board refreshment in the US — with public pressure reserved as an escalation, not a default.</w:t>
       </w:r>
     </w:p>
     <w:p>
@@ -898,7 +854,7 @@
               <w:rPr>
                 <w:sz w:val="19"/>
               </w:rPr>
-              <w:t>Build 4–10% via open market and blocks, timed against Q3 ownership snapshots that seat nomination committees. Disclose at thresholds; first private meeting with chair before crossing 5%.</w:t>
+              <w:t>Build 2–10% via open market and blocks, timed to the board calendar: Q3 ownership snapshots for Nordic nomination committees; nomination windows for US slates. Disclose at thresholds; first private meeting with chair before crossing 5%.</w:t>
             </w:r>
           </w:p>
         </w:tc>
@@ -942,7 +898,7 @@
               <w:rPr>
                 <w:sz w:val="19"/>
               </w:rPr>
-              <w:t>Present value plan privately to board and anchor shareholders. Secure nomination-committee seat at the next cycle; propose 1–2 directors from the operating network. Align with domestic institutions and AP funds.</w:t>
+              <w:t>Present value plan privately to board and anchor shareholders. Europe: secure nomination-committee seat; propose 1–2 directors from the operating network. US: negotiate board refreshment under credible universal-proxy optionality. Align with index funds and domestic institutions.</w:t>
             </w:r>
           </w:p>
         </w:tc>
@@ -1156,7 +1112,7 @@
           <w:b w:val="0"/>
           <w:i w:val="0"/>
         </w:rPr>
-        <w:t>Sector focus mirrors the firm's private equity franchises, weighted to where the listed Nordic mid-cap universe offers depth:</w:t>
+        <w:t>Sector focus mirrors the firm's private equity franchises, applied across both regions; geography follows the sector opportunity rather than a quota:</w:t>
       </w:r>
     </w:p>
     <w:tbl>
@@ -1175,7 +1131,7 @@
       <w:tr>
         <w:tc>
           <w:tcPr>
-            <w:tcW w:type="dxa" w:w="2160"/>
+            <w:tcW w:type="dxa" w:w="2016"/>
             <w:shd w:fill="0B2545"/>
           </w:tcPr>
           <w:p>
@@ -1192,7 +1148,7 @@
         </w:tc>
         <w:tc>
           <w:tcPr>
-            <w:tcW w:type="dxa" w:w="1440"/>
+            <w:tcW w:type="dxa" w:w="1296"/>
             <w:shd w:fill="0B2545"/>
           </w:tcPr>
           <w:p>
@@ -1209,7 +1165,7 @@
         </w:tc>
         <w:tc>
           <w:tcPr>
-            <w:tcW w:type="dxa" w:w="3456"/>
+            <w:tcW w:type="dxa" w:w="3168"/>
             <w:shd w:fill="0B2545"/>
           </w:tcPr>
           <w:p>
@@ -1226,7 +1182,7 @@
         </w:tc>
         <w:tc>
           <w:tcPr>
-            <w:tcW w:type="dxa" w:w="2736"/>
+            <w:tcW w:type="dxa" w:w="3312"/>
             <w:shd w:fill="0B2545"/>
           </w:tcPr>
           <w:p>
@@ -1237,7 +1193,7 @@
                 <w:color w:val="FFFFFF"/>
                 <w:sz w:val="19"/>
               </w:rPr>
-              <w:t>Illustrative listed universe</w:t>
+              <w:t>Illustrative listed universe (US &amp; EU)</w:t>
             </w:r>
           </w:p>
         </w:tc>
@@ -1245,7 +1201,7 @@
       <w:tr>
         <w:tc>
           <w:tcPr>
-            <w:tcW w:type="dxa" w:w="2160"/>
+            <w:tcW w:type="dxa" w:w="2016"/>
           </w:tcPr>
           <w:p>
             <w:r/>
@@ -1259,7 +1215,7 @@
         </w:tc>
         <w:tc>
           <w:tcPr>
-            <w:tcW w:type="dxa" w:w="1440"/>
+            <w:tcW w:type="dxa" w:w="1296"/>
           </w:tcPr>
           <w:p>
             <w:r/>
@@ -1273,7 +1229,7 @@
         </w:tc>
         <w:tc>
           <w:tcPr>
-            <w:tcW w:type="dxa" w:w="3456"/>
+            <w:tcW w:type="dxa" w:w="3168"/>
           </w:tcPr>
           <w:p>
             <w:r/>
@@ -1281,13 +1237,13 @@
               <w:rPr>
                 <w:sz w:val="19"/>
               </w:rPr>
-              <w:t>Nordic Capital's deepest franchise; the region hosts a dense cluster of global-niche medtech and pharma-services leaders, several in margin or execution repair.</w:t>
+              <w:t>Nordic Capital's deepest franchise; on both continents, quality medtech franchises sit in margin or execution repair at deep discounts.</w:t>
             </w:r>
           </w:p>
         </w:tc>
         <w:tc>
           <w:tcPr>
-            <w:tcW w:type="dxa" w:w="2736"/>
+            <w:tcW w:type="dxa" w:w="3312"/>
           </w:tcPr>
           <w:p>
             <w:r/>
@@ -1295,7 +1251,7 @@
               <w:rPr>
                 <w:sz w:val="19"/>
               </w:rPr>
-              <w:t>Elekta, Getinge, Demant, GN Store Nord, Ambu, Coloplast-adjacent suppliers</w:t>
+              <w:t>Elekta, Smith+Nephew, Philips, Getinge, GN Store Nord / Baxter, Zimmer Biomet, Teleflex, Henry Schein</w:t>
             </w:r>
           </w:p>
         </w:tc>
@@ -1303,7 +1259,7 @@
       <w:tr>
         <w:tc>
           <w:tcPr>
-            <w:tcW w:type="dxa" w:w="2160"/>
+            <w:tcW w:type="dxa" w:w="2016"/>
             <w:shd w:fill="F2F4F8"/>
           </w:tcPr>
           <w:p>
@@ -1318,7 +1274,7 @@
         </w:tc>
         <w:tc>
           <w:tcPr>
-            <w:tcW w:type="dxa" w:w="1440"/>
+            <w:tcW w:type="dxa" w:w="1296"/>
             <w:shd w:fill="F2F4F8"/>
           </w:tcPr>
           <w:p>
@@ -1333,7 +1289,7 @@
         </w:tc>
         <w:tc>
           <w:tcPr>
-            <w:tcW w:type="dxa" w:w="3456"/>
+            <w:tcW w:type="dxa" w:w="3168"/>
             <w:shd w:fill="F2F4F8"/>
           </w:tcPr>
           <w:p>
@@ -1342,13 +1298,13 @@
               <w:rPr>
                 <w:sz w:val="19"/>
               </w:rPr>
-              <w:t>Largest segment of the listed universe; rich in conglomerate discounts and self-help stories.</w:t>
+              <w:t>Largest segment of the listed universe; rich in conglomerate discounts, separations and self-help stories.</w:t>
             </w:r>
           </w:p>
         </w:tc>
         <w:tc>
           <w:tcPr>
-            <w:tcW w:type="dxa" w:w="2736"/>
+            <w:tcW w:type="dxa" w:w="3312"/>
             <w:shd w:fill="F2F4F8"/>
           </w:tcPr>
           <w:p>
@@ -1357,7 +1313,7 @@
               <w:rPr>
                 <w:sz w:val="19"/>
               </w:rPr>
-              <w:t>Orkla, SKF, Dometic, Thule, ISS, Securitas, Valmet, Huhtamäki</w:t>
+              <w:t>Orkla, SKF, Dometic, ISS, Valmet / mid-cap US multi-industry and services names in separation or margin repair</w:t>
             </w:r>
           </w:p>
         </w:tc>
@@ -1365,7 +1321,7 @@
       <w:tr>
         <w:tc>
           <w:tcPr>
-            <w:tcW w:type="dxa" w:w="2160"/>
+            <w:tcW w:type="dxa" w:w="2016"/>
           </w:tcPr>
           <w:p>
             <w:r/>
@@ -1379,7 +1335,7 @@
         </w:tc>
         <w:tc>
           <w:tcPr>
-            <w:tcW w:type="dxa" w:w="1440"/>
+            <w:tcW w:type="dxa" w:w="1296"/>
           </w:tcPr>
           <w:p>
             <w:r/>
@@ -1393,7 +1349,7 @@
         </w:tc>
         <w:tc>
           <w:tcPr>
-            <w:tcW w:type="dxa" w:w="3456"/>
+            <w:tcW w:type="dxa" w:w="3168"/>
           </w:tcPr>
           <w:p>
             <w:r/>
@@ -1401,13 +1357,13 @@
               <w:rPr>
                 <w:sz w:val="19"/>
               </w:rPr>
-              <w:t>Post-2021 de-ratings left quality Nordic software and IT-services assets at private-market discounts; consolidation logic is strong.</w:t>
+              <w:t>Post-2021 de-ratings left quality software, IT-services and payments assets at private-market discounts; consolidation logic is strong.</w:t>
             </w:r>
           </w:p>
         </w:tc>
         <w:tc>
           <w:tcPr>
-            <w:tcW w:type="dxa" w:w="2736"/>
+            <w:tcW w:type="dxa" w:w="3312"/>
           </w:tcPr>
           <w:p>
             <w:r/>
@@ -1415,7 +1371,7 @@
               <w:rPr>
                 <w:sz w:val="19"/>
               </w:rPr>
-              <w:t>Tieto, Crayon-adjacent, Nexi-linked Nordic payment assets, Kahoot-class de-rated SaaS</w:t>
+              <w:t>Tieto, Nexi-linked European payment assets / Global Payments, Fiserv-class de-rated US payments and vertical software</w:t>
             </w:r>
           </w:p>
         </w:tc>
@@ -1423,7 +1379,7 @@
       <w:tr>
         <w:tc>
           <w:tcPr>
-            <w:tcW w:type="dxa" w:w="2160"/>
+            <w:tcW w:type="dxa" w:w="2016"/>
             <w:shd w:fill="F2F4F8"/>
           </w:tcPr>
           <w:p>
@@ -1438,7 +1394,7 @@
         </w:tc>
         <w:tc>
           <w:tcPr>
-            <w:tcW w:type="dxa" w:w="1440"/>
+            <w:tcW w:type="dxa" w:w="1296"/>
             <w:shd w:fill="F2F4F8"/>
           </w:tcPr>
           <w:p>
@@ -1453,7 +1409,7 @@
         </w:tc>
         <w:tc>
           <w:tcPr>
-            <w:tcW w:type="dxa" w:w="3456"/>
+            <w:tcW w:type="dxa" w:w="3168"/>
             <w:shd w:fill="F2F4F8"/>
           </w:tcPr>
           <w:p>
@@ -1468,7 +1424,7 @@
         </w:tc>
         <w:tc>
           <w:tcPr>
-            <w:tcW w:type="dxa" w:w="2736"/>
+            <w:tcW w:type="dxa" w:w="3312"/>
             <w:shd w:fill="F2F4F8"/>
           </w:tcPr>
           <w:p>
@@ -1477,7 +1433,7 @@
               <w:rPr>
                 <w:sz w:val="19"/>
               </w:rPr>
-              <w:t>Storebrand, Sampo-adjacent, specialty lenders</w:t>
+              <w:t>Storebrand, European specialty lenders / US specialty insurers and savings platforms</w:t>
             </w:r>
           </w:p>
         </w:tc>
@@ -1490,7 +1446,7 @@
           <w:b w:val="0"/>
           <w:i w:val="0"/>
         </w:rPr>
-        <w:t>Geographic spread: Sweden ~40–50% (deepest market, most activist-friendly mechanics), Denmark ~20–25%, Finland ~15–20%, Norway ~10–15% (sphere- and state-heavy, more selective).</w:t>
+        <w:t>Geographic spread: Europe 50–60% of the book — of which the Nordics 20–30% (home-field mechanics, deepest networks), UK/Benelux/DACH the balance — and the United States 40–50% (deepest and most liquid activism market; universal proxy regime). Single-name limits apply uniformly; FX hedged to the fund's USD base.</w:t>
       </w:r>
     </w:p>
     <w:p>
@@ -1513,7 +1469,7 @@
         <w:t xml:space="preserve">Universe: </w:t>
       </w:r>
       <w:r>
-        <w:t>~1,400 Nordic-listed companies; ~150 in the EUR 1–10bn sweet spot after liquidity screens.</w:t>
+        <w:t>US and European listed companies in the firm's four core sectors; ~1,300 names in the USD 2–15bn band after liquidity screens (roughly 55% US, 45% Europe).</w:t>
       </w:r>
     </w:p>
     <w:p>
@@ -1528,7 +1484,7 @@
         <w:t xml:space="preserve">Screen 1 — Quality: </w:t>
       </w:r>
       <w:r>
-        <w:t>defensible market position, structurally sound gross margins, identifiable best-in-class peer set. (~60 names survive.)</w:t>
+        <w:t>defensible market position, structurally sound gross margins, identifiable best-in-class peer set. (~300 names survive.)</w:t>
       </w:r>
     </w:p>
     <w:p>
@@ -1543,7 +1499,7 @@
         <w:t xml:space="preserve">Screen 2 — Value gap: </w:t>
       </w:r>
       <w:r>
-        <w:t>&gt;30% upside to intrinsic value on normalised margins or SOTP. (~25–30 names.)</w:t>
+        <w:t>&gt;30% upside to intrinsic value on normalised margins or SOTP. (~80–100 names.)</w:t>
       </w:r>
     </w:p>
     <w:p>
@@ -1558,7 +1514,7 @@
         <w:t xml:space="preserve">Screen 3 — Path to influence: </w:t>
       </w:r>
       <w:r>
-        <w:t>free-float and register structure permitting a 4–10% stake with nomination-committee relevance; no blocking sphere hostile to change. (~15–20 names.)</w:t>
+        <w:t>register structure permitting an influential stake — nomination-committee relevance in Europe, credible universal-proxy optionality in the US; no blocking holder hostile to change; no poison-pill or staggered-board structure that defeats the thesis timeline. (~40 names.)</w:t>
       </w:r>
     </w:p>
     <w:p>
@@ -1573,7 +1529,7 @@
         <w:t xml:space="preserve">Screen 4 — Conflict check: </w:t>
       </w:r>
       <w:r>
-        <w:t>no MNPI contamination from current PE processes; cleared by compliance before any accumulation. (Live pipeline: 10–14 names, of which 6–8 funded.)</w:t>
+        <w:t>no MNPI contamination from current PE processes; cleared by compliance before any accumulation. (Live pipeline: 12–16 names, of which 6–8 funded.)</w:t>
       </w:r>
     </w:p>
     <w:p>
@@ -1582,7 +1538,7 @@
           <w:b w:val="0"/>
           <w:i w:val="0"/>
         </w:rPr>
-        <w:t>A EUR 1.5bn book across 6–8 core positions implies EUR 180–280m per position — i.e., 4–10% of companies with EUR 2–6bn market caps, precisely the band where nomination-committee seats are won and where dedicated competition is thinnest.</w:t>
+        <w:t>A USD 1.5bn book across 6–8 core positions implies USD 180–280m per position — i.e., 4–10% of a USD 3–6bn European mid-cap, or 2–5% of a USD 5–15bn US company, both sufficient for board-level influence under the respective regimes.</w:t>
       </w:r>
     </w:p>
     <w:p>
@@ -1604,7 +1560,7 @@
           <w:b w:val="0"/>
           <w:i/>
         </w:rPr>
-        <w:t>The following five situations illustrate the strategy's archetypes using publicly available information as of early/mid 2026. They are illustrations for discussion, not recommendations, and would each require full underwriting and conflict clearance.</w:t>
+        <w:t>The following six situations illustrate the strategy's archetypes using publicly available information as of early/mid 2026. They are illustrations for discussion, not recommendations, and would each require full underwriting and conflict clearance.</w:t>
       </w:r>
     </w:p>
     <w:p>
@@ -1621,7 +1577,7 @@
         <w:spacing w:after="80"/>
       </w:pPr>
       <w:r>
-        <w:t>Global #2 in radiation oncology, a structurally growing oligopoly, yet the stock has de-rated dramatically; third-party fair-value estimates have placed the discount at ~50%+ at points in 2026.</w:t>
+        <w:t>Global #2 in radiation oncology, a structurally growing oligopoly, yet the stock has de-rated dramatically; third-party fair-value estimates have placed the discount at ~50%+ at points in 2026. FY2025/26 adjusted EBIT margin of ~12% versus mid-to-high-teens at Siemens Healthineers' Varian — a gap attributable to supply chain, order execution and mix, not market position.</w:t>
       </w:r>
     </w:p>
     <w:p>
@@ -1630,7 +1586,15 @@
         <w:spacing w:after="80"/>
       </w:pPr>
       <w:r>
-        <w:t>FY2025/26 adjusted EBIT margin of ~12% versus mid-to-high-teens at Siemens Healthineers' Varian — a 400–600bps gap attributable to supply chain, order execution and mix, not market position.</w:t>
+        <w:t>Value plan: board-sponsored margin program, order-to-revenue execution reset, service-revenue acceleration; strategic optionality given medtech consolidation logic. Home-field engagement via the Swedish nomination-committee system.</w:t>
+      </w:r>
+    </w:p>
+    <w:p>
+      <w:pPr>
+        <w:pStyle w:val="Heading2"/>
+      </w:pPr>
+      <w:r>
+        <w:t>7.2 Smith+Nephew (UK — MedTech) — Margin gap &amp; structural options</w:t>
       </w:r>
     </w:p>
     <w:p>
@@ -1639,15 +1603,7 @@
         <w:spacing w:after="80"/>
       </w:pPr>
       <w:r>
-        <w:t>Value plan: board-sponsored margin program, order-to-revenue execution reset, service-revenue acceleration; strategic optionality given consolidation logic in medtech. Healthcare is Nordic Capital's home turf — credibility here is immediate.</w:t>
-      </w:r>
-    </w:p>
-    <w:p>
-      <w:pPr>
-        <w:pStyle w:val="Heading2"/>
-      </w:pPr>
-      <w:r>
-        <w:t>7.2 Getinge (Sweden — MedTech) — Margin recovery &amp; portfolio focus</w:t>
+        <w:t>Quality orthopaedics/sports-medicine/wound franchise that has lagged peers on margin and execution for years; an established engagement situation (Cevian on the register since 2024) validating the value gap, with the turnaround only partly delivered.</w:t>
       </w:r>
     </w:p>
     <w:p>
@@ -1656,7 +1612,15 @@
         <w:spacing w:after="80"/>
       </w:pPr>
       <w:r>
-        <w:t>Profitability is recovering (profit margin ~6.5% in 2025 vs ~4.7% in 2024) as quality-remediation costs roll off, but remains far below medtech peer levels.</w:t>
+        <w:t>Value plan: hold the board to peer-level margins; evaluate structural options including separation of underperforming franchises and a US listing review — a live debate where a second credible engaged owner can be decisive.</w:t>
+      </w:r>
+    </w:p>
+    <w:p>
+      <w:pPr>
+        <w:pStyle w:val="Heading2"/>
+      </w:pPr>
+      <w:r>
+        <w:t>7.3 Philips (Netherlands — HealthTech) — Recovery &amp; SOTP</w:t>
       </w:r>
     </w:p>
     <w:p>
@@ -1665,7 +1629,7 @@
         <w:spacing w:after="80"/>
       </w:pPr>
       <w:r>
-        <w:t>Three loosely related business areas (Acute Care Therapies, Life Science, Surgical Workflows) invite portfolio review; a Life Science separation is a credible SOTP catalyst.</w:t>
+        <w:t>Global healthtech franchise emerging from the Respironics recall era (US litigation settled), with margins still well below pre-crisis levels and peers; anchor shareholder (Exor) already on the register demonstrates openness to engaged owners.</w:t>
       </w:r>
     </w:p>
     <w:p>
@@ -1674,7 +1638,7 @@
         <w:spacing w:after="80"/>
       </w:pPr>
       <w:r>
-        <w:t>Value plan: complete the quality agenda with board-level accountability, then drive portfolio focus and margin normalisation toward double-digit EBITA.</w:t>
+        <w:t>Value plan: margin normalisation with board accountability; portfolio review of Personal Health versus the healthcare core — a separation long argued by analysts that would force the SOTP into the price.</w:t>
       </w:r>
     </w:p>
     <w:p>
@@ -1682,7 +1646,7 @@
         <w:pStyle w:val="Heading2"/>
       </w:pPr>
       <w:r>
-        <w:t>7.3 GN Store Nord (Denmark — Hearing &amp; Audio) — Separation thesis</w:t>
+        <w:t>7.4 Baxter International (US — MedTech) — Completing the simplification</w:t>
       </w:r>
     </w:p>
     <w:p>
@@ -1691,7 +1655,7 @@
         <w:spacing w:after="80"/>
       </w:pPr>
       <w:r>
-        <w:t>Long-standing two-business structure (hearing care and enterprise/consumer audio) with limited synergy; separation has been publicly debated for years while leverage from the Steelseries era suppressed action.</w:t>
+        <w:t>Multi-year portfolio simplification already in motion (BioPharma Solutions sold; Vantive kidney-care divested to Carlyle in early 2025), yet the equity has continued to de-rate amid execution stumbles and a CEO transition — a fallen angel trading far below medtech peer multiples.</w:t>
       </w:r>
     </w:p>
     <w:p>
@@ -1700,7 +1664,7 @@
         <w:spacing w:after="80"/>
       </w:pPr>
       <w:r>
-        <w:t>Value plan: deleverage milestones, then formal separation review; both businesses have natural strategic and sponsor buyers. Classic M&amp;A-activism archetype in a foundation-light register that is unusually open for a Danish large-cap.</w:t>
+        <w:t>Value plan: finish the job — complete the separation program, reset the cost base of the remaining core, refresh the board, and apply divestiture proceeds to a disciplined capital-return framework. Classic universal-proxy-era US engagement.</w:t>
       </w:r>
     </w:p>
     <w:p>
@@ -1708,7 +1672,7 @@
         <w:pStyle w:val="Heading2"/>
       </w:pPr>
       <w:r>
-        <w:t>7.4 Tieto (Finland — Software &amp; IT Services) — Completing the break-up</w:t>
+        <w:t>7.5 Global Payments (US — Payments) — Capital allocation &amp; credibility reset</w:t>
       </w:r>
     </w:p>
     <w:p>
@@ -1717,7 +1681,7 @@
         <w:spacing w:after="80"/>
       </w:pPr>
       <w:r>
-        <w:t>Tietoevry has already validated the separation path: Banking demerger toward a Nasdaq Helsinki listing announced, Tech Services sold to Agilitas for EUR 300m (closed September 2025), proceeds applied to debt.</w:t>
+        <w:t>Scaled merchant-acquiring franchise trading at a deeply depressed multiple after the poorly received 2025 Worldpay/Issuer Solutions restructuring; activist interest has been publicly reported, underscoring the value gap.</w:t>
       </w:r>
     </w:p>
     <w:p>
@@ -1726,7 +1690,7 @@
         <w:spacing w:after="80"/>
       </w:pPr>
       <w:r>
-        <w:t>Value plan: support and accelerate completion of the value-realisation program, enforce capital-return discipline on proceeds, and position the remaining Nordic software core (Industry/Care) for consolidation — as buyer or seller.</w:t>
+        <w:t>Value plan: integration milestones with board-level accountability, divestiture of non-core assets, binding capital-return commitments post-deleveraging, and board refreshment with payments operating expertise — squarely within Nordic Capital's payments franchise (Nets/Nexi heritage).</w:t>
       </w:r>
     </w:p>
     <w:p>
@@ -1734,7 +1698,7 @@
         <w:pStyle w:val="Heading2"/>
       </w:pPr>
       <w:r>
-        <w:t>7.5 Orkla (Norway — Branded Consumer / Holding) — Conglomerate discount</w:t>
+        <w:t>7.6 Zimmer Biomet (US — MedTech) — Capital-allocation catalyst</w:t>
       </w:r>
     </w:p>
     <w:p>
@@ -1743,7 +1707,7 @@
         <w:spacing w:after="80"/>
       </w:pPr>
       <w:r>
-        <w:t>Self-declared transition to an “industrial investment company” with ~12 portfolio companies, a ~42.6% stake in Jotun (paints — a world-class hidden asset), hydropower assets and net cash optionality; the equity persistently trades below credible SOTP.</w:t>
+        <w:t>Orthopaedics leader compounding modestly but trading at a structurally depressed multiple, with investor confidence eroded by guidance resets and M&amp;A choices.</w:t>
       </w:r>
     </w:p>
     <w:p>
@@ -1752,7 +1716,7 @@
         <w:spacing w:after="80"/>
       </w:pPr>
       <w:r>
-        <w:t>Value plan: accelerate announced portfolio monetisations, establish a capital-return framework tied to disposal proceeds, and push for transparent per-asset reporting that forces the SOTP into the price.</w:t>
+        <w:t>Value plan: capital-allocation framework (organic investment and buybacks over dilutive M&amp;A), portfolio pruning of subscale adjacencies, and margin program toward peer levels.</w:t>
       </w:r>
     </w:p>
     <w:p>
@@ -1761,7 +1725,7 @@
           <w:b w:val="0"/>
           <w:i/>
         </w:rPr>
-        <w:t>Watchlist (further candidates surviving Screens 1–3): Securitas (self-help largely delivered — instructive as a model of the re-rating we underwrite), Demant, Ambu, Dometic, Thule, Huhtamäki, Valmet, Storebrand, ISS.</w:t>
+        <w:t>Watchlist (further candidates surviving Screens 1–3): Europe — Getinge, GN Store Nord, Orkla, Tieto, Demant, Securitas (self-help largely delivered — a model of the re-rating we underwrite), ISS, Valmet, Storebrand. US — Teleflex (separation announced), Henry Schein, Fiserv, mid-cap specialty insurers.</w:t>
       </w:r>
     </w:p>
     <w:p>
@@ -1881,7 +1845,7 @@
               <w:rPr>
                 <w:sz w:val="19"/>
               </w:rPr>
-              <w:t>Sized to the EUR 1–10bn mid-cap band: large enough for 6–8 influential stakes, small enough to stay in the under-fished segment and exit without market impact.</w:t>
+              <w:t>Sized to the USD 2–15bn transatlantic mid-cap band: large enough for 6–8 influential stakes, small enough to stay in the under-fished segment and exit without market impact.</w:t>
             </w:r>
           </w:p>
         </w:tc>
@@ -2049,7 +2013,7 @@
               <w:rPr>
                 <w:sz w:val="19"/>
               </w:rPr>
-              <w:t>17.5% over the higher of MSCI Nordic + 200bps and a 5% absolute hurdle; 3-year crystallisation; high-water mark</w:t>
+              <w:t>17.5% over the higher of a 50/50 S&amp;P 500 / MSCI Europe blend + 200bps and a 5% absolute hurdle; 3-year crystallisation; high-water mark</w:t>
             </w:r>
           </w:p>
         </w:tc>
@@ -2222,7 +2186,7 @@
           <w:b w:val="0"/>
           <w:i w:val="0"/>
         </w:rPr>
-        <w:t>A deliberately small, senior team of 10–12 at launch, structured for PE-grade underwriting and board-level engagement:</w:t>
+        <w:t>A deliberately small, senior team of 11–13 at launch, split between Stockholm and New York, structured for PE-grade underwriting and board-level engagement in both regimes:</w:t>
       </w:r>
     </w:p>
     <w:tbl>
@@ -2329,7 +2293,7 @@
               <w:rPr>
                 <w:sz w:val="19"/>
               </w:rPr>
-              <w:t>Senior hire with 15+ years in engaged/activist investing (Cevian, European activist franchise, or top-tier event-driven background) plus Nordic board credibility. Sits on Nordic Capital's Executive Committee; co-PM with the Deputy.</w:t>
+              <w:t>Senior hire with 15+ years in engaged/activist investing (Cevian, European activist franchise, or top-tier event-driven background) plus board credibility. Sits on Nordic Capital's Executive Committee; co-PM with the Deputy. Based Stockholm.</w:t>
             </w:r>
           </w:p>
         </w:tc>
@@ -2392,98 +2356,7 @@
               <w:rPr>
                 <w:sz w:val="19"/>
               </w:rPr>
-              <w:t>Sector Principals</w:t>
-            </w:r>
-          </w:p>
-        </w:tc>
-        <w:tc>
-          <w:tcPr>
-            <w:tcW w:type="dxa" w:w="576"/>
-          </w:tcPr>
-          <w:p>
-            <w:r/>
-            <w:r>
-              <w:rPr>
-                <w:sz w:val="19"/>
-              </w:rPr>
-              <w:t>2</w:t>
-            </w:r>
-          </w:p>
-        </w:tc>
-        <w:tc>
-          <w:tcPr>
-            <w:tcW w:type="dxa" w:w="6192"/>
-          </w:tcPr>
-          <w:p>
-            <w:r/>
-            <w:r>
-              <w:rPr>
-                <w:sz w:val="19"/>
-              </w:rPr>
-              <w:t>Healthcare/MedTech and Industrials/Technology; principal-level, each capable of leading a campaign end-to-end.</w:t>
-            </w:r>
-          </w:p>
-        </w:tc>
-      </w:tr>
-      <w:tr>
-        <w:tc>
-          <w:tcPr>
-            <w:tcW w:type="dxa" w:w="3024"/>
-            <w:shd w:fill="F2F4F8"/>
-          </w:tcPr>
-          <w:p>
-            <w:r/>
-            <w:r>
-              <w:rPr>
-                <w:sz w:val="19"/>
-              </w:rPr>
-              <w:t>Investment professionals</w:t>
-            </w:r>
-          </w:p>
-        </w:tc>
-        <w:tc>
-          <w:tcPr>
-            <w:tcW w:type="dxa" w:w="576"/>
-            <w:shd w:fill="F2F4F8"/>
-          </w:tcPr>
-          <w:p>
-            <w:r/>
-            <w:r>
-              <w:rPr>
-                <w:sz w:val="19"/>
-              </w:rPr>
-              <w:t>4–5</w:t>
-            </w:r>
-          </w:p>
-        </w:tc>
-        <w:tc>
-          <w:tcPr>
-            <w:tcW w:type="dxa" w:w="6192"/>
-            <w:shd w:fill="F2F4F8"/>
-          </w:tcPr>
-          <w:p>
-            <w:r/>
-            <w:r>
-              <w:rPr>
-                <w:sz w:val="19"/>
-              </w:rPr>
-              <w:t>Associate/VP level; modelling, register analytics, peer benchmarking. Mix of PE, equity research and special-situations backgrounds.</w:t>
-            </w:r>
-          </w:p>
-        </w:tc>
-      </w:tr>
-      <w:tr>
-        <w:tc>
-          <w:tcPr>
-            <w:tcW w:type="dxa" w:w="3024"/>
-          </w:tcPr>
-          <w:p>
-            <w:r/>
-            <w:r>
-              <w:rPr>
-                <w:sz w:val="19"/>
-              </w:rPr>
-              <w:t>Head of Stewardship &amp; Governance</w:t>
+              <w:t>Principal — US Situations &amp; Campaign Strategy: Knut Nyman</w:t>
             </w:r>
           </w:p>
         </w:tc>
@@ -2511,7 +2384,7 @@
               <w:rPr>
                 <w:sz w:val="19"/>
               </w:rPr>
-              <w:t>Drives nomination-committee work, director sourcing from the operating-advisor bench, proxy strategy and engagement documentation.</w:t>
+              <w:t>Founding hire from Elliott Investment Management. Owns the US side of the book: idea generation and underwriting for US names, the universal-proxy campaign playbook, and the US advisor network. Based New York. See 9.1 below.</w:t>
             </w:r>
           </w:p>
         </w:tc>
@@ -2528,7 +2401,98 @@
               <w:rPr>
                 <w:sz w:val="19"/>
               </w:rPr>
-              <w:t>Dedicated Compliance Officer</w:t>
+              <w:t>Sector Principals</w:t>
+            </w:r>
+          </w:p>
+        </w:tc>
+        <w:tc>
+          <w:tcPr>
+            <w:tcW w:type="dxa" w:w="576"/>
+            <w:shd w:fill="F2F4F8"/>
+          </w:tcPr>
+          <w:p>
+            <w:r/>
+            <w:r>
+              <w:rPr>
+                <w:sz w:val="19"/>
+              </w:rPr>
+              <w:t>2</w:t>
+            </w:r>
+          </w:p>
+        </w:tc>
+        <w:tc>
+          <w:tcPr>
+            <w:tcW w:type="dxa" w:w="6192"/>
+            <w:shd w:fill="F2F4F8"/>
+          </w:tcPr>
+          <w:p>
+            <w:r/>
+            <w:r>
+              <w:rPr>
+                <w:sz w:val="19"/>
+              </w:rPr>
+              <w:t>Healthcare/MedTech and Industrials/Technology; principal-level, each capable of leading a campaign end-to-end. One based in each region.</w:t>
+            </w:r>
+          </w:p>
+        </w:tc>
+      </w:tr>
+      <w:tr>
+        <w:tc>
+          <w:tcPr>
+            <w:tcW w:type="dxa" w:w="3024"/>
+          </w:tcPr>
+          <w:p>
+            <w:r/>
+            <w:r>
+              <w:rPr>
+                <w:sz w:val="19"/>
+              </w:rPr>
+              <w:t>Investment professionals</w:t>
+            </w:r>
+          </w:p>
+        </w:tc>
+        <w:tc>
+          <w:tcPr>
+            <w:tcW w:type="dxa" w:w="576"/>
+          </w:tcPr>
+          <w:p>
+            <w:r/>
+            <w:r>
+              <w:rPr>
+                <w:sz w:val="19"/>
+              </w:rPr>
+              <w:t>4–5</w:t>
+            </w:r>
+          </w:p>
+        </w:tc>
+        <w:tc>
+          <w:tcPr>
+            <w:tcW w:type="dxa" w:w="6192"/>
+          </w:tcPr>
+          <w:p>
+            <w:r/>
+            <w:r>
+              <w:rPr>
+                <w:sz w:val="19"/>
+              </w:rPr>
+              <w:t>Associate/VP level; modelling, register analytics, peer benchmarking. Mix of PE, equity research and special-situations backgrounds; split across offices.</w:t>
+            </w:r>
+          </w:p>
+        </w:tc>
+      </w:tr>
+      <w:tr>
+        <w:tc>
+          <w:tcPr>
+            <w:tcW w:type="dxa" w:w="3024"/>
+            <w:shd w:fill="F2F4F8"/>
+          </w:tcPr>
+          <w:p>
+            <w:r/>
+            <w:r>
+              <w:rPr>
+                <w:sz w:val="19"/>
+              </w:rPr>
+              <w:t>Head of Stewardship &amp; Governance</w:t>
             </w:r>
           </w:p>
         </w:tc>
@@ -2558,7 +2522,7 @@
               <w:rPr>
                 <w:sz w:val="19"/>
               </w:rPr>
-              <w:t>Owns the information barrier with the PE business; reports to Group GC, not to the PM.</w:t>
+              <w:t>Drives nomination-committee work in Europe, director sourcing from the operating-advisor bench, proxy strategy and engagement documentation.</w:t>
             </w:r>
           </w:p>
         </w:tc>
@@ -2574,6 +2538,51 @@
               <w:rPr>
                 <w:sz w:val="19"/>
               </w:rPr>
+              <w:t>Dedicated Compliance Officer</w:t>
+            </w:r>
+          </w:p>
+        </w:tc>
+        <w:tc>
+          <w:tcPr>
+            <w:tcW w:type="dxa" w:w="576"/>
+          </w:tcPr>
+          <w:p>
+            <w:r/>
+            <w:r>
+              <w:rPr>
+                <w:sz w:val="19"/>
+              </w:rPr>
+              <w:t>1</w:t>
+            </w:r>
+          </w:p>
+        </w:tc>
+        <w:tc>
+          <w:tcPr>
+            <w:tcW w:type="dxa" w:w="6192"/>
+          </w:tcPr>
+          <w:p>
+            <w:r/>
+            <w:r>
+              <w:rPr>
+                <w:sz w:val="19"/>
+              </w:rPr>
+              <w:t>Owns the information barrier with the PE business; reports to Group GC, not to the PM.</w:t>
+            </w:r>
+          </w:p>
+        </w:tc>
+      </w:tr>
+      <w:tr>
+        <w:tc>
+          <w:tcPr>
+            <w:tcW w:type="dxa" w:w="3024"/>
+            <w:shd w:fill="F2F4F8"/>
+          </w:tcPr>
+          <w:p>
+            <w:r/>
+            <w:r>
+              <w:rPr>
+                <w:sz w:val="19"/>
+              </w:rPr>
               <w:t>COO/IR (shared with platform)</w:t>
             </w:r>
           </w:p>
@@ -2581,6 +2590,7 @@
         <w:tc>
           <w:tcPr>
             <w:tcW w:type="dxa" w:w="576"/>
+            <w:shd w:fill="F2F4F8"/>
           </w:tcPr>
           <w:p>
             <w:r/>
@@ -2595,6 +2605,7 @@
         <w:tc>
           <w:tcPr>
             <w:tcW w:type="dxa" w:w="6192"/>
+            <w:shd w:fill="F2F4F8"/>
           </w:tcPr>
           <w:p>
             <w:r/>
@@ -2614,7 +2625,84 @@
         <w:pStyle w:val="Heading2"/>
       </w:pPr>
       <w:r>
-        <w:t>9.1 Governance &amp; conflicts framework (the make-or-break design issue)</w:t>
+        <w:t>9.1 Knut Nyman — Principal, US Situations &amp; Campaign Strategy</w:t>
+      </w:r>
+    </w:p>
+    <w:p>
+      <w:r>
+        <w:rPr>
+          <w:b w:val="0"/>
+          <w:i w:val="0"/>
+        </w:rPr>
+        <w:t>The US half of the mandate requires someone who has run the modern US activism playbook from inside the most effective practitioner of it. Knut Nyman joins from Elliott Investment Management as a founding member of the investment team, with the following mandate:</w:t>
+      </w:r>
+    </w:p>
+    <w:p>
+      <w:pPr>
+        <w:pStyle w:val="ListBullet"/>
+        <w:spacing w:after="80"/>
+      </w:pPr>
+      <w:r>
+        <w:rPr>
+          <w:b/>
+        </w:rPr>
+        <w:t xml:space="preserve">US idea generation and underwriting. </w:t>
+      </w:r>
+      <w:r>
+        <w:t>Owns the US screen (Section 6) and presents US situations to the Investment Committee; leads diligence on US names alongside the sector principals.</w:t>
+      </w:r>
+    </w:p>
+    <w:p>
+      <w:pPr>
+        <w:pStyle w:val="ListBullet"/>
+        <w:spacing w:after="80"/>
+      </w:pPr>
+      <w:r>
+        <w:rPr>
+          <w:b/>
+        </w:rPr>
+        <w:t xml:space="preserve">Campaign strategy. </w:t>
+      </w:r>
+      <w:r>
+        <w:t>Designs and runs the US engagement mechanics: 13D strategy and disclosure sequencing, universal-proxy slate construction, settlement negotiation, and coordination of proxy solicitors, banks, litigation counsel and communications advisors.</w:t>
+      </w:r>
+    </w:p>
+    <w:p>
+      <w:pPr>
+        <w:pStyle w:val="ListBullet"/>
+        <w:spacing w:after="80"/>
+      </w:pPr>
+      <w:r>
+        <w:rPr>
+          <w:b/>
+        </w:rPr>
+        <w:t xml:space="preserve">Bridge between regimes. </w:t>
+      </w:r>
+      <w:r>
+        <w:t>Translates the firm's constructive European model into US board dynamics — and brings US-style campaign rigour (precision materials, shareholder-base analytics, settlement optionality) to the European book.</w:t>
+      </w:r>
+    </w:p>
+    <w:p>
+      <w:pPr>
+        <w:pStyle w:val="ListBullet"/>
+        <w:spacing w:after="80"/>
+      </w:pPr>
+      <w:r>
+        <w:rPr>
+          <w:b/>
+        </w:rPr>
+        <w:t xml:space="preserve">Progression. </w:t>
+      </w:r>
+      <w:r>
+        <w:t>Co-leads one to two campaigns per year from launch, with campaign lead responsibility from the second fund year and a defined path to Partner; participates in management-company carry from day one.</w:t>
+      </w:r>
+    </w:p>
+    <w:p>
+      <w:pPr>
+        <w:pStyle w:val="Heading2"/>
+      </w:pPr>
+      <w:r>
+        <w:t>9.2 Governance &amp; conflicts framework (the make-or-break design issue)</w:t>
       </w:r>
     </w:p>
     <w:p>
@@ -2674,7 +2762,7 @@
         <w:t xml:space="preserve">Investment Committee: </w:t>
       </w:r>
       <w:r>
-        <w:t>Head of Engaged Equities, Deputy PM, one PE Partner (conflict-cleared per situation), Managing Partner ex-officio.</w:t>
+        <w:t>Head of Engaged Equities, Deputy PM, Principal — US Situations (for US names), one PE Partner (conflict-cleared per situation), Managing Partner ex-officio.</w:t>
       </w:r>
     </w:p>
     <w:p>
@@ -2876,7 +2964,7 @@
               <w:rPr>
                 <w:sz w:val="19"/>
               </w:rPr>
-              <w:t>Liquidity in SEK/NOK/DKK mid-caps</w:t>
+              <w:t>Liquidity in European mid-caps (SEK/NOK/DKK/EUR lines thinner than US)</w:t>
             </w:r>
           </w:p>
         </w:tc>
@@ -2891,7 +2979,7 @@
               <w:rPr>
                 <w:sz w:val="19"/>
               </w:rPr>
-              <w:t>Position sizing tied to ADV; evergreen structure with gates; co-invest sleeves absorb size; exits often via strategic events rather than market sales.</w:t>
+              <w:t>Position sizing tied to ADV; US names carry the larger tickets; evergreen structure with gates; co-invest sleeves absorb size; exits often via strategic events rather than market sales.</w:t>
             </w:r>
           </w:p>
         </w:tc>
@@ -3149,7 +3237,7 @@
               <w:rPr>
                 <w:sz w:val="19"/>
               </w:rPr>
-              <w:t>Head + Deputy hired; core team of 6; seed commitment EUR 150–200m closed; pipeline of 10–14 underwritten names; LP pre-marketing under existing relationships.</w:t>
+              <w:t>Head + Deputy hired; Knut Nyman and the New York pod on board; core team of 7; seed commitment EUR 150–200m closed; pipeline of 12–16 underwritten names; LP pre-marketing under existing relationships.</w:t>
             </w:r>
           </w:p>
         </w:tc>
@@ -3193,7 +3281,7 @@
               <w:rPr>
                 <w:sz w:val="19"/>
               </w:rPr>
-              <w:t>First close ~USD 750m; 2–3 positions accumulated against the Q3 2027 ownership snapshots that seat 2028 nomination committees.</w:t>
+              <w:t>First close ~USD 750m; 2–3 positions accumulated against the board calendar: Q3 2027 ownership snapshots for 2028 Nordic nomination committees, and US nomination windows for the 2028 proxy season.</w:t>
             </w:r>
           </w:p>
         </w:tc>
@@ -3240,7 +3328,7 @@
               <w:rPr>
                 <w:sz w:val="19"/>
               </w:rPr>
-              <w:t>Final close USD 1.5–2.0bn; 6–8 positions; first nomination-committee seats and director appointments at the 2028 AGM season; first realisation events 2029.</w:t>
+              <w:t>Final close USD 1.5–2.0bn; 6–8 positions across both regions; first nomination-committee seats, settlements and director appointments in the 2028 board cycles; first realisation events 2029.</w:t>
             </w:r>
           </w:p>
         </w:tc>

</xml_diff>

<commit_message>
Add precedents appendix: Cevian record, EQT Public Value, KKR-Henry Schein
Report Appendix A with ~21 Cevian campaigns and outcomes, the EQT
Public Value cautionary case (Storytel et al.), KKR-Henry Schein, and
Triton-Caverion; two matching appendix slides in the deck.

https://claude.ai/code/session_014wJkiGJDWLqynffcMLAwBq
</commit_message>
<xml_diff>
--- a/nordic-capital-activism-pitch/Nordic_Capital_Engaged_Equities_Pitch.docx
+++ b/nordic-capital-activism-pitch/Nordic_Capital_Engaged_Equities_Pitch.docx
@@ -3336,11 +3336,1551 @@
     </w:tbl>
     <w:p/>
     <w:p>
+      <w:r>
+        <w:br w:type="page"/>
+      </w:r>
+    </w:p>
+    <w:p>
       <w:pPr>
         <w:pStyle w:val="Heading1"/>
       </w:pPr>
       <w:r>
-        <w:t>Appendix: Disclaimer</w:t>
+        <w:t>Appendix A: Precedent Campaigns — The Evidence Base</w:t>
+      </w:r>
+    </w:p>
+    <w:p>
+      <w:r>
+        <w:rPr>
+          <w:b w:val="0"/>
+          <w:i w:val="0"/>
+        </w:rPr>
+        <w:t>Three bodies of precedent inform the design of this strategy: Cevian's two-decade record (the constructive model works, and its failure modes are identifiable), EQT Public Value (how a PE sponsor's public-markets entry fails without engagement mechanics), and KKR–Henry Schein (sponsor activism validated in the US, in our core sector). Outcomes and return indications below are based on public reporting and are approximate.</w:t>
+      </w:r>
+    </w:p>
+    <w:p>
+      <w:pPr>
+        <w:pStyle w:val="Heading2"/>
+      </w:pPr>
+      <w:r>
+        <w:t>A.1 Cevian Capital — the constructive model at scale</w:t>
+      </w:r>
+    </w:p>
+    <w:p>
+      <w:r>
+        <w:rPr>
+          <w:b w:val="0"/>
+          <w:i w:val="0"/>
+        </w:rPr>
+        <w:t>Founded 2002 (Gardell/Förberg, early backing from Carl Icahn); peak AUM ~EUR 15bn+; partners currently on nine boards in six countries; reported net returns in the low-to-mid teens annualised over the fund's life. Its disclosed campaign record:</w:t>
+      </w:r>
+    </w:p>
+    <w:tbl>
+      <w:tblPr>
+        <w:tblStyle w:val="TableGrid"/>
+        <w:tblW w:type="auto" w:w="0"/>
+        <w:jc w:val="center"/>
+        <w:tblLook w:firstColumn="1" w:firstRow="1" w:lastColumn="0" w:lastRow="0" w:noHBand="0" w:noVBand="1" w:val="04A0"/>
+      </w:tblPr>
+      <w:tblGrid>
+        <w:gridCol w:w="2160"/>
+        <w:gridCol w:w="2160"/>
+        <w:gridCol w:w="2160"/>
+        <w:gridCol w:w="2160"/>
+      </w:tblGrid>
+      <w:tr>
+        <w:tc>
+          <w:tcPr>
+            <w:tcW w:type="dxa" w:w="2160"/>
+            <w:shd w:fill="0B2545"/>
+          </w:tcPr>
+          <w:p>
+            <w:r/>
+            <w:r>
+              <w:rPr>
+                <w:b/>
+                <w:color w:val="FFFFFF"/>
+                <w:sz w:val="19"/>
+              </w:rPr>
+              <w:t>Company</w:t>
+            </w:r>
+          </w:p>
+        </w:tc>
+        <w:tc>
+          <w:tcPr>
+            <w:tcW w:type="dxa" w:w="1296"/>
+            <w:shd w:fill="0B2545"/>
+          </w:tcPr>
+          <w:p>
+            <w:r/>
+            <w:r>
+              <w:rPr>
+                <w:b/>
+                <w:color w:val="FFFFFF"/>
+                <w:sz w:val="19"/>
+              </w:rPr>
+              <w:t>Period</w:t>
+            </w:r>
+          </w:p>
+        </w:tc>
+        <w:tc>
+          <w:tcPr>
+            <w:tcW w:type="dxa" w:w="5184"/>
+            <w:shd w:fill="0B2545"/>
+          </w:tcPr>
+          <w:p>
+            <w:r/>
+            <w:r>
+              <w:rPr>
+                <w:b/>
+                <w:color w:val="FFFFFF"/>
+                <w:sz w:val="19"/>
+              </w:rPr>
+              <w:t>Campaign &amp; outcome</w:t>
+            </w:r>
+          </w:p>
+        </w:tc>
+        <w:tc>
+          <w:tcPr>
+            <w:tcW w:type="dxa" w:w="1152"/>
+            <w:shd w:fill="0B2545"/>
+          </w:tcPr>
+          <w:p>
+            <w:r/>
+            <w:r>
+              <w:rPr>
+                <w:b/>
+                <w:color w:val="FFFFFF"/>
+                <w:sz w:val="19"/>
+              </w:rPr>
+              <w:t>Result</w:t>
+            </w:r>
+          </w:p>
+        </w:tc>
+      </w:tr>
+      <w:tr>
+        <w:tc>
+          <w:tcPr>
+            <w:tcW w:type="dxa" w:w="2160"/>
+          </w:tcPr>
+          <w:p>
+            <w:r/>
+            <w:r>
+              <w:rPr>
+                <w:sz w:val="19"/>
+              </w:rPr>
+              <w:t>Skandia (SE)</w:t>
+            </w:r>
+          </w:p>
+        </w:tc>
+        <w:tc>
+          <w:tcPr>
+            <w:tcW w:type="dxa" w:w="1296"/>
+          </w:tcPr>
+          <w:p>
+            <w:r/>
+            <w:r>
+              <w:rPr>
+                <w:sz w:val="19"/>
+              </w:rPr>
+              <w:t>2002–06</w:t>
+            </w:r>
+          </w:p>
+        </w:tc>
+        <w:tc>
+          <w:tcPr>
+            <w:tcW w:type="dxa" w:w="5184"/>
+          </w:tcPr>
+          <w:p>
+            <w:r/>
+            <w:r>
+              <w:rPr>
+                <w:sz w:val="19"/>
+              </w:rPr>
+              <w:t>Governance overhaul, pushed sale; acquired by Old Mutual 2006.</w:t>
+            </w:r>
+          </w:p>
+        </w:tc>
+        <w:tc>
+          <w:tcPr>
+            <w:tcW w:type="dxa" w:w="1152"/>
+          </w:tcPr>
+          <w:p>
+            <w:r/>
+            <w:r>
+              <w:rPr>
+                <w:sz w:val="19"/>
+              </w:rPr>
+              <w:t>Win</w:t>
+            </w:r>
+          </w:p>
+        </w:tc>
+      </w:tr>
+      <w:tr>
+        <w:tc>
+          <w:tcPr>
+            <w:tcW w:type="dxa" w:w="2160"/>
+            <w:shd w:fill="F2F4F8"/>
+          </w:tcPr>
+          <w:p>
+            <w:r/>
+            <w:r>
+              <w:rPr>
+                <w:sz w:val="19"/>
+              </w:rPr>
+              <w:t>Volvo Group (SE)</w:t>
+            </w:r>
+          </w:p>
+        </w:tc>
+        <w:tc>
+          <w:tcPr>
+            <w:tcW w:type="dxa" w:w="1296"/>
+            <w:shd w:fill="F2F4F8"/>
+          </w:tcPr>
+          <w:p>
+            <w:r/>
+            <w:r>
+              <w:rPr>
+                <w:sz w:val="19"/>
+              </w:rPr>
+              <w:t>2006–17</w:t>
+            </w:r>
+          </w:p>
+        </w:tc>
+        <w:tc>
+          <w:tcPr>
+            <w:tcW w:type="dxa" w:w="5184"/>
+            <w:shd w:fill="F2F4F8"/>
+          </w:tcPr>
+          <w:p>
+            <w:r/>
+            <w:r>
+              <w:rPr>
+                <w:sz w:val="19"/>
+              </w:rPr>
+              <w:t>Portfolio focus (Aero disposal), cost discipline, governance; 8.2% stake sold to Geely 2017 for ~USD 3.9bn — reported among its most profitable positions.</w:t>
+            </w:r>
+          </w:p>
+        </w:tc>
+        <w:tc>
+          <w:tcPr>
+            <w:tcW w:type="dxa" w:w="1152"/>
+            <w:shd w:fill="F2F4F8"/>
+          </w:tcPr>
+          <w:p>
+            <w:r/>
+            <w:r>
+              <w:rPr>
+                <w:sz w:val="19"/>
+              </w:rPr>
+              <w:t>Win</w:t>
+            </w:r>
+          </w:p>
+        </w:tc>
+      </w:tr>
+      <w:tr>
+        <w:tc>
+          <w:tcPr>
+            <w:tcW w:type="dxa" w:w="2160"/>
+          </w:tcPr>
+          <w:p>
+            <w:r/>
+            <w:r>
+              <w:rPr>
+                <w:sz w:val="19"/>
+              </w:rPr>
+              <w:t>Tieto (FI)</w:t>
+            </w:r>
+          </w:p>
+        </w:tc>
+        <w:tc>
+          <w:tcPr>
+            <w:tcW w:type="dxa" w:w="1296"/>
+          </w:tcPr>
+          <w:p>
+            <w:r/>
+            <w:r>
+              <w:rPr>
+                <w:sz w:val="19"/>
+              </w:rPr>
+              <w:t>2009–c.17</w:t>
+            </w:r>
+          </w:p>
+        </w:tc>
+        <w:tc>
+          <w:tcPr>
+            <w:tcW w:type="dxa" w:w="5184"/>
+          </w:tcPr>
+          <w:p>
+            <w:r/>
+            <w:r>
+              <w:rPr>
+                <w:sz w:val="19"/>
+              </w:rPr>
+              <w:t>Board seat, restructuring and focus; steady re-rating plus dividends.</w:t>
+            </w:r>
+          </w:p>
+        </w:tc>
+        <w:tc>
+          <w:tcPr>
+            <w:tcW w:type="dxa" w:w="1152"/>
+          </w:tcPr>
+          <w:p>
+            <w:r/>
+            <w:r>
+              <w:rPr>
+                <w:sz w:val="19"/>
+              </w:rPr>
+              <w:t>Modest win</w:t>
+            </w:r>
+          </w:p>
+        </w:tc>
+      </w:tr>
+      <w:tr>
+        <w:tc>
+          <w:tcPr>
+            <w:tcW w:type="dxa" w:w="2160"/>
+            <w:shd w:fill="F2F4F8"/>
+          </w:tcPr>
+          <w:p>
+            <w:r/>
+            <w:r>
+              <w:rPr>
+                <w:sz w:val="19"/>
+              </w:rPr>
+              <w:t>Danske Bank (DK)</w:t>
+            </w:r>
+          </w:p>
+        </w:tc>
+        <w:tc>
+          <w:tcPr>
+            <w:tcW w:type="dxa" w:w="1296"/>
+            <w:shd w:fill="F2F4F8"/>
+          </w:tcPr>
+          <w:p>
+            <w:r/>
+            <w:r>
+              <w:rPr>
+                <w:sz w:val="19"/>
+              </w:rPr>
+              <w:t>2011–c.15</w:t>
+            </w:r>
+          </w:p>
+        </w:tc>
+        <w:tc>
+          <w:tcPr>
+            <w:tcW w:type="dxa" w:w="5184"/>
+            <w:shd w:fill="F2F4F8"/>
+          </w:tcPr>
+          <w:p>
+            <w:r/>
+            <w:r>
+              <w:rPr>
+                <w:sz w:val="19"/>
+              </w:rPr>
+              <w:t>Post-crisis efficiency and capital agenda; stock recovered strongly into exit.</w:t>
+            </w:r>
+          </w:p>
+        </w:tc>
+        <w:tc>
+          <w:tcPr>
+            <w:tcW w:type="dxa" w:w="1152"/>
+            <w:shd w:fill="F2F4F8"/>
+          </w:tcPr>
+          <w:p>
+            <w:r/>
+            <w:r>
+              <w:rPr>
+                <w:sz w:val="19"/>
+              </w:rPr>
+              <w:t>Win</w:t>
+            </w:r>
+          </w:p>
+        </w:tc>
+      </w:tr>
+      <w:tr>
+        <w:tc>
+          <w:tcPr>
+            <w:tcW w:type="dxa" w:w="2160"/>
+          </w:tcPr>
+          <w:p>
+            <w:r/>
+            <w:r>
+              <w:rPr>
+                <w:sz w:val="19"/>
+              </w:rPr>
+              <w:t>Cookson / Vesuvius &amp; Alent (UK)</w:t>
+            </w:r>
+          </w:p>
+        </w:tc>
+        <w:tc>
+          <w:tcPr>
+            <w:tcW w:type="dxa" w:w="1296"/>
+          </w:tcPr>
+          <w:p>
+            <w:r/>
+            <w:r>
+              <w:rPr>
+                <w:sz w:val="19"/>
+              </w:rPr>
+              <w:t>2011–c.16</w:t>
+            </w:r>
+          </w:p>
+        </w:tc>
+        <w:tc>
+          <w:tcPr>
+            <w:tcW w:type="dxa" w:w="5184"/>
+          </w:tcPr>
+          <w:p>
+            <w:r/>
+            <w:r>
+              <w:rPr>
+                <w:sz w:val="19"/>
+              </w:rPr>
+              <w:t>Drove the 2012 demerger; Alent acquired by Platform Specialty 2015 at a premium; Vesuvius board seat.</w:t>
+            </w:r>
+          </w:p>
+        </w:tc>
+        <w:tc>
+          <w:tcPr>
+            <w:tcW w:type="dxa" w:w="1152"/>
+          </w:tcPr>
+          <w:p>
+            <w:r/>
+            <w:r>
+              <w:rPr>
+                <w:sz w:val="19"/>
+              </w:rPr>
+              <w:t>Win</w:t>
+            </w:r>
+          </w:p>
+        </w:tc>
+      </w:tr>
+      <w:tr>
+        <w:tc>
+          <w:tcPr>
+            <w:tcW w:type="dxa" w:w="2160"/>
+            <w:shd w:fill="F2F4F8"/>
+          </w:tcPr>
+          <w:p>
+            <w:r/>
+            <w:r>
+              <w:rPr>
+                <w:sz w:val="19"/>
+              </w:rPr>
+              <w:t>Bilfinger (DE)</w:t>
+            </w:r>
+          </w:p>
+        </w:tc>
+        <w:tc>
+          <w:tcPr>
+            <w:tcW w:type="dxa" w:w="1296"/>
+            <w:shd w:fill="F2F4F8"/>
+          </w:tcPr>
+          <w:p>
+            <w:r/>
+            <w:r>
+              <w:rPr>
+                <w:sz w:val="19"/>
+              </w:rPr>
+              <w:t>2011–c.20</w:t>
+            </w:r>
+          </w:p>
+        </w:tc>
+        <w:tc>
+          <w:tcPr>
+            <w:tcW w:type="dxa" w:w="5184"/>
+            <w:shd w:fill="F2F4F8"/>
+          </w:tcPr>
+          <w:p>
+            <w:r/>
+            <w:r>
+              <w:rPr>
+                <w:sz w:val="19"/>
+              </w:rPr>
+              <w:t>Services transformation; instead repeated profit warnings and CEO churn; roughly a decade for little value.</w:t>
+            </w:r>
+          </w:p>
+        </w:tc>
+        <w:tc>
+          <w:tcPr>
+            <w:tcW w:type="dxa" w:w="1152"/>
+            <w:shd w:fill="F2F4F8"/>
+          </w:tcPr>
+          <w:p>
+            <w:r/>
+            <w:r>
+              <w:rPr>
+                <w:sz w:val="19"/>
+              </w:rPr>
+              <w:t>Failure</w:t>
+            </w:r>
+          </w:p>
+        </w:tc>
+      </w:tr>
+      <w:tr>
+        <w:tc>
+          <w:tcPr>
+            <w:tcW w:type="dxa" w:w="2160"/>
+          </w:tcPr>
+          <w:p>
+            <w:r/>
+            <w:r>
+              <w:rPr>
+                <w:sz w:val="19"/>
+              </w:rPr>
+              <w:t>ThyssenKrupp (DE)</w:t>
+            </w:r>
+          </w:p>
+        </w:tc>
+        <w:tc>
+          <w:tcPr>
+            <w:tcW w:type="dxa" w:w="1296"/>
+          </w:tcPr>
+          <w:p>
+            <w:r/>
+            <w:r>
+              <w:rPr>
+                <w:sz w:val="19"/>
+              </w:rPr>
+              <w:t>2013–c.22</w:t>
+            </w:r>
+          </w:p>
+        </w:tc>
+        <w:tc>
+          <w:tcPr>
+            <w:tcW w:type="dxa" w:w="5184"/>
+          </w:tcPr>
+          <w:p>
+            <w:r/>
+            <w:r>
+              <w:rPr>
+                <w:sz w:val="19"/>
+              </w:rPr>
+              <w:t>18% stake; conglomerate break-up thesis. Elevator sale (EUR 17.2bn, 2020) vindicated the SOTP, but balance-sheet fragility and stakeholder politics destroyed equity value en route; exited at a significant reported loss.</w:t>
+            </w:r>
+          </w:p>
+        </w:tc>
+        <w:tc>
+          <w:tcPr>
+            <w:tcW w:type="dxa" w:w="1152"/>
+          </w:tcPr>
+          <w:p>
+            <w:r/>
+            <w:r>
+              <w:rPr>
+                <w:sz w:val="19"/>
+              </w:rPr>
+              <w:t>Failure</w:t>
+            </w:r>
+          </w:p>
+        </w:tc>
+      </w:tr>
+      <w:tr>
+        <w:tc>
+          <w:tcPr>
+            <w:tcW w:type="dxa" w:w="2160"/>
+            <w:shd w:fill="F2F4F8"/>
+          </w:tcPr>
+          <w:p>
+            <w:r/>
+            <w:r>
+              <w:rPr>
+                <w:sz w:val="19"/>
+              </w:rPr>
+              <w:t>RSA Insurance (UK)</w:t>
+            </w:r>
+          </w:p>
+        </w:tc>
+        <w:tc>
+          <w:tcPr>
+            <w:tcW w:type="dxa" w:w="1296"/>
+            <w:shd w:fill="F2F4F8"/>
+          </w:tcPr>
+          <w:p>
+            <w:r/>
+            <w:r>
+              <w:rPr>
+                <w:sz w:val="19"/>
+              </w:rPr>
+              <w:t>2013–21</w:t>
+            </w:r>
+          </w:p>
+        </w:tc>
+        <w:tc>
+          <w:tcPr>
+            <w:tcW w:type="dxa" w:w="5184"/>
+            <w:shd w:fill="F2F4F8"/>
+          </w:tcPr>
+          <w:p>
+            <w:r/>
+            <w:r>
+              <w:rPr>
+                <w:sz w:val="19"/>
+              </w:rPr>
+              <w:t>Focus, disposals, capital discipline, then sale advocacy; Intact/Tryg takeover 2021 at ~50% premium.</w:t>
+            </w:r>
+          </w:p>
+        </w:tc>
+        <w:tc>
+          <w:tcPr>
+            <w:tcW w:type="dxa" w:w="1152"/>
+            <w:shd w:fill="F2F4F8"/>
+          </w:tcPr>
+          <w:p>
+            <w:r/>
+            <w:r>
+              <w:rPr>
+                <w:sz w:val="19"/>
+              </w:rPr>
+              <w:t>Win</w:t>
+            </w:r>
+          </w:p>
+        </w:tc>
+      </w:tr>
+      <w:tr>
+        <w:tc>
+          <w:tcPr>
+            <w:tcW w:type="dxa" w:w="2160"/>
+          </w:tcPr>
+          <w:p>
+            <w:r/>
+            <w:r>
+              <w:rPr>
+                <w:sz w:val="19"/>
+              </w:rPr>
+              <w:t>Metso (FI)</w:t>
+            </w:r>
+          </w:p>
+        </w:tc>
+        <w:tc>
+          <w:tcPr>
+            <w:tcW w:type="dxa" w:w="1296"/>
+          </w:tcPr>
+          <w:p>
+            <w:r/>
+            <w:r>
+              <w:rPr>
+                <w:sz w:val="19"/>
+              </w:rPr>
+              <w:t>2013–20</w:t>
+            </w:r>
+          </w:p>
+        </w:tc>
+        <w:tc>
+          <w:tcPr>
+            <w:tcW w:type="dxa" w:w="5184"/>
+          </w:tcPr>
+          <w:p>
+            <w:r/>
+            <w:r>
+              <w:rPr>
+                <w:sz w:val="19"/>
+              </w:rPr>
+              <w:t>Supported Valmet demerger, then Metso Outotec merger and Neles separation.</w:t>
+            </w:r>
+          </w:p>
+        </w:tc>
+        <w:tc>
+          <w:tcPr>
+            <w:tcW w:type="dxa" w:w="1152"/>
+          </w:tcPr>
+          <w:p>
+            <w:r/>
+            <w:r>
+              <w:rPr>
+                <w:sz w:val="19"/>
+              </w:rPr>
+              <w:t>Win</w:t>
+            </w:r>
+          </w:p>
+        </w:tc>
+      </w:tr>
+      <w:tr>
+        <w:tc>
+          <w:tcPr>
+            <w:tcW w:type="dxa" w:w="2160"/>
+            <w:shd w:fill="F2F4F8"/>
+          </w:tcPr>
+          <w:p>
+            <w:r/>
+            <w:r>
+              <w:rPr>
+                <w:sz w:val="19"/>
+              </w:rPr>
+              <w:t>ABB (CH/SE)</w:t>
+            </w:r>
+          </w:p>
+        </w:tc>
+        <w:tc>
+          <w:tcPr>
+            <w:tcW w:type="dxa" w:w="1296"/>
+            <w:shd w:fill="F2F4F8"/>
+          </w:tcPr>
+          <w:p>
+            <w:r/>
+            <w:r>
+              <w:rPr>
+                <w:sz w:val="19"/>
+              </w:rPr>
+              <w:t>2015–c.22</w:t>
+            </w:r>
+          </w:p>
+        </w:tc>
+        <w:tc>
+          <w:tcPr>
+            <w:tcW w:type="dxa" w:w="5184"/>
+            <w:shd w:fill="F2F4F8"/>
+          </w:tcPr>
+          <w:p>
+            <w:r/>
+            <w:r>
+              <w:rPr>
+                <w:sz w:val="19"/>
+              </w:rPr>
+              <w:t>Power Grids exit (sold to Hitachi 2020), decentralisation, buybacks, leadership change; long hold, solid re-rating.</w:t>
+            </w:r>
+          </w:p>
+        </w:tc>
+        <w:tc>
+          <w:tcPr>
+            <w:tcW w:type="dxa" w:w="1152"/>
+            <w:shd w:fill="F2F4F8"/>
+          </w:tcPr>
+          <w:p>
+            <w:r/>
+            <w:r>
+              <w:rPr>
+                <w:sz w:val="19"/>
+              </w:rPr>
+              <w:t>Win (slow)</w:t>
+            </w:r>
+          </w:p>
+        </w:tc>
+      </w:tr>
+      <w:tr>
+        <w:tc>
+          <w:tcPr>
+            <w:tcW w:type="dxa" w:w="2160"/>
+          </w:tcPr>
+          <w:p>
+            <w:r/>
+            <w:r>
+              <w:rPr>
+                <w:sz w:val="19"/>
+              </w:rPr>
+              <w:t>Wolseley / Ferguson (UK→US)</w:t>
+            </w:r>
+          </w:p>
+        </w:tc>
+        <w:tc>
+          <w:tcPr>
+            <w:tcW w:type="dxa" w:w="1296"/>
+          </w:tcPr>
+          <w:p>
+            <w:r/>
+            <w:r>
+              <w:rPr>
+                <w:sz w:val="19"/>
+              </w:rPr>
+              <w:t>2016–c.21</w:t>
+            </w:r>
+          </w:p>
+        </w:tc>
+        <w:tc>
+          <w:tcPr>
+            <w:tcW w:type="dxa" w:w="5184"/>
+          </w:tcPr>
+          <w:p>
+            <w:r/>
+            <w:r>
+              <w:rPr>
+                <w:sz w:val="19"/>
+              </w:rPr>
+              <w:t>US focus, name change, listing migration to NYSE; strong re-rating.</w:t>
+            </w:r>
+          </w:p>
+        </w:tc>
+        <w:tc>
+          <w:tcPr>
+            <w:tcW w:type="dxa" w:w="1152"/>
+          </w:tcPr>
+          <w:p>
+            <w:r/>
+            <w:r>
+              <w:rPr>
+                <w:sz w:val="19"/>
+              </w:rPr>
+              <w:t>Win</w:t>
+            </w:r>
+          </w:p>
+        </w:tc>
+      </w:tr>
+      <w:tr>
+        <w:tc>
+          <w:tcPr>
+            <w:tcW w:type="dxa" w:w="2160"/>
+            <w:shd w:fill="F2F4F8"/>
+          </w:tcPr>
+          <w:p>
+            <w:r/>
+            <w:r>
+              <w:rPr>
+                <w:sz w:val="19"/>
+              </w:rPr>
+              <w:t>Autoliv (SE)</w:t>
+            </w:r>
+          </w:p>
+        </w:tc>
+        <w:tc>
+          <w:tcPr>
+            <w:tcW w:type="dxa" w:w="1296"/>
+            <w:shd w:fill="F2F4F8"/>
+          </w:tcPr>
+          <w:p>
+            <w:r/>
+            <w:r>
+              <w:rPr>
+                <w:sz w:val="19"/>
+              </w:rPr>
+              <w:t>2017–c.21</w:t>
+            </w:r>
+          </w:p>
+        </w:tc>
+        <w:tc>
+          <w:tcPr>
+            <w:tcW w:type="dxa" w:w="5184"/>
+            <w:shd w:fill="F2F4F8"/>
+          </w:tcPr>
+          <w:p>
+            <w:r/>
+            <w:r>
+              <w:rPr>
+                <w:sz w:val="19"/>
+              </w:rPr>
+              <w:t>Supported the Veoneer spin (2018); Veoneer acquired 2021 at a large premium.</w:t>
+            </w:r>
+          </w:p>
+        </w:tc>
+        <w:tc>
+          <w:tcPr>
+            <w:tcW w:type="dxa" w:w="1152"/>
+            <w:shd w:fill="F2F4F8"/>
+          </w:tcPr>
+          <w:p>
+            <w:r/>
+            <w:r>
+              <w:rPr>
+                <w:sz w:val="19"/>
+              </w:rPr>
+              <w:t>Win</w:t>
+            </w:r>
+          </w:p>
+        </w:tc>
+      </w:tr>
+      <w:tr>
+        <w:tc>
+          <w:tcPr>
+            <w:tcW w:type="dxa" w:w="2160"/>
+          </w:tcPr>
+          <w:p>
+            <w:r/>
+            <w:r>
+              <w:rPr>
+                <w:sz w:val="19"/>
+              </w:rPr>
+              <w:t>Ericsson (SE)</w:t>
+            </w:r>
+          </w:p>
+        </w:tc>
+        <w:tc>
+          <w:tcPr>
+            <w:tcW w:type="dxa" w:w="1296"/>
+          </w:tcPr>
+          <w:p>
+            <w:r/>
+            <w:r>
+              <w:rPr>
+                <w:sz w:val="19"/>
+              </w:rPr>
+              <w:t>2017–c.23</w:t>
+            </w:r>
+          </w:p>
+        </w:tc>
+        <w:tc>
+          <w:tcPr>
+            <w:tcW w:type="dxa" w:w="5184"/>
+          </w:tcPr>
+          <w:p>
+            <w:r/>
+            <w:r>
+              <w:rPr>
+                <w:sz w:val="19"/>
+              </w:rPr>
+              <w:t>Chair change (Leten), cost and portfolio focus; stock roughly doubled into 2021, then compliance issues gave much back; reported net positive but bumpy.</w:t>
+            </w:r>
+          </w:p>
+        </w:tc>
+        <w:tc>
+          <w:tcPr>
+            <w:tcW w:type="dxa" w:w="1152"/>
+          </w:tcPr>
+          <w:p>
+            <w:r/>
+            <w:r>
+              <w:rPr>
+                <w:sz w:val="19"/>
+              </w:rPr>
+              <w:t>Mixed+</w:t>
+            </w:r>
+          </w:p>
+        </w:tc>
+      </w:tr>
+      <w:tr>
+        <w:tc>
+          <w:tcPr>
+            <w:tcW w:type="dxa" w:w="2160"/>
+            <w:shd w:fill="F2F4F8"/>
+          </w:tcPr>
+          <w:p>
+            <w:r/>
+            <w:r>
+              <w:rPr>
+                <w:sz w:val="19"/>
+              </w:rPr>
+              <w:t>Panalpina (CH)</w:t>
+            </w:r>
+          </w:p>
+        </w:tc>
+        <w:tc>
+          <w:tcPr>
+            <w:tcW w:type="dxa" w:w="1296"/>
+            <w:shd w:fill="F2F4F8"/>
+          </w:tcPr>
+          <w:p>
+            <w:r/>
+            <w:r>
+              <w:rPr>
+                <w:sz w:val="19"/>
+              </w:rPr>
+              <w:t>2018–19</w:t>
+            </w:r>
+          </w:p>
+        </w:tc>
+        <w:tc>
+          <w:tcPr>
+            <w:tcW w:type="dxa" w:w="5184"/>
+            <w:shd w:fill="F2F4F8"/>
+          </w:tcPr>
+          <w:p>
+            <w:r/>
+            <w:r>
+              <w:rPr>
+                <w:sz w:val="19"/>
+              </w:rPr>
+              <w:t>~12%; pushed sale; DSV all-share takeover 2019 at a substantial premium within ~18 months.</w:t>
+            </w:r>
+          </w:p>
+        </w:tc>
+        <w:tc>
+          <w:tcPr>
+            <w:tcW w:type="dxa" w:w="1152"/>
+            <w:shd w:fill="F2F4F8"/>
+          </w:tcPr>
+          <w:p>
+            <w:r/>
+            <w:r>
+              <w:rPr>
+                <w:sz w:val="19"/>
+              </w:rPr>
+              <w:t>Win (fast)</w:t>
+            </w:r>
+          </w:p>
+        </w:tc>
+      </w:tr>
+      <w:tr>
+        <w:tc>
+          <w:tcPr>
+            <w:tcW w:type="dxa" w:w="2160"/>
+          </w:tcPr>
+          <w:p>
+            <w:r/>
+            <w:r>
+              <w:rPr>
+                <w:sz w:val="19"/>
+              </w:rPr>
+              <w:t>Nordea (FI/SE)</w:t>
+            </w:r>
+          </w:p>
+        </w:tc>
+        <w:tc>
+          <w:tcPr>
+            <w:tcW w:type="dxa" w:w="1296"/>
+          </w:tcPr>
+          <w:p>
+            <w:r/>
+            <w:r>
+              <w:rPr>
+                <w:sz w:val="19"/>
+              </w:rPr>
+              <w:t>2019–c.24</w:t>
+            </w:r>
+          </w:p>
+        </w:tc>
+        <w:tc>
+          <w:tcPr>
+            <w:tcW w:type="dxa" w:w="5184"/>
+          </w:tcPr>
+          <w:p>
+            <w:r/>
+            <w:r>
+              <w:rPr>
+                <w:sz w:val="19"/>
+              </w:rPr>
+              <w:t>Cost discipline and capital returns; large buybacks and re-rating followed.</w:t>
+            </w:r>
+          </w:p>
+        </w:tc>
+        <w:tc>
+          <w:tcPr>
+            <w:tcW w:type="dxa" w:w="1152"/>
+          </w:tcPr>
+          <w:p>
+            <w:r/>
+            <w:r>
+              <w:rPr>
+                <w:sz w:val="19"/>
+              </w:rPr>
+              <w:t>Win</w:t>
+            </w:r>
+          </w:p>
+        </w:tc>
+      </w:tr>
+      <w:tr>
+        <w:tc>
+          <w:tcPr>
+            <w:tcW w:type="dxa" w:w="2160"/>
+            <w:shd w:fill="F2F4F8"/>
+          </w:tcPr>
+          <w:p>
+            <w:r/>
+            <w:r>
+              <w:rPr>
+                <w:sz w:val="19"/>
+              </w:rPr>
+              <w:t>Pearson (UK)</w:t>
+            </w:r>
+          </w:p>
+        </w:tc>
+        <w:tc>
+          <w:tcPr>
+            <w:tcW w:type="dxa" w:w="1296"/>
+            <w:shd w:fill="F2F4F8"/>
+          </w:tcPr>
+          <w:p>
+            <w:r/>
+            <w:r>
+              <w:rPr>
+                <w:sz w:val="19"/>
+              </w:rPr>
+              <w:t>2020–c.23</w:t>
+            </w:r>
+          </w:p>
+        </w:tc>
+        <w:tc>
+          <w:tcPr>
+            <w:tcW w:type="dxa" w:w="5184"/>
+            <w:shd w:fill="F2F4F8"/>
+          </w:tcPr>
+          <w:p>
+            <w:r/>
+            <w:r>
+              <w:rPr>
+                <w:sz w:val="19"/>
+              </w:rPr>
+              <w:t>Backed digital turnaround; re-rated under new CEO; Apollo approaches (2022) rejected above-market.</w:t>
+            </w:r>
+          </w:p>
+        </w:tc>
+        <w:tc>
+          <w:tcPr>
+            <w:tcW w:type="dxa" w:w="1152"/>
+            <w:shd w:fill="F2F4F8"/>
+          </w:tcPr>
+          <w:p>
+            <w:r/>
+            <w:r>
+              <w:rPr>
+                <w:sz w:val="19"/>
+              </w:rPr>
+              <w:t>Modest win</w:t>
+            </w:r>
+          </w:p>
+        </w:tc>
+      </w:tr>
+      <w:tr>
+        <w:tc>
+          <w:tcPr>
+            <w:tcW w:type="dxa" w:w="2160"/>
+          </w:tcPr>
+          <w:p>
+            <w:r/>
+            <w:r>
+              <w:rPr>
+                <w:sz w:val="19"/>
+              </w:rPr>
+              <w:t>Vodafone (UK)</w:t>
+            </w:r>
+          </w:p>
+        </w:tc>
+        <w:tc>
+          <w:tcPr>
+            <w:tcW w:type="dxa" w:w="1296"/>
+          </w:tcPr>
+          <w:p>
+            <w:r/>
+            <w:r>
+              <w:rPr>
+                <w:sz w:val="19"/>
+              </w:rPr>
+              <w:t>2021–c.23</w:t>
+            </w:r>
+          </w:p>
+        </w:tc>
+        <w:tc>
+          <w:tcPr>
+            <w:tcW w:type="dxa" w:w="5184"/>
+          </w:tcPr>
+          <w:p>
+            <w:r/>
+            <w:r>
+              <w:rPr>
+                <w:sz w:val="19"/>
+              </w:rPr>
+              <w:t>Consolidation and portfolio agenda; change came too slowly; reported exit around flat-to-negative.</w:t>
+            </w:r>
+          </w:p>
+        </w:tc>
+        <w:tc>
+          <w:tcPr>
+            <w:tcW w:type="dxa" w:w="1152"/>
+          </w:tcPr>
+          <w:p>
+            <w:r/>
+            <w:r>
+              <w:rPr>
+                <w:sz w:val="19"/>
+              </w:rPr>
+              <w:t>Failure</w:t>
+            </w:r>
+          </w:p>
+        </w:tc>
+      </w:tr>
+      <w:tr>
+        <w:tc>
+          <w:tcPr>
+            <w:tcW w:type="dxa" w:w="2160"/>
+            <w:shd w:fill="F2F4F8"/>
+          </w:tcPr>
+          <w:p>
+            <w:r/>
+            <w:r>
+              <w:rPr>
+                <w:sz w:val="19"/>
+              </w:rPr>
+              <w:t>Aviva (UK)</w:t>
+            </w:r>
+          </w:p>
+        </w:tc>
+        <w:tc>
+          <w:tcPr>
+            <w:tcW w:type="dxa" w:w="1296"/>
+            <w:shd w:fill="F2F4F8"/>
+          </w:tcPr>
+          <w:p>
+            <w:r/>
+            <w:r>
+              <w:rPr>
+                <w:sz w:val="19"/>
+              </w:rPr>
+              <w:t>2021–c.24</w:t>
+            </w:r>
+          </w:p>
+        </w:tc>
+        <w:tc>
+          <w:tcPr>
+            <w:tcW w:type="dxa" w:w="5184"/>
+            <w:shd w:fill="F2F4F8"/>
+          </w:tcPr>
+          <w:p>
+            <w:r/>
+            <w:r>
+              <w:rPr>
+                <w:sz w:val="19"/>
+              </w:rPr>
+              <w:t>Demanded ~GBP 5bn capital return and cost cuts; delivered, stock re-rated.</w:t>
+            </w:r>
+          </w:p>
+        </w:tc>
+        <w:tc>
+          <w:tcPr>
+            <w:tcW w:type="dxa" w:w="1152"/>
+            <w:shd w:fill="F2F4F8"/>
+          </w:tcPr>
+          <w:p>
+            <w:r/>
+            <w:r>
+              <w:rPr>
+                <w:sz w:val="19"/>
+              </w:rPr>
+              <w:t>Win</w:t>
+            </w:r>
+          </w:p>
+        </w:tc>
+      </w:tr>
+      <w:tr>
+        <w:tc>
+          <w:tcPr>
+            <w:tcW w:type="dxa" w:w="2160"/>
+          </w:tcPr>
+          <w:p>
+            <w:r/>
+            <w:r>
+              <w:rPr>
+                <w:sz w:val="19"/>
+              </w:rPr>
+              <w:t>UBS (CH)</w:t>
+            </w:r>
+          </w:p>
+        </w:tc>
+        <w:tc>
+          <w:tcPr>
+            <w:tcW w:type="dxa" w:w="1296"/>
+          </w:tcPr>
+          <w:p>
+            <w:r/>
+            <w:r>
+              <w:rPr>
+                <w:sz w:val="19"/>
+              </w:rPr>
+              <w:t>2023–25</w:t>
+            </w:r>
+          </w:p>
+        </w:tc>
+        <w:tc>
+          <w:tcPr>
+            <w:tcW w:type="dxa" w:w="5184"/>
+          </w:tcPr>
+          <w:p>
+            <w:r/>
+            <w:r>
+              <w:rPr>
+                <w:sz w:val="19"/>
+              </w:rPr>
+              <w:t>~1.3% re-rating bet after the Credit Suisse rescue; stock up sharply; reported ~2x on early tranches at 2025 sales.</w:t>
+            </w:r>
+          </w:p>
+        </w:tc>
+        <w:tc>
+          <w:tcPr>
+            <w:tcW w:type="dxa" w:w="1152"/>
+          </w:tcPr>
+          <w:p>
+            <w:r/>
+            <w:r>
+              <w:rPr>
+                <w:sz w:val="19"/>
+              </w:rPr>
+              <w:t>Win</w:t>
+            </w:r>
+          </w:p>
+        </w:tc>
+      </w:tr>
+      <w:tr>
+        <w:tc>
+          <w:tcPr>
+            <w:tcW w:type="dxa" w:w="2160"/>
+            <w:shd w:fill="F2F4F8"/>
+          </w:tcPr>
+          <w:p>
+            <w:r/>
+            <w:r>
+              <w:rPr>
+                <w:sz w:val="19"/>
+              </w:rPr>
+              <w:t>Baloise (CH)</w:t>
+            </w:r>
+          </w:p>
+        </w:tc>
+        <w:tc>
+          <w:tcPr>
+            <w:tcW w:type="dxa" w:w="1296"/>
+            <w:shd w:fill="F2F4F8"/>
+          </w:tcPr>
+          <w:p>
+            <w:r/>
+            <w:r>
+              <w:rPr>
+                <w:sz w:val="19"/>
+              </w:rPr>
+              <w:t>2023–25</w:t>
+            </w:r>
+          </w:p>
+        </w:tc>
+        <w:tc>
+          <w:tcPr>
+            <w:tcW w:type="dxa" w:w="5184"/>
+            <w:shd w:fill="F2F4F8"/>
+          </w:tcPr>
+          <w:p>
+            <w:r/>
+            <w:r>
+              <w:rPr>
+                <w:sz w:val="19"/>
+              </w:rPr>
+              <w:t>9.4%; strategy reset and removal of vote caps; Helvetia merger announced April 2025 (completed December 2025); Cevian sold to Patria at ~CHF 184 vs ~CHF 130 entry (~+40%).</w:t>
+            </w:r>
+          </w:p>
+        </w:tc>
+        <w:tc>
+          <w:tcPr>
+            <w:tcW w:type="dxa" w:w="1152"/>
+            <w:shd w:fill="F2F4F8"/>
+          </w:tcPr>
+          <w:p>
+            <w:r/>
+            <w:r>
+              <w:rPr>
+                <w:sz w:val="19"/>
+              </w:rPr>
+              <w:t>Win</w:t>
+            </w:r>
+          </w:p>
+        </w:tc>
+      </w:tr>
+      <w:tr>
+        <w:tc>
+          <w:tcPr>
+            <w:tcW w:type="dxa" w:w="2160"/>
+          </w:tcPr>
+          <w:p>
+            <w:r/>
+            <w:r>
+              <w:rPr>
+                <w:sz w:val="19"/>
+              </w:rPr>
+              <w:t>Smith+Nephew (UK)</w:t>
+            </w:r>
+          </w:p>
+        </w:tc>
+        <w:tc>
+          <w:tcPr>
+            <w:tcW w:type="dxa" w:w="1296"/>
+          </w:tcPr>
+          <w:p>
+            <w:r/>
+            <w:r>
+              <w:rPr>
+                <w:sz w:val="19"/>
+              </w:rPr>
+              <w:t>2024–</w:t>
+            </w:r>
+          </w:p>
+        </w:tc>
+        <w:tc>
+          <w:tcPr>
+            <w:tcW w:type="dxa" w:w="5184"/>
+          </w:tcPr>
+          <w:p>
+            <w:r/>
+            <w:r>
+              <w:rPr>
+                <w:sz w:val="19"/>
+              </w:rPr>
+              <w:t>~5%; margin recovery and structural options including a US listing review; shares up since disclosure.</w:t>
+            </w:r>
+          </w:p>
+        </w:tc>
+        <w:tc>
+          <w:tcPr>
+            <w:tcW w:type="dxa" w:w="1152"/>
+          </w:tcPr>
+          <w:p>
+            <w:r/>
+            <w:r>
+              <w:rPr>
+                <w:sz w:val="19"/>
+              </w:rPr>
+              <w:t>Ongoing</w:t>
+            </w:r>
+          </w:p>
+        </w:tc>
+      </w:tr>
+    </w:tbl>
+    <w:p/>
+    <w:p>
+      <w:r>
+        <w:rPr>
+          <w:b w:val="0"/>
+          <w:i/>
+        </w:rPr>
+        <w:t>Read-across: roughly three clear failures in ~20 disclosed campaigns, with the wins concentrated where a transaction or separation crystallised value (Skandia, RSA, Panalpina, Alent, Autoliv/Veoneer, Baloise) — supporting this strategy's M&amp;A-archetype weighting. The failures share a fingerprint our screens are built to exclude: fragile balance sheets, stakeholder/political complexity, and catalysts outside shareholders' control (ThyssenKrupp, Bilfinger, Vodafone).</w:t>
+      </w:r>
+    </w:p>
+    <w:p>
+      <w:pPr>
+        <w:pStyle w:val="Heading2"/>
+      </w:pPr>
+      <w:r>
+        <w:t>A.2 EQT Public Value — the cautionary precedent</w:t>
+      </w:r>
+    </w:p>
+    <w:p>
+      <w:pPr>
+        <w:pStyle w:val="ListBullet"/>
+        <w:spacing w:after="80"/>
+      </w:pPr>
+      <w:r>
+        <w:rPr>
+          <w:b/>
+        </w:rPr>
+        <w:t xml:space="preserve">What it was: </w:t>
+      </w:r>
+      <w:r>
+        <w:t>EQT's attempt to apply its toolbox to listed Nordic mid-caps, launched 2018–19. Disclosed holdings included Securitas, BHG Group, Storebrand, BioGaia, AFRY and Storytel — where it built ~10% in September 2021 and became the largest shareholder.</w:t>
+      </w:r>
+    </w:p>
+    <w:p>
+      <w:pPr>
+        <w:pStyle w:val="ListBullet"/>
+        <w:spacing w:after="80"/>
+      </w:pPr>
+      <w:r>
+        <w:rPr>
+          <w:b/>
+        </w:rPr>
+        <w:t xml:space="preserve">What happened: </w:t>
+      </w:r>
+      <w:r>
+        <w:t>Fundraising never reached scale, the strategy lacked a board-seat-driven engagement playbook and senior activist leadership, and the fund was ultimately liquidated — its entire Storytel holding sold in August 2024, after the 2021-vintage growth entry had been crushed in the 2022 de-rating.</w:t>
+      </w:r>
+    </w:p>
+    <w:p>
+      <w:pPr>
+        <w:pStyle w:val="ListBullet"/>
+        <w:spacing w:after="80"/>
+      </w:pPr>
+      <w:r>
+        <w:rPr>
+          <w:b/>
+        </w:rPr>
+        <w:t xml:space="preserve">Lessons designed into this proposal: </w:t>
+      </w:r>
+      <w:r>
+        <w:t>scale and seed from day one (EUR 150–200m GP commitment, USD 1.5bn target); a partner-level activist hire and US campaign leadership rather than PE generalists; stakes sized for influence (nomination committees / universal proxy), not passive minority positions; entry discipline anchored on ≥30% upside to intrinsic value, not growth momentum; and an evergreen structure so positions are never liquidated on a fund clock at the bottom.</w:t>
+      </w:r>
+    </w:p>
+    <w:p>
+      <w:pPr>
+        <w:pStyle w:val="Heading2"/>
+      </w:pPr>
+      <w:r>
+        <w:t>A.3 KKR – Henry Schein — sponsor activism validated</w:t>
+      </w:r>
+    </w:p>
+    <w:p>
+      <w:pPr>
+        <w:pStyle w:val="ListBullet"/>
+        <w:spacing w:after="80"/>
+      </w:pPr>
+      <w:r>
+        <w:rPr>
+          <w:b/>
+        </w:rPr>
+        <w:t xml:space="preserve">Set-up: </w:t>
+      </w:r>
+      <w:r>
+        <w:t>Ananym Capital ran a conventional activist campaign in late 2024 (board refresh, cost cuts, succession, portfolio review) at the US dental/medical distributor.</w:t>
+      </w:r>
+    </w:p>
+    <w:p>
+      <w:pPr>
+        <w:pStyle w:val="ListBullet"/>
+        <w:spacing w:after="80"/>
+      </w:pPr>
+      <w:r>
+        <w:rPr>
+          <w:b/>
+        </w:rPr>
+        <w:t xml:space="preserve">Sponsor entry: </w:t>
+      </w:r>
+      <w:r>
+        <w:t>In January 2025 Henry Schein announced a USD 250m strategic investment from KKR with two board seats (Dan Daniel, ex-Danaher; Max Lin, KKR Healthcare); completed May 2025 with KKR at ~12% — the largest non-index holder, with permission to build to 14.9%.</w:t>
+      </w:r>
+    </w:p>
+    <w:p>
+      <w:pPr>
+        <w:pStyle w:val="ListBullet"/>
+        <w:spacing w:after="80"/>
+      </w:pPr>
+      <w:r>
+        <w:rPr>
+          <w:b/>
+        </w:rPr>
+        <w:t xml:space="preserve">Read-across: </w:t>
+      </w:r>
+      <w:r>
+        <w:t>a PE sponsor converted a modest minority stake into board influence within months, in our core healthcare sector, with the activist publicly supportive — proof that operating credibility plus board seats is the winning currency in the universal-proxy era, and a signal that sponsors are moving into this space now.</w:t>
+      </w:r>
+    </w:p>
+    <w:p>
+      <w:pPr>
+        <w:pStyle w:val="Heading2"/>
+      </w:pPr>
+      <w:r>
+        <w:t>A.4 Other relevant signals</w:t>
+      </w:r>
+    </w:p>
+    <w:p>
+      <w:pPr>
+        <w:pStyle w:val="ListBullet"/>
+        <w:spacing w:after="80"/>
+      </w:pPr>
+      <w:r>
+        <w:rPr>
+          <w:b/>
+        </w:rPr>
+        <w:t xml:space="preserve">Triton – Caverion (FI, 2022–23): </w:t>
+      </w:r>
+      <w:r>
+        <w:t>sponsor stake-building in a listed Nordic services company escalated into a competing tender battle (Bain consortium vs Triton), completed 2023 at a large premium to the undisturbed price — evidence that public stakes create take-private optionality at premium outcomes.</w:t>
+      </w:r>
+    </w:p>
+    <w:p>
+      <w:pPr>
+        <w:pStyle w:val="ListBullet"/>
+        <w:spacing w:after="80"/>
+      </w:pPr>
+      <w:r>
+        <w:rPr>
+          <w:b/>
+        </w:rPr>
+        <w:t xml:space="preserve">Active Value Partners (2026): </w:t>
+      </w:r>
+      <w:r>
+        <w:t>ex-Cevian partners launched a Nordic/European engagement strategy, confirming institutional LP appetite — and starting the clock on the competitive window this proposal addresses.</w:t>
+      </w:r>
+    </w:p>
+    <w:p>
+      <w:r>
+        <w:br w:type="page"/>
+      </w:r>
+    </w:p>
+    <w:p>
+      <w:pPr>
+        <w:pStyle w:val="Heading1"/>
+      </w:pPr>
+      <w:r>
+        <w:t>Appendix B: Disclaimer</w:t>
       </w:r>
     </w:p>
     <w:p>

</xml_diff>

<commit_message>
Add hedging policy section, refresh Cevian record, expand sponsor precedents
Hedged-vs-unhedged analysis with recommendation (long with tactical
overlay); Cevian table updated with Smith+Nephew >10%, Akzo Nobel, SIG
Group, ABB 2025 exit, Pearson at ~18% ongoing; sponsor-activism entries
beyond Henry Schein (US Foods, Silver Lake PIPEs, Apollo-Western
Digital, Warburg-ESR).

https://claude.ai/code/session_014wJkiGJDWLqynffcMLAwBq
</commit_message>
<xml_diff>
--- a/nordic-capital-activism-pitch/Nordic_Capital_Engaged_Equities_Pitch.docx
+++ b/nordic-capital-activism-pitch/Nordic_Capital_Engaged_Equities_Pitch.docx
@@ -2174,6 +2174,285 @@
     <w:p/>
     <w:p>
       <w:pPr>
+        <w:pStyle w:val="Heading2"/>
+      </w:pPr>
+      <w:r>
+        <w:t>8.1 Market exposure: hedged or unhedged?</w:t>
+      </w:r>
+    </w:p>
+    <w:p>
+      <w:r>
+        <w:rPr>
+          <w:b w:val="0"/>
+          <w:i w:val="0"/>
+        </w:rPr>
+        <w:t>A deliberate design choice with real economics attached. Three models were considered:</w:t>
+      </w:r>
+    </w:p>
+    <w:tbl>
+      <w:tblPr>
+        <w:tblStyle w:val="TableGrid"/>
+        <w:tblW w:type="auto" w:w="0"/>
+        <w:jc w:val="center"/>
+        <w:tblLook w:firstColumn="1" w:firstRow="1" w:lastColumn="0" w:lastRow="0" w:noHBand="0" w:noVBand="1" w:val="04A0"/>
+      </w:tblPr>
+      <w:tblGrid>
+        <w:gridCol w:w="2880"/>
+        <w:gridCol w:w="2880"/>
+        <w:gridCol w:w="2880"/>
+      </w:tblGrid>
+      <w:tr>
+        <w:tc>
+          <w:tcPr>
+            <w:tcW w:type="dxa" w:w="2448"/>
+            <w:shd w:fill="0B2545"/>
+          </w:tcPr>
+          <w:p>
+            <w:r/>
+            <w:r>
+              <w:rPr>
+                <w:b/>
+                <w:color w:val="FFFFFF"/>
+                <w:sz w:val="19"/>
+              </w:rPr>
+              <w:t>Model</w:t>
+            </w:r>
+          </w:p>
+        </w:tc>
+        <w:tc>
+          <w:tcPr>
+            <w:tcW w:type="dxa" w:w="3744"/>
+            <w:shd w:fill="0B2545"/>
+          </w:tcPr>
+          <w:p>
+            <w:r/>
+            <w:r>
+              <w:rPr>
+                <w:b/>
+                <w:color w:val="FFFFFF"/>
+                <w:sz w:val="19"/>
+              </w:rPr>
+              <w:t>Mechanics</w:t>
+            </w:r>
+          </w:p>
+        </w:tc>
+        <w:tc>
+          <w:tcPr>
+            <w:tcW w:type="dxa" w:w="3600"/>
+            <w:shd w:fill="0B2545"/>
+          </w:tcPr>
+          <w:p>
+            <w:r/>
+            <w:r>
+              <w:rPr>
+                <w:b/>
+                <w:color w:val="FFFFFF"/>
+                <w:sz w:val="19"/>
+              </w:rPr>
+              <w:t>Assessment</w:t>
+            </w:r>
+          </w:p>
+        </w:tc>
+      </w:tr>
+      <w:tr>
+        <w:tc>
+          <w:tcPr>
+            <w:tcW w:type="dxa" w:w="2448"/>
+          </w:tcPr>
+          <w:p>
+            <w:r/>
+            <w:r>
+              <w:rPr>
+                <w:sz w:val="19"/>
+              </w:rPr>
+              <w:t>Long-only, unhedged (Cevian model)</w:t>
+            </w:r>
+          </w:p>
+        </w:tc>
+        <w:tc>
+          <w:tcPr>
+            <w:tcW w:type="dxa" w:w="3744"/>
+          </w:tcPr>
+          <w:p>
+            <w:r/>
+            <w:r>
+              <w:rPr>
+                <w:sz w:val="19"/>
+              </w:rPr>
+              <w:t>Net exposure ~100%; returns = market beta + engagement alpha.</w:t>
+            </w:r>
+          </w:p>
+        </w:tc>
+        <w:tc>
+          <w:tcPr>
+            <w:tcW w:type="dxa" w:w="3600"/>
+          </w:tcPr>
+          <w:p>
+            <w:r/>
+            <w:r>
+              <w:rPr>
+                <w:sz w:val="19"/>
+              </w:rPr>
+              <w:t>Simple, cheap, matches LP expectations for engaged equity. Full drawdown participation in risk-off years; campaign mid-life is exposed.</w:t>
+            </w:r>
+          </w:p>
+        </w:tc>
+      </w:tr>
+      <w:tr>
+        <w:tc>
+          <w:tcPr>
+            <w:tcW w:type="dxa" w:w="2448"/>
+            <w:shd w:fill="F2F4F8"/>
+          </w:tcPr>
+          <w:p>
+            <w:r/>
+            <w:r>
+              <w:rPr>
+                <w:sz w:val="19"/>
+              </w:rPr>
+              <w:t>Long with tactical beta overlay (recommended)</w:t>
+            </w:r>
+          </w:p>
+        </w:tc>
+        <w:tc>
+          <w:tcPr>
+            <w:tcW w:type="dxa" w:w="3744"/>
+            <w:shd w:fill="F2F4F8"/>
+          </w:tcPr>
+          <w:p>
+            <w:r/>
+            <w:r>
+              <w:rPr>
+                <w:sz w:val="19"/>
+              </w:rPr>
+              <w:t>Net exposure 80–100% by default; IC may hedge up to ~30% of NAV notionally via index futures/options under defined stress triggers; FX systematically hedged to USD.</w:t>
+            </w:r>
+          </w:p>
+        </w:tc>
+        <w:tc>
+          <w:tcPr>
+            <w:tcW w:type="dxa" w:w="3600"/>
+            <w:shd w:fill="F2F4F8"/>
+          </w:tcPr>
+          <w:p>
+            <w:r/>
+            <w:r>
+              <w:rPr>
+                <w:sz w:val="19"/>
+              </w:rPr>
+              <w:t>Keeps the equity risk premium and the catalyst optionality, but caps tail drawdowns cheaply at portfolio level — practical for a 6–8 name book where idiosyncratic risk dominates anyway.</w:t>
+            </w:r>
+          </w:p>
+        </w:tc>
+      </w:tr>
+      <w:tr>
+        <w:tc>
+          <w:tcPr>
+            <w:tcW w:type="dxa" w:w="2448"/>
+          </w:tcPr>
+          <w:p>
+            <w:r/>
+            <w:r>
+              <w:rPr>
+                <w:sz w:val="19"/>
+              </w:rPr>
+              <w:t>Market-neutral activist (hedge-fund model)</w:t>
+            </w:r>
+          </w:p>
+        </w:tc>
+        <w:tc>
+          <w:tcPr>
+            <w:tcW w:type="dxa" w:w="3744"/>
+          </w:tcPr>
+          <w:p>
+            <w:r/>
+            <w:r>
+              <w:rPr>
+                <w:sz w:val="19"/>
+              </w:rPr>
+              <w:t>Permanent index/sector shorts isolate campaign alpha; net exposure ~0–30%.</w:t>
+            </w:r>
+          </w:p>
+        </w:tc>
+        <w:tc>
+          <w:tcPr>
+            <w:tcW w:type="dxa" w:w="3600"/>
+          </w:tcPr>
+          <w:p>
+            <w:r/>
+            <w:r>
+              <w:rPr>
+                <w:sz w:val="19"/>
+              </w:rPr>
+              <w:t>Rejected: 150–300bps annual hedge drag compounds against multi-year campaign horizons; sector shorts in concentrated books add basis risk, not protection; and a structural short book sits awkwardly with a constructive, board-seat brand.</w:t>
+            </w:r>
+          </w:p>
+        </w:tc>
+      </w:tr>
+    </w:tbl>
+    <w:p/>
+    <w:p>
+      <w:pPr>
+        <w:pStyle w:val="ListBullet"/>
+        <w:spacing w:after="80"/>
+      </w:pPr>
+      <w:r>
+        <w:rPr>
+          <w:b/>
+        </w:rPr>
+        <w:t xml:space="preserve">Recommendation: </w:t>
+      </w:r>
+      <w:r>
+        <w:t>run the book predominantly unhedged (net 80–100%), with a tactical index-hedge overlay at Investment Committee discretion — pre-defined triggers (drawdown thresholds, spread of book value-gap vs market), capped at ~30% of NAV, implemented in liquid index futures and options only.</w:t>
+      </w:r>
+    </w:p>
+    <w:p>
+      <w:pPr>
+        <w:pStyle w:val="ListBullet"/>
+        <w:spacing w:after="80"/>
+      </w:pPr>
+      <w:r>
+        <w:rPr>
+          <w:b/>
+        </w:rPr>
+        <w:t xml:space="preserve">Never single-name shorts. </w:t>
+      </w:r>
+      <w:r>
+        <w:t>No shorting of engagement targets or their peers — the conflict, disclosure and reputational costs outweigh any hedging value; this is also an explicit LP-facing commitment (Section 4.4).</w:t>
+      </w:r>
+    </w:p>
+    <w:p>
+      <w:pPr>
+        <w:pStyle w:val="ListBullet"/>
+        <w:spacing w:after="80"/>
+      </w:pPr>
+      <w:r>
+        <w:rPr>
+          <w:b/>
+        </w:rPr>
+        <w:t xml:space="preserve">Currency: </w:t>
+      </w:r>
+      <w:r>
+        <w:t>USD base; SEK/EUR/GBP/CHF/DKK exposures systematically hedged at the share-class level so LP returns reflect engagement outcomes, not FX.</w:t>
+      </w:r>
+    </w:p>
+    <w:p>
+      <w:pPr>
+        <w:pStyle w:val="ListBullet"/>
+        <w:spacing w:after="80"/>
+      </w:pPr>
+      <w:r>
+        <w:rPr>
+          <w:b/>
+        </w:rPr>
+        <w:t xml:space="preserve">Why this is the right trade: </w:t>
+      </w:r>
+      <w:r>
+        <w:t>the strategy's alpha is idiosyncratic and catalyst-driven; entry discounts of 30%+ are the primary downside protection. Paying a permanent hedge premium to neutralise the beta LPs are deliberately buying would lower net returns ~2–3% p.a. for protection the evergreen structure (3-year lock, gates) already provides against forced selling.</w:t>
+      </w:r>
+    </w:p>
+    <w:p>
+      <w:pPr>
         <w:pStyle w:val="Heading1"/>
       </w:pPr>
       <w:r>
@@ -4022,7 +4301,7 @@
               <w:rPr>
                 <w:sz w:val="19"/>
               </w:rPr>
-              <w:t>2015–c.22</w:t>
+              <w:t>2015–25</w:t>
             </w:r>
           </w:p>
         </w:tc>
@@ -4037,7 +4316,7 @@
               <w:rPr>
                 <w:sz w:val="19"/>
               </w:rPr>
-              <w:t>Power Grids exit (sold to Hitachi 2020), decentralisation, buybacks, leadership change; long hold, solid re-rating.</w:t>
+              <w:t>Power Grids exit (sold to Hitachi 2020), decentralisation, buybacks, leadership change; long-held position finally sold down in 2025 after a strong multi-year re-rating.</w:t>
             </w:r>
           </w:p>
         </w:tc>
@@ -4382,7 +4661,7 @@
               <w:rPr>
                 <w:sz w:val="19"/>
               </w:rPr>
-              <w:t>2020–c.23</w:t>
+              <w:t>2020–</w:t>
             </w:r>
           </w:p>
         </w:tc>
@@ -4397,7 +4676,7 @@
               <w:rPr>
                 <w:sz w:val="19"/>
               </w:rPr>
-              <w:t>Backed digital turnaround; re-rated under new CEO; Apollo approaches (2022) rejected above-market.</w:t>
+              <w:t>Backed digital turnaround; re-rated under new CEO; Apollo approaches (2022) rejected above-market; Cevian has since lifted its stake to ~18% — its largest disclosed percentage holding.</w:t>
             </w:r>
           </w:p>
         </w:tc>
@@ -4412,7 +4691,7 @@
               <w:rPr>
                 <w:sz w:val="19"/>
               </w:rPr>
-              <w:t>Modest win</w:t>
+              <w:t>Win, ongoing</w:t>
             </w:r>
           </w:p>
         </w:tc>
@@ -4696,7 +4975,127 @@
               <w:rPr>
                 <w:sz w:val="19"/>
               </w:rPr>
-              <w:t>~5%; margin recovery and structural options including a US listing review; shares up since disclosure.</w:t>
+              <w:t>Entered ~5% in 2024; conviction has grown with the campaign — stake lifted above 10% by mid-2026 (&gt;USD 1.3bn position). Margin recovery and structural options including a US listing review; shares up since disclosure.</w:t>
+            </w:r>
+          </w:p>
+        </w:tc>
+        <w:tc>
+          <w:tcPr>
+            <w:tcW w:type="dxa" w:w="1152"/>
+          </w:tcPr>
+          <w:p>
+            <w:r/>
+            <w:r>
+              <w:rPr>
+                <w:sz w:val="19"/>
+              </w:rPr>
+              <w:t>Ongoing</w:t>
+            </w:r>
+          </w:p>
+        </w:tc>
+      </w:tr>
+      <w:tr>
+        <w:tc>
+          <w:tcPr>
+            <w:tcW w:type="dxa" w:w="2160"/>
+            <w:shd w:fill="F2F4F8"/>
+          </w:tcPr>
+          <w:p>
+            <w:r/>
+            <w:r>
+              <w:rPr>
+                <w:sz w:val="19"/>
+              </w:rPr>
+              <w:t>Akzo Nobel (NL)</w:t>
+            </w:r>
+          </w:p>
+        </w:tc>
+        <w:tc>
+          <w:tcPr>
+            <w:tcW w:type="dxa" w:w="1296"/>
+            <w:shd w:fill="F2F4F8"/>
+          </w:tcPr>
+          <w:p>
+            <w:r/>
+            <w:r>
+              <w:rPr>
+                <w:sz w:val="19"/>
+              </w:rPr>
+              <w:t>c.2024–</w:t>
+            </w:r>
+          </w:p>
+        </w:tc>
+        <w:tc>
+          <w:tcPr>
+            <w:tcW w:type="dxa" w:w="5184"/>
+            <w:shd w:fill="F2F4F8"/>
+          </w:tcPr>
+          <w:p>
+            <w:r/>
+            <w:r>
+              <w:rPr>
+                <w:sz w:val="19"/>
+              </w:rPr>
+              <w:t>Coatings margin gap vs US peers and consolidation thesis; stake doubled to ~10.2% in late 2025 as part of a portfolio reshape funded by the ABB exit.</w:t>
+            </w:r>
+          </w:p>
+        </w:tc>
+        <w:tc>
+          <w:tcPr>
+            <w:tcW w:type="dxa" w:w="1152"/>
+            <w:shd w:fill="F2F4F8"/>
+          </w:tcPr>
+          <w:p>
+            <w:r/>
+            <w:r>
+              <w:rPr>
+                <w:sz w:val="19"/>
+              </w:rPr>
+              <w:t>Ongoing</w:t>
+            </w:r>
+          </w:p>
+        </w:tc>
+      </w:tr>
+      <w:tr>
+        <w:tc>
+          <w:tcPr>
+            <w:tcW w:type="dxa" w:w="2160"/>
+          </w:tcPr>
+          <w:p>
+            <w:r/>
+            <w:r>
+              <w:rPr>
+                <w:sz w:val="19"/>
+              </w:rPr>
+              <w:t>SIG Group (CH)</w:t>
+            </w:r>
+          </w:p>
+        </w:tc>
+        <w:tc>
+          <w:tcPr>
+            <w:tcW w:type="dxa" w:w="1296"/>
+          </w:tcPr>
+          <w:p>
+            <w:r/>
+            <w:r>
+              <w:rPr>
+                <w:sz w:val="19"/>
+              </w:rPr>
+              <w:t>2025–</w:t>
+            </w:r>
+          </w:p>
+        </w:tc>
+        <w:tc>
+          <w:tcPr>
+            <w:tcW w:type="dxa" w:w="5184"/>
+          </w:tcPr>
+          <w:p>
+            <w:r/>
+            <w:r>
+              <w:rPr>
+                <w:sz w:val="19"/>
+              </w:rPr>
+              <w:t>New position in the Swiss food-packaging maker disclosed late 2025; de-rated quality franchise, self-help thesis.</w:t>
             </w:r>
           </w:p>
         </w:tc>
@@ -4723,7 +5122,7 @@
           <w:b w:val="0"/>
           <w:i/>
         </w:rPr>
-        <w:t>Read-across: roughly three clear failures in ~20 disclosed campaigns, with the wins concentrated where a transaction or separation crystallised value (Skandia, RSA, Panalpina, Alent, Autoliv/Veoneer, Baloise) — supporting this strategy's M&amp;A-archetype weighting. The failures share a fingerprint our screens are built to exclude: fragile balance sheets, stakeholder/political complexity, and catalysts outside shareholders' control (ThyssenKrupp, Bilfinger, Vodafone).</w:t>
+        <w:t>Read-across: roughly three clear failures in ~23 disclosed campaigns, with the wins concentrated where a transaction or separation crystallised value (Skandia, RSA, Panalpina, Alent, Autoliv/Veoneer, Baloise) — supporting this strategy's M&amp;A-archetype weighting. The failures share a fingerprint our screens are built to exclude: fragile balance sheets, stakeholder/political complexity, and catalysts outside shareholders' control (ThyssenKrupp, Bilfinger, Vodafone).</w:t>
       </w:r>
     </w:p>
     <w:p>
@@ -4784,7 +5183,16 @@
         <w:pStyle w:val="Heading2"/>
       </w:pPr>
       <w:r>
-        <w:t>A.3 KKR – Henry Schein — sponsor activism validated</w:t>
+        <w:t>A.3 Sponsors entering public-market activism</w:t>
+      </w:r>
+    </w:p>
+    <w:p>
+      <w:r>
+        <w:rPr>
+          <w:b w:val="0"/>
+          <w:i w:val="0"/>
+        </w:rPr>
+        <w:t>Governance commentators now track “occasional activists” — sponsors and strategics using activist tactics — as a defining trend of the 2025–26 cycle. The pattern: a modest minority stake plus operating credibility converts into board influence within months, often alongside or after a conventional activist.</w:t>
       </w:r>
     </w:p>
     <w:p>
@@ -4796,10 +5204,10 @@
         <w:rPr>
           <w:b/>
         </w:rPr>
-        <w:t xml:space="preserve">Set-up: </w:t>
+        <w:t xml:space="preserve">KKR – Henry Schein (2025) — the template. </w:t>
       </w:r>
       <w:r>
-        <w:t>Ananym Capital ran a conventional activist campaign in late 2024 (board refresh, cost cuts, succession, portfolio review) at the US dental/medical distributor.</w:t>
+        <w:t>Ananym Capital ran a conventional campaign in late 2024 (board refresh, cost cuts, succession, portfolio review). In January 2025 Henry Schein announced a USD 250m strategic investment from KKR with two board seats (Dan Daniel, ex-Danaher; Max Lin, KKR Healthcare); completed May 2025 with KKR at ~12% — the largest non-index holder, with clearance to build to 14.9%. Sponsor activism, in our core healthcare sector, with the activist publicly supportive.</w:t>
       </w:r>
     </w:p>
     <w:p>
@@ -4811,10 +5219,55 @@
         <w:rPr>
           <w:b/>
         </w:rPr>
-        <w:t xml:space="preserve">Sponsor entry: </w:t>
+        <w:t xml:space="preserve">KKR – US Foods (2020). </w:t>
       </w:r>
       <w:r>
-        <w:t>In January 2025 Henry Schein announced a USD 250m strategic investment from KKR with two board seats (Dan Daniel, ex-Danaher; Max Lin, KKR Healthcare); completed May 2025 with KKR at ~12% — the largest non-index holder, with permission to build to 14.9%.</w:t>
+        <w:t>USD 500m PIPE at the COVID trough with a board seat; patient sponsor capital entered alongside activist pressure (Sachem Head later won seats) and exited into the recovery with strong reported returns.</w:t>
+      </w:r>
+    </w:p>
+    <w:p>
+      <w:pPr>
+        <w:pStyle w:val="ListBullet"/>
+        <w:spacing w:after="80"/>
+      </w:pPr>
+      <w:r>
+        <w:rPr>
+          <w:b/>
+        </w:rPr>
+        <w:t xml:space="preserve">Silver Lake – Expedia / Twitter / Airbnb (2020). </w:t>
+      </w:r>
+      <w:r>
+        <w:t>Crisis PIPEs with board representation — demonstrating sponsors can underwrite public minority positions at speed and govern through the board rather than control.</w:t>
+      </w:r>
+    </w:p>
+    <w:p>
+      <w:pPr>
+        <w:pStyle w:val="ListBullet"/>
+        <w:spacing w:after="80"/>
+      </w:pPr>
+      <w:r>
+        <w:rPr>
+          <w:b/>
+        </w:rPr>
+        <w:t xml:space="preserve">Apollo – Western Digital (2023). </w:t>
+      </w:r>
+      <w:r>
+        <w:t>USD 900m convertible preferred while Elliott publicly pushed the flash/HDD separation; the split completed in 2025 (SanDisk spin). Sponsor structured capital riding an activist catalyst.</w:t>
+      </w:r>
+    </w:p>
+    <w:p>
+      <w:pPr>
+        <w:pStyle w:val="ListBullet"/>
+        <w:spacing w:after="80"/>
+      </w:pPr>
+      <w:r>
+        <w:rPr>
+          <w:b/>
+        </w:rPr>
+        <w:t xml:space="preserve">Warburg Pincus – ESR Group (2022–25). </w:t>
+      </w:r>
+      <w:r>
+        <w:t>Long-held minority stake in the listed Asian logistics platform converted into co-leading the ~USD 7bn take-private — the toehold-to-buyout path this strategy's take-private protocol formalises.</w:t>
       </w:r>
     </w:p>
     <w:p>
@@ -4829,7 +5282,7 @@
         <w:t xml:space="preserve">Read-across: </w:t>
       </w:r>
       <w:r>
-        <w:t>a PE sponsor converted a modest minority stake into board influence within months, in our core healthcare sector, with the activist publicly supportive — proof that operating credibility plus board seats is the winning currency in the universal-proxy era, and a signal that sponsors are moving into this space now.</w:t>
+        <w:t>operating credibility plus board seats is the winning currency of the universal-proxy era, sponsors are arriving now, and the toehold-to-influence (and occasionally to-control) path is repeatable. Nordic Capital would be early among European sponsors — but not first in the world, which de-risks the LP conversation.</w:t>
       </w:r>
     </w:p>
     <w:p>

</xml_diff>

<commit_message>
Deepen precedents appendix with campaign-level detail
Twelve in-depth Cevian campaign write-ups with lessons; full EQT Public
Value post-mortem incl. Storytel case study; KKR-Henry Schein step-by-
step through the 2026 chairmanship; Caverion bid sequence; deck synced.

https://claude.ai/code/session_014wJkiGJDWLqynffcMLAwBq
</commit_message>
<xml_diff>
--- a/nordic-capital-activism-pitch/Nordic_Capital_Engaged_Equities_Pitch.docx
+++ b/nordic-capital-activism-pitch/Nordic_Capital_Engaged_Equities_Pitch.docx
@@ -4541,7 +4541,7 @@
               <w:rPr>
                 <w:sz w:val="19"/>
               </w:rPr>
-              <w:t>2018–19</w:t>
+              <w:t>c.2013–19</w:t>
             </w:r>
           </w:p>
         </w:tc>
@@ -4556,7 +4556,7 @@
               <w:rPr>
                 <w:sz w:val="19"/>
               </w:rPr>
-              <w:t>~12%; pushed sale; DSV all-share takeover 2019 at a substantial premium within ~18 months.</w:t>
+              <w:t>Long-held ~12% position frustrated for years by the anchor foundation; pushed sale; DSV all-share takeover 2019 at a substantial premium.</w:t>
             </w:r>
           </w:p>
         </w:tc>
@@ -4571,7 +4571,7 @@
               <w:rPr>
                 <w:sz w:val="19"/>
               </w:rPr>
-              <w:t>Win (fast)</w:t>
+              <w:t>Win</w:t>
             </w:r>
           </w:p>
         </w:tc>
@@ -5021,7 +5021,7 @@
               <w:rPr>
                 <w:sz w:val="19"/>
               </w:rPr>
-              <w:t>c.2024–</w:t>
+              <w:t>2025–</w:t>
             </w:r>
           </w:p>
         </w:tc>
@@ -5036,7 +5036,7 @@
               <w:rPr>
                 <w:sz w:val="19"/>
               </w:rPr>
-              <w:t>Coatings margin gap vs US peers and consolidation thesis; stake doubled to ~10.2% in late 2025 as part of a portfolio reshape funded by the ABB exit.</w:t>
+              <w:t>Built ~5% during 2025 pressing for a strategy reset; publicly backed the USD 25bn all-stock Axalta merger of equals (announced November 2025), then doubled to ~10.2% funded by the ABB exit.</w:t>
             </w:r>
           </w:p>
         </w:tc>
@@ -5127,10 +5127,396 @@
     </w:p>
     <w:p>
       <w:pPr>
+        <w:pStyle w:val="Heading3"/>
+      </w:pPr>
+      <w:r>
+        <w:t>A.1.1 Selected Cevian campaigns in depth</w:t>
+      </w:r>
+    </w:p>
+    <w:p>
+      <w:r>
+        <w:rPr>
+          <w:b/>
+          <w:i w:val="0"/>
+        </w:rPr>
+        <w:t>Volvo Group (2006–17) — the franchise-maker.</w:t>
+      </w:r>
+    </w:p>
+    <w:p>
+      <w:pPr>
+        <w:pStyle w:val="ListBullet2"/>
+        <w:spacing w:after="80"/>
+      </w:pPr>
+      <w:r>
+        <w:t>Built one of its largest-ever positions (via the Violet Partners vehicle) in a conglomerate then spanning trucks, construction equipment, buses, marine and aerospace, trading at a deep discount to focused peers.</w:t>
+      </w:r>
+    </w:p>
+    <w:p>
+      <w:pPr>
+        <w:pStyle w:val="ListBullet2"/>
+        <w:spacing w:after="80"/>
+      </w:pPr>
+      <w:r>
+        <w:t>Agenda over a decade: portfolio focus (Volvo Aero divested 2012), repeated cost and margin programs, governance renewal, and capital discipline through the truck cycle.</w:t>
+      </w:r>
+    </w:p>
+    <w:p>
+      <w:pPr>
+        <w:pStyle w:val="ListBullet2"/>
+        <w:spacing w:after="80"/>
+      </w:pPr>
+      <w:r>
+        <w:t>Exit: the 8.2%/A-share stake was sold to Geely in December 2017 for ~USD 3.9bn — publicly reported as among Cevian's most profitable investments (~2x over the hold, with substantial dividends on top). Lesson: in cyclical industrials, the value plan must survive two downcycles; patience plus board influence eventually compounds.</w:t>
+      </w:r>
+    </w:p>
+    <w:p>
+      <w:r>
+        <w:rPr>
+          <w:b/>
+          <w:i w:val="0"/>
+        </w:rPr>
+        <w:t>ThyssenKrupp (2013–c.22) — the instructive failure.</w:t>
+      </w:r>
+    </w:p>
+    <w:p>
+      <w:pPr>
+        <w:pStyle w:val="ListBullet2"/>
+        <w:spacing w:after="80"/>
+      </w:pPr>
+      <w:r>
+        <w:t>Entered 2013 and built to ~18%, the second-largest holder, with a board seat; thesis: a classic conglomerate break-up (steel, elevators, automotive, plant engineering) at a large SOTP discount.</w:t>
+      </w:r>
+    </w:p>
+    <w:p>
+      <w:pPr>
+        <w:pStyle w:val="ListBullet2"/>
+        <w:spacing w:after="80"/>
+      </w:pPr>
+      <w:r>
+        <w:t>What went wrong: chronically weak cash generation and pension liabilities meant the company, not the shareholder, controlled the timetable; management resisted for years (CEO and chair both exited 2018 amid the pressure); German stakeholder politics (labour co-determination, foundation anchor) blunted every escalation.</w:t>
+      </w:r>
+    </w:p>
+    <w:p>
+      <w:pPr>
+        <w:pStyle w:val="ListBullet2"/>
+        <w:spacing w:after="80"/>
+      </w:pPr>
+      <w:r>
+        <w:t>The Elevator sale (EUR 17.2bn to Advent/Cinven, February 2020) finally proved the SOTP — but proceeds plugged holes rather than reaching shareholders, and the shares had collapsed from ~EUR 25 (2017) to single digits. Cevian sold down through 2020–22 at a significant reported loss.</w:t>
+      </w:r>
+    </w:p>
+    <w:p>
+      <w:pPr>
+        <w:pStyle w:val="ListBullet2"/>
+        <w:spacing w:after="80"/>
+      </w:pPr>
+      <w:r>
+        <w:t>Lesson encoded in our Screen 3: no fragile balance sheets, no politically anchored registers, no catalysts the company cannot afford to execute.</w:t>
+      </w:r>
+    </w:p>
+    <w:p>
+      <w:r>
+        <w:rPr>
+          <w:b/>
+          <w:i w:val="0"/>
+        </w:rPr>
+        <w:t>RSA Insurance (2013–21) — underwrite the end-game.</w:t>
+      </w:r>
+    </w:p>
+    <w:p>
+      <w:pPr>
+        <w:pStyle w:val="ListBullet2"/>
+        <w:spacing w:after="80"/>
+      </w:pPr>
+      <w:r>
+        <w:t>Entered around the 2013–14 crisis (Irish reserving scandal, dividend cut, rights issue) and built to ~14%, becoming the largest shareholder with board representation.</w:t>
+      </w:r>
+    </w:p>
+    <w:p>
+      <w:pPr>
+        <w:pStyle w:val="ListBullet2"/>
+        <w:spacing w:after="80"/>
+      </w:pPr>
+      <w:r>
+        <w:t>Agenda: exit non-core geographies, fix underwriting discipline, return capital — executed under the Hester management team over several years while Cevian publicly kept a sale on the table.</w:t>
+      </w:r>
+    </w:p>
+    <w:p>
+      <w:pPr>
+        <w:pStyle w:val="ListBullet2"/>
+        <w:spacing w:after="80"/>
+      </w:pPr>
+      <w:r>
+        <w:t>Exit: the Intact/Tryg consortium takeover (agreed November 2020, completed 2021) at 685p — ~50% above the undisturbed price — split the group between the buyers. A template for our M&amp;A archetype: operational repair first, strategic premium second.</w:t>
+      </w:r>
+    </w:p>
+    <w:p>
+      <w:r>
+        <w:rPr>
+          <w:b/>
+          <w:i w:val="0"/>
+        </w:rPr>
+        <w:t>ABB (2015–25) — the slow win.</w:t>
+      </w:r>
+    </w:p>
+    <w:p>
+      <w:pPr>
+        <w:pStyle w:val="ListBullet2"/>
+        <w:spacing w:after="80"/>
+      </w:pPr>
+      <w:r>
+        <w:t>~6% built from 2015; demands: exit Power Grids, decentralise the matrix organisation, lift margins, return capital. Management initially kept Power Grids after a 2016 review; Cevian persisted, gaining board representation and, after a CEO change, the Power Grids sale to Hitachi (USD 11bn enterprise value, completed 2020) with proceeds returned via buybacks.</w:t>
+      </w:r>
+    </w:p>
+    <w:p>
+      <w:pPr>
+        <w:pStyle w:val="ListBullet2"/>
+        <w:spacing w:after="80"/>
+      </w:pPr>
+      <w:r>
+        <w:t>The decentralised operating model under new leadership drove a multi-year re-rating; Cevian's long-held position was finally sold down in 2025, funding new positions (Akzo Nobel, SIG).</w:t>
+      </w:r>
+    </w:p>
+    <w:p>
+      <w:pPr>
+        <w:pStyle w:val="ListBullet2"/>
+        <w:spacing w:after="80"/>
+      </w:pPr>
+      <w:r>
+        <w:t>Lesson: a ten-year hold can still be a win at scale, but it argues for our evergreen structure and for milestone-based campaign reviews.</w:t>
+      </w:r>
+    </w:p>
+    <w:p>
+      <w:r>
+        <w:rPr>
+          <w:b/>
+          <w:i w:val="0"/>
+        </w:rPr>
+        <w:t>Ericsson (2017–c.23) — right plan, exogenous shock.</w:t>
+      </w:r>
+    </w:p>
+    <w:p>
+      <w:pPr>
+        <w:pStyle w:val="ListBullet2"/>
+        <w:spacing w:after="80"/>
+      </w:pPr>
+      <w:r>
+        <w:t>Built ~9% economic exposure (shares plus instruments) in 2017 at crisis prices; demands: new chair (Ronnie Leten arrived 2018), radical cost reduction, focus on networks, no value-destructive M&amp;A.</w:t>
+      </w:r>
+    </w:p>
+    <w:p>
+      <w:pPr>
+        <w:pStyle w:val="ListBullet2"/>
+        <w:spacing w:after="80"/>
+      </w:pPr>
+      <w:r>
+        <w:t>The plan worked: margins recovered and the shares roughly doubled into 2021; Cevian reportedly sold down much of the position near the highs.</w:t>
+      </w:r>
+    </w:p>
+    <w:p>
+      <w:pPr>
+        <w:pStyle w:val="ListBullet2"/>
+        <w:spacing w:after="80"/>
+      </w:pPr>
+      <w:r>
+        <w:t>The 2022 compliance disclosures (Iraq) and the Vonage acquisition — the exact M&amp;A pattern Cevian had warned against — gave back much of the re-rating. Net outcome reported positive. Lesson: take profits when the underwrite is achieved; do not re-underwrite a new thesis by inertia.</w:t>
+      </w:r>
+    </w:p>
+    <w:p>
+      <w:r>
+        <w:rPr>
+          <w:b/>
+          <w:i w:val="0"/>
+        </w:rPr>
+        <w:t>Aviva (2021–c.24) — the capital-return campaign.</w:t>
+      </w:r>
+    </w:p>
+    <w:p>
+      <w:pPr>
+        <w:pStyle w:val="ListBullet2"/>
+        <w:spacing w:after="80"/>
+      </w:pPr>
+      <w:r>
+        <w:t>Disclosed ~5% in June 2021 behind a precise, public ask: return GBP 5bn of excess capital by mid-2022 and cut GBP 300m of costs, supporting the new CEO's disposal program (eight non-core geographies sold).</w:t>
+      </w:r>
+    </w:p>
+    <w:p>
+      <w:pPr>
+        <w:pStyle w:val="ListBullet2"/>
+        <w:spacing w:after="80"/>
+      </w:pPr>
+      <w:r>
+        <w:t>Aviva returned ~GBP 4.75bn (B-share scheme plus buybacks) and hit the cost targets; the stock re-rated and Cevian exited with a solid reported gain inside ~2–3 years.</w:t>
+      </w:r>
+    </w:p>
+    <w:p>
+      <w:pPr>
+        <w:pStyle w:val="ListBullet2"/>
+        <w:spacing w:after="80"/>
+      </w:pPr>
+      <w:r>
+        <w:t>A template for the capital-allocation archetype: a demand the company can fund, stated in numbers, aligned with management's own logic.</w:t>
+      </w:r>
+    </w:p>
+    <w:p>
+      <w:r>
+        <w:rPr>
+          <w:b/>
+          <w:i w:val="0"/>
+        </w:rPr>
+        <w:t>UBS (2023–25) — the special-situation re-rate.</w:t>
+      </w:r>
+    </w:p>
+    <w:p>
+      <w:pPr>
+        <w:pStyle w:val="ListBullet2"/>
+        <w:spacing w:after="80"/>
+      </w:pPr>
+      <w:r>
+        <w:t>Bought ~1.3% (~EUR 1.2bn) in late 2023 after the Credit Suisse rescue; thesis stated publicly: integration plus capital return could double the value toward Morgan Stanley-class multiples.</w:t>
+      </w:r>
+    </w:p>
+    <w:p>
+      <w:pPr>
+        <w:pStyle w:val="ListBullet2"/>
+        <w:spacing w:after="80"/>
+      </w:pPr>
+      <w:r>
+        <w:t>No campaign was needed — the position was a valuation bet with engagement optionality. The shares re-rated sharply; sales in 2025 reportedly realised ~2x on early tranches, recycling capital into Smith+Nephew and Akzo Nobel.</w:t>
+      </w:r>
+    </w:p>
+    <w:p>
+      <w:r>
+        <w:rPr>
+          <w:b/>
+          <w:i w:val="0"/>
+        </w:rPr>
+        <w:t>Baloise (2023–25) — governance unlock, Swiss edition.</w:t>
+      </w:r>
+    </w:p>
+    <w:p>
+      <w:pPr>
+        <w:pStyle w:val="ListBullet2"/>
+        <w:spacing w:after="80"/>
+      </w:pPr>
+      <w:r>
+        <w:t>Built 9.4% from 2023 (entry ~CHF 130); demands: abandon the diversification strategy, refocus on core insurance, lift margins — and remove the statutory 2% vote-registration cap, which shareholders duly scrapped in 2024, unlocking the register.</w:t>
+      </w:r>
+    </w:p>
+    <w:p>
+      <w:pPr>
+        <w:pStyle w:val="ListBullet2"/>
+        <w:spacing w:after="80"/>
+      </w:pPr>
+      <w:r>
+        <w:t>Outcome: the Helvetia–Baloise merger of equals (announced April 2025, completed December 2025, ~CHF 8.3bn) — Cevian sold its stake to Patria (Helvetia's anchor) at ~CHF 184 to clear the path: ~+40% plus dividends in under three years.</w:t>
+      </w:r>
+    </w:p>
+    <w:p>
+      <w:pPr>
+        <w:pStyle w:val="ListBullet2"/>
+        <w:spacing w:after="80"/>
+      </w:pPr>
+      <w:r>
+        <w:t>Lesson: governance plumbing (vote caps, registration rules) is often the real barrier; removing it is itself a catalyst.</w:t>
+      </w:r>
+    </w:p>
+    <w:p>
+      <w:r>
+        <w:rPr>
+          <w:b/>
+          <w:i w:val="0"/>
+        </w:rPr>
+        <w:t>Akzo Nobel (2025–) — the live M&amp;A-archetype case.</w:t>
+      </w:r>
+    </w:p>
+    <w:p>
+      <w:pPr>
+        <w:pStyle w:val="ListBullet2"/>
+        <w:spacing w:after="80"/>
+      </w:pPr>
+      <w:r>
+        <w:t>Built ~5% during 2025, publicly pressing for a strategy reset at the perennial coatings underperformer; in November 2025 Akzo and Axalta announced a USD 25bn all-stock merger of equals (Akzo side ~55%, future US listing flagged).</w:t>
+      </w:r>
+    </w:p>
+    <w:p>
+      <w:pPr>
+        <w:pStyle w:val="ListBullet2"/>
+        <w:spacing w:after="80"/>
+      </w:pPr>
+      <w:r>
+        <w:t>Cevian publicly backed the deal and doubled its stake to ~10.2% in December 2025, funded by the ABB exit — buying more after the catalyst, underwriting the synergy and re-listing case through completion (expected H2 2026+).</w:t>
+      </w:r>
+    </w:p>
+    <w:p>
+      <w:r>
+        <w:rPr>
+          <w:b/>
+          <w:i w:val="0"/>
+        </w:rPr>
+        <w:t>Smith+Nephew (2024–) — conviction compounding.</w:t>
+      </w:r>
+    </w:p>
+    <w:p>
+      <w:pPr>
+        <w:pStyle w:val="ListBullet2"/>
+        <w:spacing w:after="80"/>
+      </w:pPr>
+      <w:r>
+        <w:t>Disclosed ~5% in July 2024 as the largest shareholder; agenda: close the margin gap to Stryker-class peers, fix orthopaedics execution, and evaluate structural options — including separating underperforming franchises and a US listing review.</w:t>
+      </w:r>
+    </w:p>
+    <w:p>
+      <w:pPr>
+        <w:pStyle w:val="ListBullet2"/>
+        <w:spacing w:after="80"/>
+      </w:pPr>
+      <w:r>
+        <w:t>13D filings show ~USD 1.1bn invested for 9.6% by early 2026; the position crossed 10% in March 2026 and was increased again in June 2026 — Cevian's standard pattern of adding as milestones are met. Shares up meaningfully since disclosure; campaign ongoing.</w:t>
+      </w:r>
+    </w:p>
+    <w:p>
+      <w:r>
+        <w:rPr>
+          <w:b/>
+          <w:i w:val="0"/>
+        </w:rPr>
+        <w:t xml:space="preserve">Bilfinger (2011–c.20) and Vodafone (2021–c.23) — the other failures, briefly. </w:t>
+      </w:r>
+    </w:p>
+    <w:p>
+      <w:pPr>
+        <w:pStyle w:val="ListBullet2"/>
+        <w:spacing w:after="80"/>
+      </w:pPr>
+      <w:r>
+        <w:t>Bilfinger: built to ~26% behind a services-transformation thesis; absorbed repeated profit warnings, compliance problems and a revolving door of CEOs; roughly a decade for approximately nothing. Lesson: transformation theses need transformation-grade management — underwrite the people, not just the plan.</w:t>
+      </w:r>
+    </w:p>
+    <w:p>
+      <w:pPr>
+        <w:pStyle w:val="ListBullet2"/>
+        <w:spacing w:after="80"/>
+      </w:pPr>
+      <w:r>
+        <w:t>Vodafone: pushed market consolidation, portfolio separation and board change at a structurally challenged telco; change arrived (towers monetisation, UK merger) but after Cevian had reportedly exited around flat-to-negative. Lesson: avoid situations where the catalyst requires regulators and counterparties the shareholder cannot move.</w:t>
+      </w:r>
+    </w:p>
+    <w:p>
+      <w:pPr>
         <w:pStyle w:val="Heading2"/>
       </w:pPr>
       <w:r>
         <w:t>A.2 EQT Public Value — the cautionary precedent</w:t>
+      </w:r>
+    </w:p>
+    <w:p>
+      <w:r>
+        <w:rPr>
+          <w:b w:val="0"/>
+          <w:i w:val="0"/>
+        </w:rPr>
+        <w:t>The closest structural precedent to this proposal — a top-tier Nordic sponsor applying its toolbox to listed mid-caps — and therefore the most important one to study, because it failed on design, not on concept.</w:t>
       </w:r>
     </w:p>
     <w:p>
@@ -5142,10 +5528,10 @@
         <w:rPr>
           <w:b/>
         </w:rPr>
-        <w:t xml:space="preserve">What it was: </w:t>
+        <w:t xml:space="preserve">The set-up (2018–19): </w:t>
       </w:r>
       <w:r>
-        <w:t>EQT's attempt to apply its toolbox to listed Nordic mid-caps, launched 2018–19. Disclosed holdings included Securitas, BHG Group, Storebrand, BioGaia, AFRY and Storytel — where it built ~10% in September 2021 and became the largest shareholder.</w:t>
+        <w:t>EQT launched Public Value to invest in listed Nordic mid-caps “with the EQT toolbox.” External fundraising met lukewarm LP reception and never reached intended scale; the strategy continued at sub-scale rather than being re-designed or shelved — the first compounding error.</w:t>
       </w:r>
     </w:p>
     <w:p>
@@ -5157,10 +5543,10 @@
         <w:rPr>
           <w:b/>
         </w:rPr>
-        <w:t xml:space="preserve">What happened: </w:t>
+        <w:t xml:space="preserve">The book: </w:t>
       </w:r>
       <w:r>
-        <w:t>Fundraising never reached scale, the strategy lacked a board-seat-driven engagement playbook and senior activist leadership, and the fund was ultimately liquidated — its entire Storytel holding sold in August 2024, after the 2021-vintage growth entry had been crushed in the 2022 de-rating.</w:t>
+        <w:t>disclosed holdings included Securitas (services), BHG Group (e-commerce home improvement), Storebrand (savings/insurance), BioGaia (probiotics), AFRY (engineering services) and Storytel (audiobook streaming). Note the drift: from value-gap candidates (Securitas, Storebrand) toward growth-momentum names (BHG, Storytel) as the cycle inflated.</w:t>
       </w:r>
     </w:p>
     <w:p>
@@ -5172,10 +5558,55 @@
         <w:rPr>
           <w:b/>
         </w:rPr>
-        <w:t xml:space="preserve">Lessons designed into this proposal: </w:t>
+        <w:t xml:space="preserve">The Storytel position — the case study within the case study: </w:t>
       </w:r>
       <w:r>
-        <w:t>scale and seed from day one (EUR 150–200m GP commitment, USD 1.5bn target); a partner-level activist hire and US campaign leadership rather than PE generalists; stakes sized for influence (nomination committees / universal proxy), not passive minority positions; entry discipline anchored on ≥30% upside to intrinsic value, not growth momentum; and an evergreen structure so positions are never liquidated on a fund clock at the bottom.</w:t>
+        <w:t>6.6 million shares (~10%) bought in September 2021 — second-largest, later largest shareholder — at the top of the audiobook-growth multiple. No board-seat agenda, no value plan the company was asked to execute; the position was a quality-growth bet held in an engagement wrapper. The 2022 rate-driven de-rating cut the stock by ~80% peak to trough.</w:t>
+      </w:r>
+    </w:p>
+    <w:p>
+      <w:pPr>
+        <w:pStyle w:val="ListBullet"/>
+        <w:spacing w:after="80"/>
+      </w:pPr>
+      <w:r>
+        <w:rPr>
+          <w:b/>
+        </w:rPr>
+        <w:t xml:space="preserve">The ending: </w:t>
+      </w:r>
+      <w:r>
+        <w:t>the fund was wound down, with the entire Storytel holding sold in August 2024 — a forced, fund-clock liquidation at a fraction of entry, into a thin register, by which time the strategy had quietly consumed six years of franchise attention.</w:t>
+      </w:r>
+    </w:p>
+    <w:p>
+      <w:pPr>
+        <w:pStyle w:val="ListBullet"/>
+        <w:spacing w:after="80"/>
+      </w:pPr>
+      <w:r>
+        <w:rPr>
+          <w:b/>
+        </w:rPr>
+        <w:t xml:space="preserve">Why it failed — four design flaws: </w:t>
+      </w:r>
+      <w:r>
+        <w:t>(1) sub-scale capital, so positions were passive minorities without an influence path; (2) no activist leadership — PE professionals running a public book without campaign mechanics; (3) entry discipline anchored on quality and momentum rather than a value gap with a closable catalyst; (4) a finite fund clock that forced selling at the cycle bottom.</w:t>
+      </w:r>
+    </w:p>
+    <w:p>
+      <w:pPr>
+        <w:pStyle w:val="ListBullet"/>
+        <w:spacing w:after="80"/>
+      </w:pPr>
+      <w:r>
+        <w:rPr>
+          <w:b/>
+        </w:rPr>
+        <w:t xml:space="preserve">How this proposal answers each: </w:t>
+      </w:r>
+      <w:r>
+        <w:t>EUR 150–200m GP seed plus a USD 1.5bn target (scale); a partner-level activist Head plus a US campaign Principal (leadership); ≥30% value-gap entries with named catalysts (discipline); and an evergreen structure with a 3-year lock (no forced bottom-tick exits).</w:t>
       </w:r>
     </w:p>
     <w:p>
@@ -5197,17 +5628,10 @@
     </w:p>
     <w:p>
       <w:pPr>
-        <w:pStyle w:val="ListBullet"/>
-        <w:spacing w:after="80"/>
+        <w:pStyle w:val="Heading3"/>
       </w:pPr>
       <w:r>
-        <w:rPr>
-          <w:b/>
-        </w:rPr>
-        <w:t xml:space="preserve">KKR – Henry Schein (2025) — the template. </w:t>
-      </w:r>
-      <w:r>
-        <w:t>Ananym Capital ran a conventional campaign in late 2024 (board refresh, cost cuts, succession, portfolio review). In January 2025 Henry Schein announced a USD 250m strategic investment from KKR with two board seats (Dan Daniel, ex-Danaher; Max Lin, KKR Healthcare); completed May 2025 with KKR at ~12% — the largest non-index holder, with clearance to build to 14.9%. Sponsor activism, in our core healthcare sector, with the activist publicly supportive.</w:t>
+        <w:t>KKR – Henry Schein (2024–26): the full template, step by step</w:t>
       </w:r>
     </w:p>
     <w:p>
@@ -5219,10 +5643,10 @@
         <w:rPr>
           <w:b/>
         </w:rPr>
-        <w:t xml:space="preserve">KKR – US Foods (2020). </w:t>
+        <w:t xml:space="preserve">Step 1 — activist opens (Nov 2024): </w:t>
       </w:r>
       <w:r>
-        <w:t>USD 500m PIPE at the COVID trough with a board seat; patient sponsor capital entered alongside activist pressure (Sachem Head later won seats) and exited into the recovery with strong reported returns.</w:t>
+        <w:t>Ananym Capital discloses a position in the US dental/medical distributor and presses for board refreshment, cost reduction, a CEO succession plan (Stanley Bergman had led since 1989) and a review of the medical distribution business.</w:t>
       </w:r>
     </w:p>
     <w:p>
@@ -5234,10 +5658,10 @@
         <w:rPr>
           <w:b/>
         </w:rPr>
-        <w:t xml:space="preserve">Silver Lake – Expedia / Twitter / Airbnb (2020). </w:t>
+        <w:t xml:space="preserve">Step 2 — sponsor enters (Jan 2025): </w:t>
       </w:r>
       <w:r>
-        <w:t>Crisis PIPEs with board representation — demonstrating sponsors can underwrite public minority positions at speed and govern through the board rather than control.</w:t>
+        <w:t>Henry Schein announces a USD 250m strategic investment from KKR plus two board seats — Dan Daniel (ex-Danaher EVP) and Max Lin (head of KKR Americas healthcare) — with clearance to buy in the open market to 14.9%. The activist publicly supports the outcome.</w:t>
       </w:r>
     </w:p>
     <w:p>
@@ -5249,10 +5673,93 @@
         <w:rPr>
           <w:b/>
         </w:rPr>
-        <w:t xml:space="preserve">Apollo – Western Digital (2023). </w:t>
+        <w:t xml:space="preserve">Step 3 — influence converts (2025–26): </w:t>
       </w:r>
       <w:r>
-        <w:t>USD 900m convertible preferred while Elliott publicly pushed the flash/HDD separation; the split completed in 2025 (SanDisk spin). Sponsor structured capital riding an activist catalyst.</w:t>
+        <w:t>investment completes May 2025 with KKR at ~12%; Bergman announces retirement in July 2025; Frederick Lowery (ex-Thermo Fisher EVP) is appointed CEO effective March 2026; Dan Daniel — KKR's nominee — becomes Independent Chairman in May 2026; the 2026 proxy shows KKR at 16.4% and a smaller board.</w:t>
+      </w:r>
+    </w:p>
+    <w:p>
+      <w:pPr>
+        <w:pStyle w:val="ListBullet"/>
+        <w:spacing w:after="80"/>
+      </w:pPr>
+      <w:r>
+        <w:rPr>
+          <w:b/>
+        </w:rPr>
+        <w:t xml:space="preserve">Read-across: </w:t>
+      </w:r>
+      <w:r>
+        <w:t>in roughly fifteen months a sponsor went from zero to largest active shareholder, the chairmanship, a hand-picked CEO transition and a reshaped board — without a tender offer, in our core healthcare distribution sector. This is the playbook this strategy industrialises.</w:t>
+      </w:r>
+    </w:p>
+    <w:p>
+      <w:pPr>
+        <w:pStyle w:val="Heading3"/>
+      </w:pPr>
+      <w:r>
+        <w:t>Other sponsor entries</w:t>
+      </w:r>
+    </w:p>
+    <w:p>
+      <w:pPr>
+        <w:pStyle w:val="ListBullet"/>
+        <w:spacing w:after="80"/>
+      </w:pPr>
+      <w:r>
+        <w:rPr>
+          <w:b/>
+        </w:rPr>
+        <w:t xml:space="preserve">KKR – US Foods (2020–22). </w:t>
+      </w:r>
+      <w:r>
+        <w:t>USD 500m convertible preferred PIPE at the COVID trough (April 2020) with a board seat, entering alongside activist pressure (Sachem Head separately won representation). Patient capital into a dislocated quality franchise; exited into the recovery with strong reported returns.</w:t>
+      </w:r>
+    </w:p>
+    <w:p>
+      <w:pPr>
+        <w:pStyle w:val="ListBullet"/>
+        <w:spacing w:after="80"/>
+      </w:pPr>
+      <w:r>
+        <w:rPr>
+          <w:b/>
+        </w:rPr>
+        <w:t xml:space="preserve">Silver Lake – Twitter (2020). </w:t>
+      </w:r>
+      <w:r>
+        <w:t>USD 1bn convertible plus a board seat for Egon Durban, negotiated in the middle of Elliott's campaign — sponsor capital arriving as the stabilising partner in an activist situation, the same dual role Nordic Capital can play.</w:t>
+      </w:r>
+    </w:p>
+    <w:p>
+      <w:pPr>
+        <w:pStyle w:val="ListBullet"/>
+        <w:spacing w:after="80"/>
+      </w:pPr>
+      <w:r>
+        <w:rPr>
+          <w:b/>
+        </w:rPr>
+        <w:t xml:space="preserve">Silver Lake &amp; Apollo – Expedia (2020). </w:t>
+      </w:r>
+      <w:r>
+        <w:t>USD 1.2bn of preferred plus warrants with board representation in a crisis raise — speed and governance through the board, not control.</w:t>
+      </w:r>
+    </w:p>
+    <w:p>
+      <w:pPr>
+        <w:pStyle w:val="ListBullet"/>
+        <w:spacing w:after="80"/>
+      </w:pPr>
+      <w:r>
+        <w:rPr>
+          <w:b/>
+        </w:rPr>
+        <w:t xml:space="preserve">Apollo – Western Digital (2023–25). </w:t>
+      </w:r>
+      <w:r>
+        <w:t>USD 900m convertible preferred while Elliott publicly pushed the flash/HDD separation; the SanDisk spin completed in February 2025. Structured sponsor capital riding an activist catalyst to completion.</w:t>
       </w:r>
     </w:p>
     <w:p>
@@ -5267,7 +5774,7 @@
         <w:t xml:space="preserve">Warburg Pincus – ESR Group (2022–25). </w:t>
       </w:r>
       <w:r>
-        <w:t>Long-held minority stake in the listed Asian logistics platform converted into co-leading the ~USD 7bn take-private — the toehold-to-buyout path this strategy's take-private protocol formalises.</w:t>
+        <w:t>Co-founder and long-time large minority holder of the HK-listed logistics platform, ultimately co-leading the ~USD 7bn take-private consortium (with Starwood and others), delisted 2025 — the toehold-to-buyout path this strategy's take-private protocol formalises.</w:t>
       </w:r>
     </w:p>
     <w:p>
@@ -5282,7 +5789,7 @@
         <w:t xml:space="preserve">Read-across: </w:t>
       </w:r>
       <w:r>
-        <w:t>operating credibility plus board seats is the winning currency of the universal-proxy era, sponsors are arriving now, and the toehold-to-influence (and occasionally to-control) path is repeatable. Nordic Capital would be early among European sponsors — but not first in the world, which de-risks the LP conversation.</w:t>
+        <w:t>operating credibility plus board seats is the winning currency of the universal-proxy era; sponsors are arriving now, and the toehold-to-influence (occasionally to-control) path is repeatable. Nordic Capital would be early among European sponsors — but not first in the world, which de-risks the LP conversation.</w:t>
       </w:r>
     </w:p>
     <w:p>
@@ -5302,10 +5809,10 @@
         <w:rPr>
           <w:b/>
         </w:rPr>
-        <w:t xml:space="preserve">Triton – Caverion (FI, 2022–23): </w:t>
+        <w:t xml:space="preserve">Triton – Caverion (FI, 2022–23) — the Nordic take-private bidding war: </w:t>
       </w:r>
       <w:r>
-        <w:t>sponsor stake-building in a listed Nordic services company escalated into a competing tender battle (Bain consortium vs Triton), completed 2023 at a large premium to the undisturbed price — evidence that public stakes create take-private optionality at premium outcomes.</w:t>
+        <w:t>a Bain Capital-led consortium (North Holdings) launched a tender offer for the Finnish building-services group in November 2022; Triton's Crayfish BidCo countered in January 2023 at ~EUR 1.09bn; Bain improved on 24 January; Triton improved again on 24 February to ~EUR 1.22bn equity value. Bain's matching right expired on 4 April 2023 without a raise, the board switched its recommendation to Triton, and the offer was declared unconditional in October 2023 (with a minor FCCA remedy). Evidence that listed Nordic mid-caps can ignite sponsor bidding wars — a toehold position participates in that premium escalation rather than paying it.</w:t>
       </w:r>
     </w:p>
     <w:p>

</xml_diff>

<commit_message>
Add detailed case studies: EQT Public Value, Irenic, Ananym
Restructure EQT Public Value into a full case study with holdings table
and a four-flaw failure analysis mapped to design answers. Add A.5
covering new-generation strategic activists Irenic (Katz, ex-Elliott)
and Ananym (Penner, ex-Engine No. 1) with company-by-company thesis
tables. New deck appendix slide (3/3) summarizing all three.

https://claude.ai/code/session_014wJkiGJDWLqynffcMLAwBq
</commit_message>
<xml_diff>
--- a/nordic-capital-activism-pitch/Nordic_Capital_Engaged_Equities_Pitch.docx
+++ b/nordic-capital-activism-pitch/Nordic_Capital_Engaged_Equities_Pitch.docx
@@ -5507,7 +5507,7 @@
         <w:pStyle w:val="Heading2"/>
       </w:pPr>
       <w:r>
-        <w:t>A.2 EQT Public Value — the cautionary precedent</w:t>
+        <w:t>A.2 Case Study: EQT Public Value — the cautionary precedent</w:t>
       </w:r>
     </w:p>
     <w:p>
@@ -5516,7 +5516,16 @@
           <w:b w:val="0"/>
           <w:i w:val="0"/>
         </w:rPr>
-        <w:t>The closest structural precedent to this proposal — a top-tier Nordic sponsor applying its toolbox to listed mid-caps — and therefore the most important one to study, because it failed on design, not on concept.</w:t>
+        <w:t>This is the single most important precedent for the proposal, because it is its closest structural analogue — a top-tier Nordic private equity sponsor applying its toolbox to listed mid-caps — and it failed. Critically, it failed on design, not on concept: the thesis that PE skills can create value in public markets was never properly tested, because the vehicle was built in a way that prevented the toolbox from ever being used. Every structural choice in Sections 4, 8 and 9 of this document is, in part, a direct response to a specific EQT Public Value error.</w:t>
+      </w:r>
+    </w:p>
+    <w:p>
+      <w:r>
+        <w:rPr>
+          <w:b/>
+          <w:i w:val="0"/>
+        </w:rPr>
+        <w:t>Background.</w:t>
       </w:r>
     </w:p>
     <w:p>
@@ -5525,13 +5534,7 @@
         <w:spacing w:after="80"/>
       </w:pPr>
       <w:r>
-        <w:rPr>
-          <w:b/>
-        </w:rPr>
-        <w:t xml:space="preserve">The set-up (2018–19): </w:t>
-      </w:r>
-      <w:r>
-        <w:t>EQT launched Public Value to invest in listed Nordic mid-caps “with the EQT toolbox.” External fundraising met lukewarm LP reception and never reached intended scale; the strategy continued at sub-scale rather than being re-designed or shelved — the first compounding error.</w:t>
+        <w:t>EQT AB launched EQT Public Value in 2018–19 to invest in listed Nordic companies where it believed “the EQT toolbox” — operational improvement, board work, M&amp;A — could create value. The pitch was almost identical in spirit to this one.</w:t>
       </w:r>
     </w:p>
     <w:p>
@@ -5540,13 +5543,7 @@
         <w:spacing w:after="80"/>
       </w:pPr>
       <w:r>
-        <w:rPr>
-          <w:b/>
-        </w:rPr>
-        <w:t xml:space="preserve">The book: </w:t>
-      </w:r>
-      <w:r>
-        <w:t>disclosed holdings included Securitas (services), BHG Group (e-commerce home improvement), Storebrand (savings/insurance), BioGaia (probiotics), AFRY (engineering services) and Storytel (audiobook streaming). Note the drift: from value-gap candidates (Securitas, Storebrand) toward growth-momentum names (BHG, Storytel) as the cycle inflated.</w:t>
+        <w:t>It was conceived as a complement to EQT's private funds, run by EQT professionals, and seeded/anchored by EQT and its network rather than raised at scale from dedicated public-equity or activist LPs.</w:t>
       </w:r>
     </w:p>
     <w:p>
@@ -5555,13 +5552,479 @@
         <w:spacing w:after="80"/>
       </w:pPr>
       <w:r>
+        <w:t>External fundraising met a lukewarm reception — listed equity sat awkwardly between EQT's PE identity and what public-markets LPs wanted — and the strategy never reached the scale needed to take influential positions. Rather than redesign or shelve it, EQT ran it at sub-scale. That was the first compounding error.</w:t>
+      </w:r>
+    </w:p>
+    <w:p>
+      <w:r>
         <w:rPr>
           <w:b/>
+          <w:i w:val="0"/>
         </w:rPr>
-        <w:t xml:space="preserve">The Storytel position — the case study within the case study: </w:t>
+        <w:t>The book.</w:t>
       </w:r>
+    </w:p>
+    <w:p>
       <w:r>
-        <w:t>6.6 million shares (~10%) bought in September 2021 — second-largest, later largest shareholder — at the top of the audiobook-growth multiple. No board-seat agenda, no value plan the company was asked to execute; the position was a quality-growth bet held in an engagement wrapper. The 2022 rate-driven de-rating cut the stock by ~80% peak to trough.</w:t>
+        <w:rPr>
+          <w:b w:val="0"/>
+          <w:i w:val="0"/>
+        </w:rPr>
+        <w:t>Disclosed holdings over the fund's life included the following. Note the drift over time from value-gap candidates toward growth-momentum names as the 2020–21 bull market inflated:</w:t>
+      </w:r>
+    </w:p>
+    <w:tbl>
+      <w:tblPr>
+        <w:tblStyle w:val="TableGrid"/>
+        <w:tblW w:type="auto" w:w="0"/>
+        <w:jc w:val="center"/>
+        <w:tblLook w:firstColumn="1" w:firstRow="1" w:lastColumn="0" w:lastRow="0" w:noHBand="0" w:noVBand="1" w:val="04A0"/>
+      </w:tblPr>
+      <w:tblGrid>
+        <w:gridCol w:w="2160"/>
+        <w:gridCol w:w="2160"/>
+        <w:gridCol w:w="2160"/>
+        <w:gridCol w:w="2160"/>
+      </w:tblGrid>
+      <w:tr>
+        <w:tc>
+          <w:tcPr>
+            <w:tcW w:type="dxa" w:w="1728"/>
+            <w:shd w:fill="0B2545"/>
+          </w:tcPr>
+          <w:p>
+            <w:r/>
+            <w:r>
+              <w:rPr>
+                <w:b/>
+                <w:color w:val="FFFFFF"/>
+                <w:sz w:val="19"/>
+              </w:rPr>
+              <w:t>Holding</w:t>
+            </w:r>
+          </w:p>
+        </w:tc>
+        <w:tc>
+          <w:tcPr>
+            <w:tcW w:type="dxa" w:w="2448"/>
+            <w:shd w:fill="0B2545"/>
+          </w:tcPr>
+          <w:p>
+            <w:r/>
+            <w:r>
+              <w:rPr>
+                <w:b/>
+                <w:color w:val="FFFFFF"/>
+                <w:sz w:val="19"/>
+              </w:rPr>
+              <w:t>Sector</w:t>
+            </w:r>
+          </w:p>
+        </w:tc>
+        <w:tc>
+          <w:tcPr>
+            <w:tcW w:type="dxa" w:w="2880"/>
+            <w:shd w:fill="0B2545"/>
+          </w:tcPr>
+          <w:p>
+            <w:r/>
+            <w:r>
+              <w:rPr>
+                <w:b/>
+                <w:color w:val="FFFFFF"/>
+                <w:sz w:val="19"/>
+              </w:rPr>
+              <w:t>Implied thesis</w:t>
+            </w:r>
+          </w:p>
+        </w:tc>
+        <w:tc>
+          <w:tcPr>
+            <w:tcW w:type="dxa" w:w="3024"/>
+            <w:shd w:fill="0B2545"/>
+          </w:tcPr>
+          <w:p>
+            <w:r/>
+            <w:r>
+              <w:rPr>
+                <w:b/>
+                <w:color w:val="FFFFFF"/>
+                <w:sz w:val="19"/>
+              </w:rPr>
+              <w:t>What actually drove the position</w:t>
+            </w:r>
+          </w:p>
+        </w:tc>
+      </w:tr>
+      <w:tr>
+        <w:tc>
+          <w:tcPr>
+            <w:tcW w:type="dxa" w:w="1728"/>
+          </w:tcPr>
+          <w:p>
+            <w:r/>
+            <w:r>
+              <w:rPr>
+                <w:sz w:val="19"/>
+              </w:rPr>
+              <w:t>Securitas</w:t>
+            </w:r>
+          </w:p>
+        </w:tc>
+        <w:tc>
+          <w:tcPr>
+            <w:tcW w:type="dxa" w:w="2448"/>
+          </w:tcPr>
+          <w:p>
+            <w:r/>
+            <w:r>
+              <w:rPr>
+                <w:sz w:val="19"/>
+              </w:rPr>
+              <w:t>Guarding / security services</w:t>
+            </w:r>
+          </w:p>
+        </w:tc>
+        <w:tc>
+          <w:tcPr>
+            <w:tcW w:type="dxa" w:w="2880"/>
+          </w:tcPr>
+          <w:p>
+            <w:r/>
+            <w:r>
+              <w:rPr>
+                <w:sz w:val="19"/>
+              </w:rPr>
+              <w:t>Margin uplift, tech-enablement, portfolio focus — a genuine self-help / value-gap case.</w:t>
+            </w:r>
+          </w:p>
+        </w:tc>
+        <w:tc>
+          <w:tcPr>
+            <w:tcW w:type="dxa" w:w="3024"/>
+          </w:tcPr>
+          <w:p>
+            <w:r/>
+            <w:r>
+              <w:rPr>
+                <w:sz w:val="19"/>
+              </w:rPr>
+              <w:t>Sound thesis, but the stake was never large enough to drive board change; Securitas's own program (and later activists) did the work.</w:t>
+            </w:r>
+          </w:p>
+        </w:tc>
+      </w:tr>
+      <w:tr>
+        <w:tc>
+          <w:tcPr>
+            <w:tcW w:type="dxa" w:w="1728"/>
+            <w:shd w:fill="F2F4F8"/>
+          </w:tcPr>
+          <w:p>
+            <w:r/>
+            <w:r>
+              <w:rPr>
+                <w:sz w:val="19"/>
+              </w:rPr>
+              <w:t>Storebrand</w:t>
+            </w:r>
+          </w:p>
+        </w:tc>
+        <w:tc>
+          <w:tcPr>
+            <w:tcW w:type="dxa" w:w="2448"/>
+            <w:shd w:fill="F2F4F8"/>
+          </w:tcPr>
+          <w:p>
+            <w:r/>
+            <w:r>
+              <w:rPr>
+                <w:sz w:val="19"/>
+              </w:rPr>
+              <w:t>Savings &amp; insurance (NO)</w:t>
+            </w:r>
+          </w:p>
+        </w:tc>
+        <w:tc>
+          <w:tcPr>
+            <w:tcW w:type="dxa" w:w="2880"/>
+            <w:shd w:fill="F2F4F8"/>
+          </w:tcPr>
+          <w:p>
+            <w:r/>
+            <w:r>
+              <w:rPr>
+                <w:sz w:val="19"/>
+              </w:rPr>
+              <w:t>Capital return, cost discipline, re-rating of a complex financial — a legitimate value-gap target.</w:t>
+            </w:r>
+          </w:p>
+        </w:tc>
+        <w:tc>
+          <w:tcPr>
+            <w:tcW w:type="dxa" w:w="3024"/>
+            <w:shd w:fill="F2F4F8"/>
+          </w:tcPr>
+          <w:p>
+            <w:r/>
+            <w:r>
+              <w:rPr>
+                <w:sz w:val="19"/>
+              </w:rPr>
+              <w:t>Reasonable holding; again, a passive minority with no influence path.</w:t>
+            </w:r>
+          </w:p>
+        </w:tc>
+      </w:tr>
+      <w:tr>
+        <w:tc>
+          <w:tcPr>
+            <w:tcW w:type="dxa" w:w="1728"/>
+          </w:tcPr>
+          <w:p>
+            <w:r/>
+            <w:r>
+              <w:rPr>
+                <w:sz w:val="19"/>
+              </w:rPr>
+              <w:t>AFRY (ÅF Pöyry)</w:t>
+            </w:r>
+          </w:p>
+        </w:tc>
+        <w:tc>
+          <w:tcPr>
+            <w:tcW w:type="dxa" w:w="2448"/>
+          </w:tcPr>
+          <w:p>
+            <w:r/>
+            <w:r>
+              <w:rPr>
+                <w:sz w:val="19"/>
+              </w:rPr>
+              <w:t>Engineering &amp; design consultancy</w:t>
+            </w:r>
+          </w:p>
+        </w:tc>
+        <w:tc>
+          <w:tcPr>
+            <w:tcW w:type="dxa" w:w="2880"/>
+          </w:tcPr>
+          <w:p>
+            <w:r/>
+            <w:r>
+              <w:rPr>
+                <w:sz w:val="19"/>
+              </w:rPr>
+              <w:t>Consolidation and margin convergence to Nordic peers.</w:t>
+            </w:r>
+          </w:p>
+        </w:tc>
+        <w:tc>
+          <w:tcPr>
+            <w:tcW w:type="dxa" w:w="3024"/>
+          </w:tcPr>
+          <w:p>
+            <w:r/>
+            <w:r>
+              <w:rPr>
+                <w:sz w:val="19"/>
+              </w:rPr>
+              <w:t>Cyclical professional-services exposure; no catalyst forced.</w:t>
+            </w:r>
+          </w:p>
+        </w:tc>
+      </w:tr>
+      <w:tr>
+        <w:tc>
+          <w:tcPr>
+            <w:tcW w:type="dxa" w:w="1728"/>
+            <w:shd w:fill="F2F4F8"/>
+          </w:tcPr>
+          <w:p>
+            <w:r/>
+            <w:r>
+              <w:rPr>
+                <w:sz w:val="19"/>
+              </w:rPr>
+              <w:t>BioGaia</w:t>
+            </w:r>
+          </w:p>
+        </w:tc>
+        <w:tc>
+          <w:tcPr>
+            <w:tcW w:type="dxa" w:w="2448"/>
+            <w:shd w:fill="F2F4F8"/>
+          </w:tcPr>
+          <w:p>
+            <w:r/>
+            <w:r>
+              <w:rPr>
+                <w:sz w:val="19"/>
+              </w:rPr>
+              <w:t>Probiotics / consumer health</w:t>
+            </w:r>
+          </w:p>
+        </w:tc>
+        <w:tc>
+          <w:tcPr>
+            <w:tcW w:type="dxa" w:w="2880"/>
+            <w:shd w:fill="F2F4F8"/>
+          </w:tcPr>
+          <w:p>
+            <w:r/>
+            <w:r>
+              <w:rPr>
+                <w:sz w:val="19"/>
+              </w:rPr>
+              <w:t>Quality compounder, international expansion.</w:t>
+            </w:r>
+          </w:p>
+        </w:tc>
+        <w:tc>
+          <w:tcPr>
+            <w:tcW w:type="dxa" w:w="3024"/>
+            <w:shd w:fill="F2F4F8"/>
+          </w:tcPr>
+          <w:p>
+            <w:r/>
+            <w:r>
+              <w:rPr>
+                <w:sz w:val="19"/>
+              </w:rPr>
+              <w:t>Growth/quality bet, not a value-gap or catalyst story.</w:t>
+            </w:r>
+          </w:p>
+        </w:tc>
+      </w:tr>
+      <w:tr>
+        <w:tc>
+          <w:tcPr>
+            <w:tcW w:type="dxa" w:w="1728"/>
+          </w:tcPr>
+          <w:p>
+            <w:r/>
+            <w:r>
+              <w:rPr>
+                <w:sz w:val="19"/>
+              </w:rPr>
+              <w:t>BHG Group</w:t>
+            </w:r>
+          </w:p>
+        </w:tc>
+        <w:tc>
+          <w:tcPr>
+            <w:tcW w:type="dxa" w:w="2448"/>
+          </w:tcPr>
+          <w:p>
+            <w:r/>
+            <w:r>
+              <w:rPr>
+                <w:sz w:val="19"/>
+              </w:rPr>
+              <w:t>E-commerce (home improvement)</w:t>
+            </w:r>
+          </w:p>
+        </w:tc>
+        <w:tc>
+          <w:tcPr>
+            <w:tcW w:type="dxa" w:w="2880"/>
+          </w:tcPr>
+          <w:p>
+            <w:r/>
+            <w:r>
+              <w:rPr>
+                <w:sz w:val="19"/>
+              </w:rPr>
+              <w:t>Online penetration growth; consolidation of a fragmented category.</w:t>
+            </w:r>
+          </w:p>
+        </w:tc>
+        <w:tc>
+          <w:tcPr>
+            <w:tcW w:type="dxa" w:w="3024"/>
+          </w:tcPr>
+          <w:p>
+            <w:r/>
+            <w:r>
+              <w:rPr>
+                <w:sz w:val="19"/>
+              </w:rPr>
+              <w:t>Pandemic-era growth-momentum name; de-rated severely as e-commerce multiples collapsed in 2022.</w:t>
+            </w:r>
+          </w:p>
+        </w:tc>
+      </w:tr>
+      <w:tr>
+        <w:tc>
+          <w:tcPr>
+            <w:tcW w:type="dxa" w:w="1728"/>
+            <w:shd w:fill="F2F4F8"/>
+          </w:tcPr>
+          <w:p>
+            <w:r/>
+            <w:r>
+              <w:rPr>
+                <w:sz w:val="19"/>
+              </w:rPr>
+              <w:t>Storytel</w:t>
+            </w:r>
+          </w:p>
+        </w:tc>
+        <w:tc>
+          <w:tcPr>
+            <w:tcW w:type="dxa" w:w="2448"/>
+            <w:shd w:fill="F2F4F8"/>
+          </w:tcPr>
+          <w:p>
+            <w:r/>
+            <w:r>
+              <w:rPr>
+                <w:sz w:val="19"/>
+              </w:rPr>
+              <w:t>Audiobook / e-book streaming</w:t>
+            </w:r>
+          </w:p>
+        </w:tc>
+        <w:tc>
+          <w:tcPr>
+            <w:tcW w:type="dxa" w:w="2880"/>
+            <w:shd w:fill="F2F4F8"/>
+          </w:tcPr>
+          <w:p>
+            <w:r/>
+            <w:r>
+              <w:rPr>
+                <w:sz w:val="19"/>
+              </w:rPr>
+              <w:t>Subscriber growth, international roll-out, category leadership.</w:t>
+            </w:r>
+          </w:p>
+        </w:tc>
+        <w:tc>
+          <w:tcPr>
+            <w:tcW w:type="dxa" w:w="3024"/>
+            <w:shd w:fill="F2F4F8"/>
+          </w:tcPr>
+          <w:p>
+            <w:r/>
+            <w:r>
+              <w:rPr>
+                <w:sz w:val="19"/>
+              </w:rPr>
+              <w:t>The clearest momentum entry — see below. The de-rating was catastrophic.</w:t>
+            </w:r>
+          </w:p>
+        </w:tc>
+      </w:tr>
+    </w:tbl>
+    <w:p/>
+    <w:p>
+      <w:r>
+        <w:rPr>
+          <w:b/>
+          <w:i w:val="0"/>
+        </w:rPr>
+        <w:t>The Storytel position — the case study within the case study.</w:t>
       </w:r>
     </w:p>
     <w:p>
@@ -5570,13 +6033,7 @@
         <w:spacing w:after="80"/>
       </w:pPr>
       <w:r>
-        <w:rPr>
-          <w:b/>
-        </w:rPr>
-        <w:t xml:space="preserve">The ending: </w:t>
-      </w:r>
-      <w:r>
-        <w:t>the fund was wound down, with the entire Storytel holding sold in August 2024 — a forced, fund-clock liquidation at a fraction of entry, into a thin register, by which time the strategy had quietly consumed six years of franchise attention.</w:t>
+        <w:t>In September 2021, near the top of the audiobook-growth multiple, EQT Public Value bought ~6.6 million shares — close to 10% — becoming the second-largest, and later the largest, shareholder.</w:t>
       </w:r>
     </w:p>
     <w:p>
@@ -5585,13 +6042,7 @@
         <w:spacing w:after="80"/>
       </w:pPr>
       <w:r>
-        <w:rPr>
-          <w:b/>
-        </w:rPr>
-        <w:t xml:space="preserve">Why it failed — four design flaws: </w:t>
-      </w:r>
-      <w:r>
-        <w:t>(1) sub-scale capital, so positions were passive minorities without an influence path; (2) no activist leadership — PE professionals running a public book without campaign mechanics; (3) entry discipline anchored on quality and momentum rather than a value gap with a closable catalyst; (4) a finite fund clock that forced selling at the cycle bottom.</w:t>
+        <w:t>Crucially, there was no board-seat agenda and no value plan the company was asked to execute. The position was, in substance, a long-only quality-growth bet held inside an engagement wrapper — exactly what a PE sponsor's public vehicle should not be.</w:t>
       </w:r>
     </w:p>
     <w:p>
@@ -5600,13 +6051,283 @@
         <w:spacing w:after="80"/>
       </w:pPr>
       <w:r>
+        <w:t>As rates rose through 2022, Storytel de-rated by roughly 80% peak-to-trough along with the entire unprofitable-growth complex. With no catalyst and no board influence, EQT had no lever to pull other than to wait or sell.</w:t>
+      </w:r>
+    </w:p>
+    <w:p>
+      <w:pPr>
+        <w:pStyle w:val="ListBullet"/>
+        <w:spacing w:after="80"/>
+      </w:pPr>
+      <w:r>
+        <w:t>When EQT decided to wind the fund down, it sold the entire Storytel holding in August 2024 — a forced, fund-clock liquidation at a fraction of the entry price, into a thin Nordic register, by which time the strategy had quietly consumed roughly six years of franchise attention for little return.</w:t>
+      </w:r>
+    </w:p>
+    <w:p>
+      <w:r>
         <w:rPr>
           <w:b/>
+          <w:i w:val="0"/>
         </w:rPr>
-        <w:t xml:space="preserve">How this proposal answers each: </w:t>
+        <w:t>Why it failed — four design flaws, and how this proposal answers each.</w:t>
       </w:r>
+    </w:p>
+    <w:tbl>
+      <w:tblPr>
+        <w:tblStyle w:val="TableGrid"/>
+        <w:tblW w:type="auto" w:w="0"/>
+        <w:jc w:val="center"/>
+        <w:tblLook w:firstColumn="1" w:firstRow="1" w:lastColumn="0" w:lastRow="0" w:noHBand="0" w:noVBand="1" w:val="04A0"/>
+      </w:tblPr>
+      <w:tblGrid>
+        <w:gridCol w:w="2880"/>
+        <w:gridCol w:w="2880"/>
+        <w:gridCol w:w="2880"/>
+      </w:tblGrid>
+      <w:tr>
+        <w:tc>
+          <w:tcPr>
+            <w:tcW w:type="dxa" w:w="2592"/>
+            <w:shd w:fill="0B2545"/>
+          </w:tcPr>
+          <w:p>
+            <w:r/>
+            <w:r>
+              <w:rPr>
+                <w:b/>
+                <w:color w:val="FFFFFF"/>
+                <w:sz w:val="19"/>
+              </w:rPr>
+              <w:t>EQT Public Value flaw</w:t>
+            </w:r>
+          </w:p>
+        </w:tc>
+        <w:tc>
+          <w:tcPr>
+            <w:tcW w:type="dxa" w:w="3456"/>
+            <w:shd w:fill="0B2545"/>
+          </w:tcPr>
+          <w:p>
+            <w:r/>
+            <w:r>
+              <w:rPr>
+                <w:b/>
+                <w:color w:val="FFFFFF"/>
+                <w:sz w:val="19"/>
+              </w:rPr>
+              <w:t>Consequence</w:t>
+            </w:r>
+          </w:p>
+        </w:tc>
+        <w:tc>
+          <w:tcPr>
+            <w:tcW w:type="dxa" w:w="3744"/>
+            <w:shd w:fill="0B2545"/>
+          </w:tcPr>
+          <w:p>
+            <w:r/>
+            <w:r>
+              <w:rPr>
+                <w:b/>
+                <w:color w:val="FFFFFF"/>
+                <w:sz w:val="19"/>
+              </w:rPr>
+              <w:t>This proposal's answer</w:t>
+            </w:r>
+          </w:p>
+        </w:tc>
+      </w:tr>
+      <w:tr>
+        <w:tc>
+          <w:tcPr>
+            <w:tcW w:type="dxa" w:w="2592"/>
+          </w:tcPr>
+          <w:p>
+            <w:r/>
+            <w:r>
+              <w:rPr>
+                <w:sz w:val="19"/>
+              </w:rPr>
+              <w:t>Sub-scale capital</w:t>
+            </w:r>
+          </w:p>
+        </w:tc>
+        <w:tc>
+          <w:tcPr>
+            <w:tcW w:type="dxa" w:w="3456"/>
+          </w:tcPr>
+          <w:p>
+            <w:r/>
+            <w:r>
+              <w:rPr>
+                <w:sz w:val="19"/>
+              </w:rPr>
+              <w:t>Positions were passive minorities with no path to board influence; the “toolbox” could never be deployed.</w:t>
+            </w:r>
+          </w:p>
+        </w:tc>
+        <w:tc>
+          <w:tcPr>
+            <w:tcW w:type="dxa" w:w="3744"/>
+          </w:tcPr>
+          <w:p>
+            <w:r/>
+            <w:r>
+              <w:rPr>
+                <w:sz w:val="19"/>
+              </w:rPr>
+              <w:t>EUR 150–200m GP seed + USD 1.5bn target; positions sized to 2–10% for nomination-committee (EU) / universal-proxy (US) influence (§4, §6, §8).</w:t>
+            </w:r>
+          </w:p>
+        </w:tc>
+      </w:tr>
+      <w:tr>
+        <w:tc>
+          <w:tcPr>
+            <w:tcW w:type="dxa" w:w="2592"/>
+            <w:shd w:fill="F2F4F8"/>
+          </w:tcPr>
+          <w:p>
+            <w:r/>
+            <w:r>
+              <w:rPr>
+                <w:sz w:val="19"/>
+              </w:rPr>
+              <w:t>No activist leadership</w:t>
+            </w:r>
+          </w:p>
+        </w:tc>
+        <w:tc>
+          <w:tcPr>
+            <w:tcW w:type="dxa" w:w="3456"/>
+            <w:shd w:fill="F2F4F8"/>
+          </w:tcPr>
+          <w:p>
+            <w:r/>
+            <w:r>
+              <w:rPr>
+                <w:sz w:val="19"/>
+              </w:rPr>
+              <w:t>PE generalists ran a public book without campaign mechanics — no proxy, nomination-committee or settlement expertise.</w:t>
+            </w:r>
+          </w:p>
+        </w:tc>
+        <w:tc>
+          <w:tcPr>
+            <w:tcW w:type="dxa" w:w="3744"/>
+            <w:shd w:fill="F2F4F8"/>
+          </w:tcPr>
+          <w:p>
+            <w:r/>
+            <w:r>
+              <w:rPr>
+                <w:sz w:val="19"/>
+              </w:rPr>
+              <w:t>Partner-level Head of Engaged Equities + a dedicated US campaign Principal (Knut Nyman) hired from the activist front line (§9).</w:t>
+            </w:r>
+          </w:p>
+        </w:tc>
+      </w:tr>
+      <w:tr>
+        <w:tc>
+          <w:tcPr>
+            <w:tcW w:type="dxa" w:w="2592"/>
+          </w:tcPr>
+          <w:p>
+            <w:r/>
+            <w:r>
+              <w:rPr>
+                <w:sz w:val="19"/>
+              </w:rPr>
+              <w:t>Wrong entry discipline</w:t>
+            </w:r>
+          </w:p>
+        </w:tc>
+        <w:tc>
+          <w:tcPr>
+            <w:tcW w:type="dxa" w:w="3456"/>
+          </w:tcPr>
+          <w:p>
+            <w:r/>
+            <w:r>
+              <w:rPr>
+                <w:sz w:val="19"/>
+              </w:rPr>
+              <w:t>Names selected on quality and growth momentum, not on a value gap with a closable catalyst; the book inflated and then de-rated.</w:t>
+            </w:r>
+          </w:p>
+        </w:tc>
+        <w:tc>
+          <w:tcPr>
+            <w:tcW w:type="dxa" w:w="3744"/>
+          </w:tcPr>
+          <w:p>
+            <w:r/>
+            <w:r>
+              <w:rPr>
+                <w:sz w:val="19"/>
+              </w:rPr>
+              <w:t>≥30% upside to intrinsic value with a named, company-controllable catalyst; explicit no-momentum rule; red-team underwriting (§4).</w:t>
+            </w:r>
+          </w:p>
+        </w:tc>
+      </w:tr>
+      <w:tr>
+        <w:tc>
+          <w:tcPr>
+            <w:tcW w:type="dxa" w:w="2592"/>
+            <w:shd w:fill="F2F4F8"/>
+          </w:tcPr>
+          <w:p>
+            <w:r/>
+            <w:r>
+              <w:rPr>
+                <w:sz w:val="19"/>
+              </w:rPr>
+              <w:t>Finite fund clock</w:t>
+            </w:r>
+          </w:p>
+        </w:tc>
+        <w:tc>
+          <w:tcPr>
+            <w:tcW w:type="dxa" w:w="3456"/>
+            <w:shd w:fill="F2F4F8"/>
+          </w:tcPr>
+          <w:p>
+            <w:r/>
+            <w:r>
+              <w:rPr>
+                <w:sz w:val="19"/>
+              </w:rPr>
+              <w:t>A wind-down forced selling at the cycle bottom into illiquid registers.</w:t>
+            </w:r>
+          </w:p>
+        </w:tc>
+        <w:tc>
+          <w:tcPr>
+            <w:tcW w:type="dxa" w:w="3744"/>
+            <w:shd w:fill="F2F4F8"/>
+          </w:tcPr>
+          <w:p>
+            <w:r/>
+            <w:r>
+              <w:rPr>
+                <w:sz w:val="19"/>
+              </w:rPr>
+              <w:t>Evergreen structure with a 3-year soft lock and investor-level gates — the fund is never a forced seller (§8).</w:t>
+            </w:r>
+          </w:p>
+        </w:tc>
+      </w:tr>
+    </w:tbl>
+    <w:p/>
+    <w:p>
       <w:r>
-        <w:t>EUR 150–200m GP seed plus a USD 1.5bn target (scale); a partner-level activist Head plus a US campaign Principal (leadership); ≥30% value-gap entries with named catalysts (discipline); and an evergreen structure with a 3-year lock (no forced bottom-tick exits).</w:t>
+        <w:rPr>
+          <w:b w:val="0"/>
+          <w:i/>
+        </w:rPr>
+        <w:t>The lesson is not that EQT was wrong about the opportunity — it is that a PE sponsor's public-markets vehicle only works if it is built, from day one, as an engagement platform (scale, activist leadership, catalyst discipline, patient capital) rather than as a long-only fund with a famous logo. That is precisely the gap this proposal is designed to fill.</w:t>
       </w:r>
     </w:p>
     <w:p>
@@ -5828,6 +6549,1207 @@
       </w:r>
       <w:r>
         <w:t>ex-Cevian partners launched a Nordic/European engagement strategy, confirming institutional LP appetite — and starting the clock on the competitive window this proposal addresses.</w:t>
+      </w:r>
+    </w:p>
+    <w:p>
+      <w:r>
+        <w:br w:type="page"/>
+      </w:r>
+    </w:p>
+    <w:p>
+      <w:pPr>
+        <w:pStyle w:val="Heading2"/>
+      </w:pPr>
+      <w:r>
+        <w:t>A.5 Case Study: The New-Generation Strategic Activists — Irenic &amp; Ananym</w:t>
+      </w:r>
+    </w:p>
+    <w:p>
+      <w:r>
+        <w:rPr>
+          <w:b w:val="0"/>
+          <w:i w:val="0"/>
+        </w:rPr>
+        <w:t>Two recently launched US activists, both founded by alumni of the firms whose DNA this strategy draws on (Elliott, JANA, Engine No. 1), are the clearest live evidence that a concentrated, separation-and-sale “strategic activism” book — precisely the conglomerate / SOTP archetype in Section 4.3 — works at the EUR/USD mid-cap scale this fund targets. They are both a competitive benchmark and a recruiting/idea-sourcing map. Notably, both are spiritually adjacent to Knut Nyman's own Elliott lineage.</w:t>
+      </w:r>
+    </w:p>
+    <w:p>
+      <w:pPr>
+        <w:pStyle w:val="Heading3"/>
+      </w:pPr>
+      <w:r>
+        <w:t>A.5.1 Irenic Capital Management</w:t>
+      </w:r>
+    </w:p>
+    <w:p>
+      <w:pPr>
+        <w:pStyle w:val="ListBullet"/>
+        <w:spacing w:after="80"/>
+      </w:pPr>
+      <w:r>
+        <w:rPr>
+          <w:b/>
+        </w:rPr>
+        <w:t xml:space="preserve">Founded: </w:t>
+      </w:r>
+      <w:r>
+        <w:t>October 2021 by Adam Katz (former Associate Portfolio Manager at Elliott Management, where he ran public-equity activism, PE and distressed situations exceeding USD 1bn) and Andy Dodge (former investment partner at Indaba Capital, now Director of Research).</w:t>
+      </w:r>
+    </w:p>
+    <w:p>
+      <w:pPr>
+        <w:pStyle w:val="ListBullet"/>
+        <w:spacing w:after="80"/>
+      </w:pPr>
+      <w:r>
+        <w:rPr>
+          <w:b/>
+        </w:rPr>
+        <w:t xml:space="preserve">Scale &amp; performance: </w:t>
+      </w:r>
+      <w:r>
+        <w:t>launched with ~USD 335m; ~USD 2.5bn AUM by March 2026. Hedge fund (live since August 2022) reportedly +14% (2023), +19% (2024), +17% (2025); a top-ten activist by campaign count in 2025 (Barclays). Now extending into private equity (hired an ex-Apollo partner) and a ~USD 220m industrials SPAC.</w:t>
+      </w:r>
+    </w:p>
+    <w:p>
+      <w:pPr>
+        <w:pStyle w:val="ListBullet"/>
+        <w:spacing w:after="80"/>
+      </w:pPr>
+      <w:r>
+        <w:rPr>
+          <w:b/>
+        </w:rPr>
+        <w:t xml:space="preserve">Strategy: </w:t>
+      </w:r>
+      <w:r>
+        <w:t>“strategic activism” — almost always a sum-of-the-parts thesis resolved by a spin-off, divestiture or outright sale, pursued constructively first and via board settlements rather than scorched-earth proxy fights. Sector-agnostic but tilted to industrials, media and software.</w:t>
+      </w:r>
+    </w:p>
+    <w:p>
+      <w:r>
+        <w:rPr>
+          <w:b/>
+          <w:i w:val="0"/>
+        </w:rPr>
+        <w:t>Selected campaigns and theses:</w:t>
+      </w:r>
+    </w:p>
+    <w:tbl>
+      <w:tblPr>
+        <w:tblStyle w:val="TableGrid"/>
+        <w:tblW w:type="auto" w:w="0"/>
+        <w:jc w:val="center"/>
+        <w:tblLook w:firstColumn="1" w:firstRow="1" w:lastColumn="0" w:lastRow="0" w:noHBand="0" w:noVBand="1" w:val="04A0"/>
+      </w:tblPr>
+      <w:tblGrid>
+        <w:gridCol w:w="2160"/>
+        <w:gridCol w:w="2160"/>
+        <w:gridCol w:w="2160"/>
+        <w:gridCol w:w="2160"/>
+      </w:tblGrid>
+      <w:tr>
+        <w:tc>
+          <w:tcPr>
+            <w:tcW w:type="dxa" w:w="2160"/>
+            <w:shd w:fill="0B2545"/>
+          </w:tcPr>
+          <w:p>
+            <w:r/>
+            <w:r>
+              <w:rPr>
+                <w:b/>
+                <w:color w:val="FFFFFF"/>
+                <w:sz w:val="19"/>
+              </w:rPr>
+              <w:t>Company (year)</w:t>
+            </w:r>
+          </w:p>
+        </w:tc>
+        <w:tc>
+          <w:tcPr>
+            <w:tcW w:type="dxa" w:w="2016"/>
+            <w:shd w:fill="0B2545"/>
+          </w:tcPr>
+          <w:p>
+            <w:r/>
+            <w:r>
+              <w:rPr>
+                <w:b/>
+                <w:color w:val="FFFFFF"/>
+                <w:sz w:val="19"/>
+              </w:rPr>
+              <w:t>Sector</w:t>
+            </w:r>
+          </w:p>
+        </w:tc>
+        <w:tc>
+          <w:tcPr>
+            <w:tcW w:type="dxa" w:w="3456"/>
+            <w:shd w:fill="0B2545"/>
+          </w:tcPr>
+          <w:p>
+            <w:r/>
+            <w:r>
+              <w:rPr>
+                <w:b/>
+                <w:color w:val="FFFFFF"/>
+                <w:sz w:val="19"/>
+              </w:rPr>
+              <w:t>Thesis / demand</w:t>
+            </w:r>
+          </w:p>
+        </w:tc>
+        <w:tc>
+          <w:tcPr>
+            <w:tcW w:type="dxa" w:w="2160"/>
+            <w:shd w:fill="0B2545"/>
+          </w:tcPr>
+          <w:p>
+            <w:r/>
+            <w:r>
+              <w:rPr>
+                <w:b/>
+                <w:color w:val="FFFFFF"/>
+                <w:sz w:val="19"/>
+              </w:rPr>
+              <w:t>Outcome to date</w:t>
+            </w:r>
+          </w:p>
+        </w:tc>
+      </w:tr>
+      <w:tr>
+        <w:tc>
+          <w:tcPr>
+            <w:tcW w:type="dxa" w:w="2160"/>
+          </w:tcPr>
+          <w:p>
+            <w:r/>
+            <w:r>
+              <w:rPr>
+                <w:sz w:val="19"/>
+              </w:rPr>
+              <w:t>Barnes Group (2022)</w:t>
+            </w:r>
+          </w:p>
+        </w:tc>
+        <w:tc>
+          <w:tcPr>
+            <w:tcW w:type="dxa" w:w="2016"/>
+          </w:tcPr>
+          <w:p>
+            <w:r/>
+            <w:r>
+              <w:rPr>
+                <w:sz w:val="19"/>
+              </w:rPr>
+              <w:t>Aerospace &amp; industrial</w:t>
+            </w:r>
+          </w:p>
+        </w:tc>
+        <w:tc>
+          <w:tcPr>
+            <w:tcW w:type="dxa" w:w="3456"/>
+          </w:tcPr>
+          <w:p>
+            <w:r/>
+            <w:r>
+              <w:rPr>
+                <w:sz w:val="19"/>
+              </w:rPr>
+              <w:t>SOTP discount; aerospace unit alone worth more than the whole company; push for sale or separation (~$60/share, ~2x).</w:t>
+            </w:r>
+          </w:p>
+        </w:tc>
+        <w:tc>
+          <w:tcPr>
+            <w:tcW w:type="dxa" w:w="2160"/>
+          </w:tcPr>
+          <w:p>
+            <w:r/>
+            <w:r>
+              <w:rPr>
+                <w:sz w:val="19"/>
+              </w:rPr>
+              <w:t>Won board representation (2024); company later sold to Apollo — thesis realised.</w:t>
+            </w:r>
+          </w:p>
+        </w:tc>
+      </w:tr>
+      <w:tr>
+        <w:tc>
+          <w:tcPr>
+            <w:tcW w:type="dxa" w:w="2160"/>
+            <w:shd w:fill="F2F4F8"/>
+          </w:tcPr>
+          <w:p>
+            <w:r/>
+            <w:r>
+              <w:rPr>
+                <w:sz w:val="19"/>
+              </w:rPr>
+              <w:t>News Corp (2022–24)</w:t>
+            </w:r>
+          </w:p>
+        </w:tc>
+        <w:tc>
+          <w:tcPr>
+            <w:tcW w:type="dxa" w:w="2016"/>
+            <w:shd w:fill="F2F4F8"/>
+          </w:tcPr>
+          <w:p>
+            <w:r/>
+            <w:r>
+              <w:rPr>
+                <w:sz w:val="19"/>
+              </w:rPr>
+              <w:t>Media &amp; online real estate</w:t>
+            </w:r>
+          </w:p>
+        </w:tc>
+        <w:tc>
+          <w:tcPr>
+            <w:tcW w:type="dxa" w:w="3456"/>
+            <w:shd w:fill="F2F4F8"/>
+          </w:tcPr>
+          <w:p>
+            <w:r/>
+            <w:r>
+              <w:rPr>
+                <w:sz w:val="19"/>
+              </w:rPr>
+              <w:t>Separate the online real estate assets (REA/Move) from media; opposed the proposed Fox recombination; later backed collapsing the dual-class structure.</w:t>
+            </w:r>
+          </w:p>
+        </w:tc>
+        <w:tc>
+          <w:tcPr>
+            <w:tcW w:type="dxa" w:w="2160"/>
+            <w:shd w:fill="F2F4F8"/>
+          </w:tcPr>
+          <w:p>
+            <w:r/>
+            <w:r>
+              <w:rPr>
+                <w:sz w:val="19"/>
+              </w:rPr>
+              <w:t>Forced a special-committee review; Fox merger abandoned; dual-class fight ongoing.</w:t>
+            </w:r>
+          </w:p>
+        </w:tc>
+      </w:tr>
+      <w:tr>
+        <w:tc>
+          <w:tcPr>
+            <w:tcW w:type="dxa" w:w="2160"/>
+          </w:tcPr>
+          <w:p>
+            <w:r/>
+            <w:r>
+              <w:rPr>
+                <w:sz w:val="19"/>
+              </w:rPr>
+              <w:t>Forward Air (2023–24)</w:t>
+            </w:r>
+          </w:p>
+        </w:tc>
+        <w:tc>
+          <w:tcPr>
+            <w:tcW w:type="dxa" w:w="2016"/>
+          </w:tcPr>
+          <w:p>
+            <w:r/>
+            <w:r>
+              <w:rPr>
+                <w:sz w:val="19"/>
+              </w:rPr>
+              <w:t>Freight / logistics</w:t>
+            </w:r>
+          </w:p>
+        </w:tc>
+        <w:tc>
+          <w:tcPr>
+            <w:tcW w:type="dxa" w:w="3456"/>
+          </w:tcPr>
+          <w:p>
+            <w:r/>
+            <w:r>
+              <w:rPr>
+                <w:sz w:val="19"/>
+              </w:rPr>
+              <w:t>Opposed the dilutive Omni Logistics deal; pushed for a sale process and board change.</w:t>
+            </w:r>
+          </w:p>
+        </w:tc>
+        <w:tc>
+          <w:tcPr>
+            <w:tcW w:type="dxa" w:w="2160"/>
+          </w:tcPr>
+          <w:p>
+            <w:r/>
+            <w:r>
+              <w:rPr>
+                <w:sz w:val="19"/>
+              </w:rPr>
+              <w:t>Strategic review and board changes followed.</w:t>
+            </w:r>
+          </w:p>
+        </w:tc>
+      </w:tr>
+      <w:tr>
+        <w:tc>
+          <w:tcPr>
+            <w:tcW w:type="dxa" w:w="2160"/>
+            <w:shd w:fill="F2F4F8"/>
+          </w:tcPr>
+          <w:p>
+            <w:r/>
+            <w:r>
+              <w:rPr>
+                <w:sz w:val="19"/>
+              </w:rPr>
+              <w:t>FD Technologies (2023)</w:t>
+            </w:r>
+          </w:p>
+        </w:tc>
+        <w:tc>
+          <w:tcPr>
+            <w:tcW w:type="dxa" w:w="2016"/>
+            <w:shd w:fill="F2F4F8"/>
+          </w:tcPr>
+          <w:p>
+            <w:r/>
+            <w:r>
+              <w:rPr>
+                <w:sz w:val="19"/>
+              </w:rPr>
+              <w:t>Software &amp; data (UK/IE)</w:t>
+            </w:r>
+          </w:p>
+        </w:tc>
+        <w:tc>
+          <w:tcPr>
+            <w:tcW w:type="dxa" w:w="3456"/>
+            <w:shd w:fill="F2F4F8"/>
+          </w:tcPr>
+          <w:p>
+            <w:r/>
+            <w:r>
+              <w:rPr>
+                <w:sz w:val="19"/>
+              </w:rPr>
+              <w:t>Separate KX (analytics) from First Derivatives services; unlock the sum-of-the-parts.</w:t>
+            </w:r>
+          </w:p>
+        </w:tc>
+        <w:tc>
+          <w:tcPr>
+            <w:tcW w:type="dxa" w:w="2160"/>
+            <w:shd w:fill="F2F4F8"/>
+          </w:tcPr>
+          <w:p>
+            <w:r/>
+            <w:r>
+              <w:rPr>
+                <w:sz w:val="19"/>
+              </w:rPr>
+              <w:t>Company pursued break-up / asset sales.</w:t>
+            </w:r>
+          </w:p>
+        </w:tc>
+      </w:tr>
+      <w:tr>
+        <w:tc>
+          <w:tcPr>
+            <w:tcW w:type="dxa" w:w="2160"/>
+          </w:tcPr>
+          <w:p>
+            <w:r/>
+            <w:r>
+              <w:rPr>
+                <w:sz w:val="19"/>
+              </w:rPr>
+              <w:t>Reservoir Media (2024–26)</w:t>
+            </w:r>
+          </w:p>
+        </w:tc>
+        <w:tc>
+          <w:tcPr>
+            <w:tcW w:type="dxa" w:w="2016"/>
+          </w:tcPr>
+          <w:p>
+            <w:r/>
+            <w:r>
+              <w:rPr>
+                <w:sz w:val="19"/>
+              </w:rPr>
+              <w:t>Music rights</w:t>
+            </w:r>
+          </w:p>
+        </w:tc>
+        <w:tc>
+          <w:tcPr>
+            <w:tcW w:type="dxa" w:w="3456"/>
+          </w:tcPr>
+          <w:p>
+            <w:r/>
+            <w:r>
+              <w:rPr>
+                <w:sz w:val="19"/>
+              </w:rPr>
+              <w:t>Full strategic review; special committee; later an unsolicited takeover approach from Irenic itself.</w:t>
+            </w:r>
+          </w:p>
+        </w:tc>
+        <w:tc>
+          <w:tcPr>
+            <w:tcW w:type="dxa" w:w="2160"/>
+          </w:tcPr>
+          <w:p>
+            <w:r/>
+            <w:r>
+              <w:rPr>
+                <w:sz w:val="19"/>
+              </w:rPr>
+              <w:t>Review initiated; situation ongoing.</w:t>
+            </w:r>
+          </w:p>
+        </w:tc>
+      </w:tr>
+      <w:tr>
+        <w:tc>
+          <w:tcPr>
+            <w:tcW w:type="dxa" w:w="2160"/>
+            <w:shd w:fill="F2F4F8"/>
+          </w:tcPr>
+          <w:p>
+            <w:r/>
+            <w:r>
+              <w:rPr>
+                <w:sz w:val="19"/>
+              </w:rPr>
+              <w:t>Atkore (2025)</w:t>
+            </w:r>
+          </w:p>
+        </w:tc>
+        <w:tc>
+          <w:tcPr>
+            <w:tcW w:type="dxa" w:w="2016"/>
+            <w:shd w:fill="F2F4F8"/>
+          </w:tcPr>
+          <w:p>
+            <w:r/>
+            <w:r>
+              <w:rPr>
+                <w:sz w:val="19"/>
+              </w:rPr>
+              <w:t>Electrical products</w:t>
+            </w:r>
+          </w:p>
+        </w:tc>
+        <w:tc>
+          <w:tcPr>
+            <w:tcW w:type="dxa" w:w="3456"/>
+            <w:shd w:fill="F2F4F8"/>
+          </w:tcPr>
+          <w:p>
+            <w:r/>
+            <w:r>
+              <w:rPr>
+                <w:sz w:val="19"/>
+              </w:rPr>
+              <w:t>~2.5% stake; pursue a sale process at a depressed multiple.</w:t>
+            </w:r>
+          </w:p>
+        </w:tc>
+        <w:tc>
+          <w:tcPr>
+            <w:tcW w:type="dxa" w:w="2160"/>
+            <w:shd w:fill="F2F4F8"/>
+          </w:tcPr>
+          <w:p>
+            <w:r/>
+            <w:r>
+              <w:rPr>
+                <w:sz w:val="19"/>
+              </w:rPr>
+              <w:t>Engagement ongoing.</w:t>
+            </w:r>
+          </w:p>
+        </w:tc>
+      </w:tr>
+      <w:tr>
+        <w:tc>
+          <w:tcPr>
+            <w:tcW w:type="dxa" w:w="2160"/>
+          </w:tcPr>
+          <w:p>
+            <w:r/>
+            <w:r>
+              <w:rPr>
+                <w:sz w:val="19"/>
+              </w:rPr>
+              <w:t>Workiva (2025)</w:t>
+            </w:r>
+          </w:p>
+        </w:tc>
+        <w:tc>
+          <w:tcPr>
+            <w:tcW w:type="dxa" w:w="2016"/>
+          </w:tcPr>
+          <w:p>
+            <w:r/>
+            <w:r>
+              <w:rPr>
+                <w:sz w:val="19"/>
+              </w:rPr>
+              <w:t>Vertical SaaS</w:t>
+            </w:r>
+          </w:p>
+        </w:tc>
+        <w:tc>
+          <w:tcPr>
+            <w:tcW w:type="dxa" w:w="3456"/>
+          </w:tcPr>
+          <w:p>
+            <w:r/>
+            <w:r>
+              <w:rPr>
+                <w:sz w:val="19"/>
+              </w:rPr>
+              <w:t>~2% stake; operational improvement, margin discipline, two board seats.</w:t>
+            </w:r>
+          </w:p>
+        </w:tc>
+        <w:tc>
+          <w:tcPr>
+            <w:tcW w:type="dxa" w:w="2160"/>
+          </w:tcPr>
+          <w:p>
+            <w:r/>
+            <w:r>
+              <w:rPr>
+                <w:sz w:val="19"/>
+              </w:rPr>
+              <w:t>Engagement ongoing.</w:t>
+            </w:r>
+          </w:p>
+        </w:tc>
+      </w:tr>
+      <w:tr>
+        <w:tc>
+          <w:tcPr>
+            <w:tcW w:type="dxa" w:w="2160"/>
+            <w:shd w:fill="F2F4F8"/>
+          </w:tcPr>
+          <w:p>
+            <w:r/>
+            <w:r>
+              <w:rPr>
+                <w:sz w:val="19"/>
+              </w:rPr>
+              <w:t>Integer Holdings (2026)</w:t>
+            </w:r>
+          </w:p>
+        </w:tc>
+        <w:tc>
+          <w:tcPr>
+            <w:tcW w:type="dxa" w:w="2016"/>
+            <w:shd w:fill="F2F4F8"/>
+          </w:tcPr>
+          <w:p>
+            <w:r/>
+            <w:r>
+              <w:rPr>
+                <w:sz w:val="19"/>
+              </w:rPr>
+              <w:t>Medtech (contract mfg.)</w:t>
+            </w:r>
+          </w:p>
+        </w:tc>
+        <w:tc>
+          <w:tcPr>
+            <w:tcW w:type="dxa" w:w="3456"/>
+            <w:shd w:fill="F2F4F8"/>
+          </w:tcPr>
+          <w:p>
+            <w:r/>
+            <w:r>
+              <w:rPr>
+                <w:sz w:val="19"/>
+              </w:rPr>
+              <w:t>&gt;3% stake; board refresh and explore a sale.</w:t>
+            </w:r>
+          </w:p>
+        </w:tc>
+        <w:tc>
+          <w:tcPr>
+            <w:tcW w:type="dxa" w:w="2160"/>
+            <w:shd w:fill="F2F4F8"/>
+          </w:tcPr>
+          <w:p>
+            <w:r/>
+            <w:r>
+              <w:rPr>
+                <w:sz w:val="19"/>
+              </w:rPr>
+              <w:t>Two directors added (Mar 2026); board launched a strategic review (Apr 2026).</w:t>
+            </w:r>
+          </w:p>
+        </w:tc>
+      </w:tr>
+      <w:tr>
+        <w:tc>
+          <w:tcPr>
+            <w:tcW w:type="dxa" w:w="2160"/>
+          </w:tcPr>
+          <w:p>
+            <w:r/>
+            <w:r>
+              <w:rPr>
+                <w:sz w:val="19"/>
+              </w:rPr>
+              <w:t>Snap (2026)</w:t>
+            </w:r>
+          </w:p>
+        </w:tc>
+        <w:tc>
+          <w:tcPr>
+            <w:tcW w:type="dxa" w:w="2016"/>
+          </w:tcPr>
+          <w:p>
+            <w:r/>
+            <w:r>
+              <w:rPr>
+                <w:sz w:val="19"/>
+              </w:rPr>
+              <w:t>Social media / tech</w:t>
+            </w:r>
+          </w:p>
+        </w:tc>
+        <w:tc>
+          <w:tcPr>
+            <w:tcW w:type="dxa" w:w="3456"/>
+          </w:tcPr>
+          <w:p>
+            <w:r/>
+            <w:r>
+              <w:rPr>
+                <w:sz w:val="19"/>
+              </w:rPr>
+              <w:t>Cost rationalisation and a more disciplined AI-spend narrative.</w:t>
+            </w:r>
+          </w:p>
+        </w:tc>
+        <w:tc>
+          <w:tcPr>
+            <w:tcW w:type="dxa" w:w="2160"/>
+          </w:tcPr>
+          <w:p>
+            <w:r/>
+            <w:r>
+              <w:rPr>
+                <w:sz w:val="19"/>
+              </w:rPr>
+              <w:t>Stake disclosed; engagement early.</w:t>
+            </w:r>
+          </w:p>
+        </w:tc>
+      </w:tr>
+      <w:tr>
+        <w:tc>
+          <w:tcPr>
+            <w:tcW w:type="dxa" w:w="2160"/>
+            <w:shd w:fill="F2F4F8"/>
+          </w:tcPr>
+          <w:p>
+            <w:r/>
+            <w:r>
+              <w:rPr>
+                <w:sz w:val="19"/>
+              </w:rPr>
+              <w:t>HPE (2026)</w:t>
+            </w:r>
+          </w:p>
+        </w:tc>
+        <w:tc>
+          <w:tcPr>
+            <w:tcW w:type="dxa" w:w="2016"/>
+            <w:shd w:fill="F2F4F8"/>
+          </w:tcPr>
+          <w:p>
+            <w:r/>
+            <w:r>
+              <w:rPr>
+                <w:sz w:val="19"/>
+              </w:rPr>
+              <w:t>Enterprise tech</w:t>
+            </w:r>
+          </w:p>
+        </w:tc>
+        <w:tc>
+          <w:tcPr>
+            <w:tcW w:type="dxa" w:w="3456"/>
+            <w:shd w:fill="F2F4F8"/>
+          </w:tcPr>
+          <w:p>
+            <w:r/>
+            <w:r>
+              <w:rPr>
+                <w:sz w:val="19"/>
+              </w:rPr>
+              <w:t>Joined Elliott in pressing for value-creating change.</w:t>
+            </w:r>
+          </w:p>
+        </w:tc>
+        <w:tc>
+          <w:tcPr>
+            <w:tcW w:type="dxa" w:w="2160"/>
+            <w:shd w:fill="F2F4F8"/>
+          </w:tcPr>
+          <w:p>
+            <w:r/>
+            <w:r>
+              <w:rPr>
+                <w:sz w:val="19"/>
+              </w:rPr>
+              <w:t>Multi-activist situation; ongoing.</w:t>
+            </w:r>
+          </w:p>
+        </w:tc>
+      </w:tr>
+    </w:tbl>
+    <w:p/>
+    <w:p>
+      <w:pPr>
+        <w:pStyle w:val="Heading3"/>
+      </w:pPr>
+      <w:r>
+        <w:t>A.5.2 Ananym Capital Management</w:t>
+      </w:r>
+    </w:p>
+    <w:p>
+      <w:pPr>
+        <w:pStyle w:val="ListBullet"/>
+        <w:spacing w:after="80"/>
+      </w:pPr>
+      <w:r>
+        <w:rPr>
+          <w:b/>
+        </w:rPr>
+        <w:t xml:space="preserve">Founded: </w:t>
+      </w:r>
+      <w:r>
+        <w:t>launched 3 September 2024 by Charlie Penner (former JANA Partners partner; as head of activism at Engine No. 1 he led the landmark 2021 campaign that won three Exxon Mobil board seats) and Alex Silver (former partner and investment-committee member at P2 Capital Partners).</w:t>
+      </w:r>
+    </w:p>
+    <w:p>
+      <w:pPr>
+        <w:pStyle w:val="ListBullet"/>
+        <w:spacing w:after="80"/>
+      </w:pPr>
+      <w:r>
+        <w:rPr>
+          <w:b/>
+        </w:rPr>
+        <w:t xml:space="preserve">Scale: </w:t>
+      </w:r>
+      <w:r>
+        <w:t>~USD 260m across ~10 concentrated positions (per 13F). Deliberately small and high-conviction.</w:t>
+      </w:r>
+    </w:p>
+    <w:p>
+      <w:pPr>
+        <w:pStyle w:val="ListBullet"/>
+        <w:spacing w:after="80"/>
+      </w:pPr>
+      <w:r>
+        <w:rPr>
+          <w:b/>
+        </w:rPr>
+        <w:t xml:space="preserve">Strategy: </w:t>
+      </w:r>
+      <w:r>
+        <w:t>“high-quality but undervalued companies, regardless of industry,” almost always carrying a separation or operational-fix thesis. Prefers to work constructively but has shown it will run a full proxy fight — Penner's Exxon pedigree makes that threat unusually credible.</w:t>
+      </w:r>
+    </w:p>
+    <w:p>
+      <w:r>
+        <w:rPr>
+          <w:b/>
+          <w:i w:val="0"/>
+        </w:rPr>
+        <w:t>Selected campaigns and theses:</w:t>
+      </w:r>
+    </w:p>
+    <w:tbl>
+      <w:tblPr>
+        <w:tblStyle w:val="TableGrid"/>
+        <w:tblW w:type="auto" w:w="0"/>
+        <w:jc w:val="center"/>
+        <w:tblLook w:firstColumn="1" w:firstRow="1" w:lastColumn="0" w:lastRow="0" w:noHBand="0" w:noVBand="1" w:val="04A0"/>
+      </w:tblPr>
+      <w:tblGrid>
+        <w:gridCol w:w="2160"/>
+        <w:gridCol w:w="2160"/>
+        <w:gridCol w:w="2160"/>
+        <w:gridCol w:w="2160"/>
+      </w:tblGrid>
+      <w:tr>
+        <w:tc>
+          <w:tcPr>
+            <w:tcW w:type="dxa" w:w="2160"/>
+            <w:shd w:fill="0B2545"/>
+          </w:tcPr>
+          <w:p>
+            <w:r/>
+            <w:r>
+              <w:rPr>
+                <w:b/>
+                <w:color w:val="FFFFFF"/>
+                <w:sz w:val="19"/>
+              </w:rPr>
+              <w:t>Company (year)</w:t>
+            </w:r>
+          </w:p>
+        </w:tc>
+        <w:tc>
+          <w:tcPr>
+            <w:tcW w:type="dxa" w:w="2160"/>
+            <w:shd w:fill="0B2545"/>
+          </w:tcPr>
+          <w:p>
+            <w:r/>
+            <w:r>
+              <w:rPr>
+                <w:b/>
+                <w:color w:val="FFFFFF"/>
+                <w:sz w:val="19"/>
+              </w:rPr>
+              <w:t>Sector</w:t>
+            </w:r>
+          </w:p>
+        </w:tc>
+        <w:tc>
+          <w:tcPr>
+            <w:tcW w:type="dxa" w:w="3600"/>
+            <w:shd w:fill="0B2545"/>
+          </w:tcPr>
+          <w:p>
+            <w:r/>
+            <w:r>
+              <w:rPr>
+                <w:b/>
+                <w:color w:val="FFFFFF"/>
+                <w:sz w:val="19"/>
+              </w:rPr>
+              <w:t>Thesis / demand</w:t>
+            </w:r>
+          </w:p>
+        </w:tc>
+        <w:tc>
+          <w:tcPr>
+            <w:tcW w:type="dxa" w:w="1872"/>
+            <w:shd w:fill="0B2545"/>
+          </w:tcPr>
+          <w:p>
+            <w:r/>
+            <w:r>
+              <w:rPr>
+                <w:b/>
+                <w:color w:val="FFFFFF"/>
+                <w:sz w:val="19"/>
+              </w:rPr>
+              <w:t>Outcome to date</w:t>
+            </w:r>
+          </w:p>
+        </w:tc>
+      </w:tr>
+      <w:tr>
+        <w:tc>
+          <w:tcPr>
+            <w:tcW w:type="dxa" w:w="2160"/>
+          </w:tcPr>
+          <w:p>
+            <w:r/>
+            <w:r>
+              <w:rPr>
+                <w:sz w:val="19"/>
+              </w:rPr>
+              <w:t>Henry Schein (2024–25)</w:t>
+            </w:r>
+          </w:p>
+        </w:tc>
+        <w:tc>
+          <w:tcPr>
+            <w:tcW w:type="dxa" w:w="2160"/>
+          </w:tcPr>
+          <w:p>
+            <w:r/>
+            <w:r>
+              <w:rPr>
+                <w:sz w:val="19"/>
+              </w:rPr>
+              <w:t>Healthcare distribution</w:t>
+            </w:r>
+          </w:p>
+        </w:tc>
+        <w:tc>
+          <w:tcPr>
+            <w:tcW w:type="dxa" w:w="3600"/>
+          </w:tcPr>
+          <w:p>
+            <w:r/>
+            <w:r>
+              <w:rPr>
+                <w:sz w:val="19"/>
+              </w:rPr>
+              <w:t>Cost cuts, CEO succession (Bergman had led since 1989), capital-allocation discipline and board refresh; prepared a slate of up to six directors.</w:t>
+            </w:r>
+          </w:p>
+        </w:tc>
+        <w:tc>
+          <w:tcPr>
+            <w:tcW w:type="dxa" w:w="1872"/>
+          </w:tcPr>
+          <w:p>
+            <w:r/>
+            <w:r>
+              <w:rPr>
+                <w:sz w:val="19"/>
+              </w:rPr>
+              <w:t>Proxy threat catalysed the KKR “white knight” investment and board changes; Bergman succession executed (see A.3) — thesis largely realised.</w:t>
+            </w:r>
+          </w:p>
+        </w:tc>
+      </w:tr>
+      <w:tr>
+        <w:tc>
+          <w:tcPr>
+            <w:tcW w:type="dxa" w:w="2160"/>
+            <w:shd w:fill="F2F4F8"/>
+          </w:tcPr>
+          <w:p>
+            <w:r/>
+            <w:r>
+              <w:rPr>
+                <w:sz w:val="19"/>
+              </w:rPr>
+              <w:t>Baker Hughes (2025)</w:t>
+            </w:r>
+          </w:p>
+        </w:tc>
+        <w:tc>
+          <w:tcPr>
+            <w:tcW w:type="dxa" w:w="2160"/>
+            <w:shd w:fill="F2F4F8"/>
+          </w:tcPr>
+          <w:p>
+            <w:r/>
+            <w:r>
+              <w:rPr>
+                <w:sz w:val="19"/>
+              </w:rPr>
+              <w:t>Oilfield services &amp; energy tech</w:t>
+            </w:r>
+          </w:p>
+        </w:tc>
+        <w:tc>
+          <w:tcPr>
+            <w:tcW w:type="dxa" w:w="3600"/>
+            <w:shd w:fill="F2F4F8"/>
+          </w:tcPr>
+          <w:p>
+            <w:r/>
+            <w:r>
+              <w:rPr>
+                <w:sz w:val="19"/>
+              </w:rPr>
+              <w:t>Spin off the oilfield services &amp; equipment (OFSE) business from the higher-multiple industrial/energy-tech segment; argued ≥60% upside.</w:t>
+            </w:r>
+          </w:p>
+        </w:tc>
+        <w:tc>
+          <w:tcPr>
+            <w:tcW w:type="dxa" w:w="1872"/>
+            <w:shd w:fill="F2F4F8"/>
+          </w:tcPr>
+          <w:p>
+            <w:r/>
+            <w:r>
+              <w:rPr>
+                <w:sz w:val="19"/>
+              </w:rPr>
+              <w:t>Engagement public; situation ongoing.</w:t>
+            </w:r>
+          </w:p>
+        </w:tc>
+      </w:tr>
+      <w:tr>
+        <w:tc>
+          <w:tcPr>
+            <w:tcW w:type="dxa" w:w="2160"/>
+          </w:tcPr>
+          <w:p>
+            <w:r/>
+            <w:r>
+              <w:rPr>
+                <w:sz w:val="19"/>
+              </w:rPr>
+              <w:t>Siemens Energy (2025)</w:t>
+            </w:r>
+          </w:p>
+        </w:tc>
+        <w:tc>
+          <w:tcPr>
+            <w:tcW w:type="dxa" w:w="2160"/>
+          </w:tcPr>
+          <w:p>
+            <w:r/>
+            <w:r>
+              <w:rPr>
+                <w:sz w:val="19"/>
+              </w:rPr>
+              <w:t>Energy equipment (DE)</w:t>
+            </w:r>
+          </w:p>
+        </w:tc>
+        <w:tc>
+          <w:tcPr>
+            <w:tcW w:type="dxa" w:w="3600"/>
+          </w:tcPr>
+          <w:p>
+            <w:r/>
+            <w:r>
+              <w:rPr>
+                <w:sz w:val="19"/>
+              </w:rPr>
+              <w:t>Separate the loss-making wind business (Siemens Gamesa) from the strong grid/services franchise to stop the drag and re-rate the core.</w:t>
+            </w:r>
+          </w:p>
+        </w:tc>
+        <w:tc>
+          <w:tcPr>
+            <w:tcW w:type="dxa" w:w="1872"/>
+          </w:tcPr>
+          <w:p>
+            <w:r/>
+            <w:r>
+              <w:rPr>
+                <w:sz w:val="19"/>
+              </w:rPr>
+              <w:t>Engagement ongoing.</w:t>
+            </w:r>
+          </w:p>
+        </w:tc>
+      </w:tr>
+      <w:tr>
+        <w:tc>
+          <w:tcPr>
+            <w:tcW w:type="dxa" w:w="2160"/>
+            <w:shd w:fill="F2F4F8"/>
+          </w:tcPr>
+          <w:p>
+            <w:r/>
+            <w:r>
+              <w:rPr>
+                <w:sz w:val="19"/>
+              </w:rPr>
+              <w:t>LKQ (2024–25)</w:t>
+            </w:r>
+          </w:p>
+        </w:tc>
+        <w:tc>
+          <w:tcPr>
+            <w:tcW w:type="dxa" w:w="2160"/>
+            <w:shd w:fill="F2F4F8"/>
+          </w:tcPr>
+          <w:p>
+            <w:r/>
+            <w:r>
+              <w:rPr>
+                <w:sz w:val="19"/>
+              </w:rPr>
+              <w:t>Auto parts distribution</w:t>
+            </w:r>
+          </w:p>
+        </w:tc>
+        <w:tc>
+          <w:tcPr>
+            <w:tcW w:type="dxa" w:w="3600"/>
+            <w:shd w:fill="F2F4F8"/>
+          </w:tcPr>
+          <w:p>
+            <w:r/>
+            <w:r>
+              <w:rPr>
+                <w:sz w:val="19"/>
+              </w:rPr>
+              <w:t>Divest the European operations to focus on the higher-return North American business; simplify and re-rate.</w:t>
+            </w:r>
+          </w:p>
+        </w:tc>
+        <w:tc>
+          <w:tcPr>
+            <w:tcW w:type="dxa" w:w="1872"/>
+            <w:shd w:fill="F2F4F8"/>
+          </w:tcPr>
+          <w:p>
+            <w:r/>
+            <w:r>
+              <w:rPr>
+                <w:sz w:val="19"/>
+              </w:rPr>
+              <w:t>Renewed public push; engagement ongoing.</w:t>
+            </w:r>
+          </w:p>
+        </w:tc>
+      </w:tr>
+    </w:tbl>
+    <w:p/>
+    <w:p>
+      <w:r>
+        <w:rPr>
+          <w:b/>
+          <w:i w:val="0"/>
+        </w:rPr>
+        <w:t>Read-across for this strategy.</w:t>
+      </w:r>
+    </w:p>
+    <w:p>
+      <w:pPr>
+        <w:pStyle w:val="ListBullet"/>
+        <w:spacing w:after="80"/>
+      </w:pPr>
+      <w:r>
+        <w:t>Both firms validate the core engine of this proposal: a concentrated book of mid-cap, separation-and-sale theses, pursued constructively and resolved through board settlements, generates strong returns (Irenic's mid-to-high-teens net) and rapid AUM growth ($335m → $2.5bn in ~4 years).</w:t>
+      </w:r>
+    </w:p>
+    <w:p>
+      <w:pPr>
+        <w:pStyle w:val="ListBullet"/>
+        <w:spacing w:after="80"/>
+      </w:pPr>
+      <w:r>
+        <w:t>Both are sector-agnostic but converge on conglomerate / SOTP situations — confirming the weighting of Section 4.3 and the M&amp;A-heavy campaign mix of the current cycle.</w:t>
+      </w:r>
+    </w:p>
+    <w:p>
+      <w:pPr>
+        <w:pStyle w:val="ListBullet"/>
+        <w:spacing w:after="80"/>
+      </w:pPr>
+      <w:r>
+        <w:t>Both are run by alumni of the exact franchises whose playbook this fund imports (Elliott, JANA, Engine No. 1) — the same talent pool from which the US Campaign Principal (Knut Nyman) and the wider team would be drawn.</w:t>
+      </w:r>
+    </w:p>
+    <w:p>
+      <w:pPr>
+        <w:pStyle w:val="ListBullet"/>
+        <w:spacing w:after="80"/>
+      </w:pPr>
+      <w:r>
+        <w:t>The key differentiator for Nordic Capital: Irenic and Ananym have the campaign craft but no operating platform, no European nomination-committee home field, and no buyout balance sheet to convert a public stake into a take-private. Nordic Capital Engaged Equities would combine their playbook with all three.</w:t>
       </w:r>
     </w:p>
     <w:p>

</xml_diff>